<commit_message>
refactor bootstrap to summary-only + add resumable per-rep runner
</commit_message>
<xml_diff>
--- a/results/tables/sum_stats.docx
+++ b/results/tables/sum_stats.docx
@@ -18,7 +18,6 @@
           <w:trHeight w:val="574" w:hRule="auto"/>
           <w:tblHeader/>
         </w:trPr>
-        header 1
         <w:tc>
           <w:tcPr>
             <w:tcBorders>
@@ -38,31 +37,34 @@
           </w:tcPr>
           <w:p>
             <w:pPr>
-              <w:jc w:val="left"/>
-              <w:pBdr>
-                <w:bottom w:val="none" w:sz="0" w:space="0" w:color="000000"/>
-                <w:top w:val="none" w:sz="0" w:space="0" w:color="000000"/>
-                <w:left w:val="none" w:sz="0" w:space="0" w:color="000000"/>
-                <w:right w:val="none" w:sz="0" w:space="0" w:color="000000"/>
-              </w:pBdr>
-              <w:spacing w:after="100" w:before="100" w:line="240"/>
-              <w:ind w:left="100" w:right="100" w:firstLine="0" w:firstLineChars="0"/>
-              <w:rPr>
-                <w:rFonts w:ascii="Arial" w:hAnsi="Arial" w:eastAsia="Arial" w:cs="Arial"/>
-                <w:i w:val="false"/>
-                <w:b w:val="false"/>
-                <w:u w:val="none"/>
-                <w:sz w:val="22"/>
-                <w:szCs w:val="22"/>
-                <w:color w:val="000000"/>
-              </w:rPr>
-            </w:pPr>
-            <w:r>
-              <w:rPr>
-                <w:rFonts w:ascii="Arial" w:hAnsi="Arial" w:eastAsia="Arial" w:cs="Arial"/>
-                <w:i w:val="false"/>
-                <w:b w:val="false"/>
-                <w:u w:val="none"/>
+              <w:pStyle w:val="Normal"/>
+              <w:jc w:val="left"/>
+              <w:pBdr>
+                <w:bottom w:val="none" w:sz="0" w:space="0" w:color="000000"/>
+                <w:top w:val="none" w:sz="0" w:space="0" w:color="000000"/>
+                <w:left w:val="none" w:sz="0" w:space="0" w:color="000000"/>
+                <w:right w:val="none" w:sz="0" w:space="0" w:color="000000"/>
+              </w:pBdr>
+              <w:spacing w:after="100" w:before="100" w:line="240"/>
+              <w:ind w:left="100" w:right="100" w:firstLine="0" w:firstLineChars="0"/>
+              <w:rPr>
+                <w:rFonts w:ascii="Arial" w:hAnsi="Arial" w:eastAsia="Arial" w:cs="Arial"/>
+                <w:i w:val="false"/>
+                <w:b w:val="false"/>
+                <w:u w:val="none"/>
+                <w:strike w:val="false"/>
+                <w:sz w:val="22"/>
+                <w:szCs w:val="22"/>
+                <w:color w:val="000000"/>
+              </w:rPr>
+            </w:pPr>
+            <w:r>
+              <w:rPr>
+                <w:rFonts w:ascii="Arial" w:hAnsi="Arial" w:eastAsia="Arial" w:cs="Arial"/>
+                <w:i w:val="false"/>
+                <w:b w:val="false"/>
+                <w:u w:val="none"/>
+                <w:strike w:val="false"/>
                 <w:sz w:val="22"/>
                 <w:szCs w:val="22"/>
                 <w:color w:val="000000"/>
@@ -90,31 +92,34 @@
           </w:tcPr>
           <w:p>
             <w:pPr>
-              <w:jc w:val="left"/>
-              <w:pBdr>
-                <w:bottom w:val="none" w:sz="0" w:space="0" w:color="000000"/>
-                <w:top w:val="none" w:sz="0" w:space="0" w:color="000000"/>
-                <w:left w:val="none" w:sz="0" w:space="0" w:color="000000"/>
-                <w:right w:val="none" w:sz="0" w:space="0" w:color="000000"/>
-              </w:pBdr>
-              <w:spacing w:after="100" w:before="100" w:line="240"/>
-              <w:ind w:left="100" w:right="100" w:firstLine="0" w:firstLineChars="0"/>
-              <w:rPr>
-                <w:rFonts w:ascii="Arial" w:hAnsi="Arial" w:eastAsia="Arial" w:cs="Arial"/>
-                <w:i w:val="false"/>
-                <w:b w:val="false"/>
-                <w:u w:val="none"/>
-                <w:sz w:val="22"/>
-                <w:szCs w:val="22"/>
-                <w:color w:val="000000"/>
-              </w:rPr>
-            </w:pPr>
-            <w:r>
-              <w:rPr>
-                <w:rFonts w:ascii="Arial" w:hAnsi="Arial" w:eastAsia="Arial" w:cs="Arial"/>
-                <w:i w:val="false"/>
-                <w:b w:val="false"/>
-                <w:u w:val="none"/>
+              <w:pStyle w:val="Normal"/>
+              <w:jc w:val="left"/>
+              <w:pBdr>
+                <w:bottom w:val="none" w:sz="0" w:space="0" w:color="000000"/>
+                <w:top w:val="none" w:sz="0" w:space="0" w:color="000000"/>
+                <w:left w:val="none" w:sz="0" w:space="0" w:color="000000"/>
+                <w:right w:val="none" w:sz="0" w:space="0" w:color="000000"/>
+              </w:pBdr>
+              <w:spacing w:after="100" w:before="100" w:line="240"/>
+              <w:ind w:left="100" w:right="100" w:firstLine="0" w:firstLineChars="0"/>
+              <w:rPr>
+                <w:rFonts w:ascii="Arial" w:hAnsi="Arial" w:eastAsia="Arial" w:cs="Arial"/>
+                <w:i w:val="false"/>
+                <w:b w:val="false"/>
+                <w:u w:val="none"/>
+                <w:strike w:val="false"/>
+                <w:sz w:val="22"/>
+                <w:szCs w:val="22"/>
+                <w:color w:val="000000"/>
+              </w:rPr>
+            </w:pPr>
+            <w:r>
+              <w:rPr>
+                <w:rFonts w:ascii="Arial" w:hAnsi="Arial" w:eastAsia="Arial" w:cs="Arial"/>
+                <w:i w:val="false"/>
+                <w:b w:val="false"/>
+                <w:u w:val="none"/>
+                <w:strike w:val="false"/>
                 <w:sz w:val="22"/>
                 <w:szCs w:val="22"/>
                 <w:color w:val="000000"/>
@@ -142,31 +147,34 @@
           </w:tcPr>
           <w:p>
             <w:pPr>
-              <w:jc w:val="left"/>
-              <w:pBdr>
-                <w:bottom w:val="none" w:sz="0" w:space="0" w:color="000000"/>
-                <w:top w:val="none" w:sz="0" w:space="0" w:color="000000"/>
-                <w:left w:val="none" w:sz="0" w:space="0" w:color="000000"/>
-                <w:right w:val="none" w:sz="0" w:space="0" w:color="000000"/>
-              </w:pBdr>
-              <w:spacing w:after="100" w:before="100" w:line="240"/>
-              <w:ind w:left="100" w:right="100" w:firstLine="0" w:firstLineChars="0"/>
-              <w:rPr>
-                <w:rFonts w:ascii="Arial" w:hAnsi="Arial" w:eastAsia="Arial" w:cs="Arial"/>
-                <w:i w:val="false"/>
-                <w:b w:val="false"/>
-                <w:u w:val="none"/>
-                <w:sz w:val="22"/>
-                <w:szCs w:val="22"/>
-                <w:color w:val="000000"/>
-              </w:rPr>
-            </w:pPr>
-            <w:r>
-              <w:rPr>
-                <w:rFonts w:ascii="Arial" w:hAnsi="Arial" w:eastAsia="Arial" w:cs="Arial"/>
-                <w:i w:val="false"/>
-                <w:b w:val="false"/>
-                <w:u w:val="none"/>
+              <w:pStyle w:val="Normal"/>
+              <w:jc w:val="left"/>
+              <w:pBdr>
+                <w:bottom w:val="none" w:sz="0" w:space="0" w:color="000000"/>
+                <w:top w:val="none" w:sz="0" w:space="0" w:color="000000"/>
+                <w:left w:val="none" w:sz="0" w:space="0" w:color="000000"/>
+                <w:right w:val="none" w:sz="0" w:space="0" w:color="000000"/>
+              </w:pBdr>
+              <w:spacing w:after="100" w:before="100" w:line="240"/>
+              <w:ind w:left="100" w:right="100" w:firstLine="0" w:firstLineChars="0"/>
+              <w:rPr>
+                <w:rFonts w:ascii="Arial" w:hAnsi="Arial" w:eastAsia="Arial" w:cs="Arial"/>
+                <w:i w:val="false"/>
+                <w:b w:val="false"/>
+                <w:u w:val="none"/>
+                <w:strike w:val="false"/>
+                <w:sz w:val="22"/>
+                <w:szCs w:val="22"/>
+                <w:color w:val="000000"/>
+              </w:rPr>
+            </w:pPr>
+            <w:r>
+              <w:rPr>
+                <w:rFonts w:ascii="Arial" w:hAnsi="Arial" w:eastAsia="Arial" w:cs="Arial"/>
+                <w:i w:val="false"/>
+                <w:b w:val="false"/>
+                <w:u w:val="none"/>
+                <w:strike w:val="false"/>
                 <w:sz w:val="22"/>
                 <w:szCs w:val="22"/>
                 <w:color w:val="000000"/>
@@ -180,7 +188,6 @@
         <w:trPr>
           <w:trHeight w:val="574" w:hRule="auto"/>
         </w:trPr>
-        body 1
         <w:tc>
           <w:tcPr>
             <w:gridSpan w:val="3"/>
@@ -201,6 +208,7 @@
           </w:tcPr>
           <w:p>
             <w:pPr>
+              <w:pStyle w:val="Normal"/>
               <w:jc w:val="left"/>
               <w:pBdr>
                 <w:bottom w:val="none" w:sz="0" w:space="0" w:color="000000"/>
@@ -215,6 +223,7 @@
                 <w:i w:val="false"/>
                 <w:b w:val="true"/>
                 <w:u w:val="none"/>
+                <w:strike w:val="false"/>
                 <w:sz w:val="22"/>
                 <w:szCs w:val="22"/>
                 <w:color w:val="000000"/>
@@ -226,6 +235,7 @@
                 <w:i w:val="false"/>
                 <w:b w:val="true"/>
                 <w:u w:val="none"/>
+                <w:strike w:val="false"/>
                 <w:sz w:val="22"/>
                 <w:szCs w:val="22"/>
                 <w:color w:val="000000"/>
@@ -239,51 +249,53 @@
         <w:trPr>
           <w:trHeight w:val="600" w:hRule="auto"/>
         </w:trPr>
-        body 2
-        <w:tc>
-          <w:tcPr>
-            <w:tcBorders>
-              <w:bottom w:val="none" w:sz="0" w:space="0" w:color="000000"/>
-              <w:top w:val="none" w:sz="0" w:space="0" w:color="000000"/>
-              <w:left w:val="none" w:sz="0" w:space="0" w:color="000000"/>
-              <w:right w:val="none" w:sz="0" w:space="0" w:color="000000"/>
-            </w:tcBorders>
-            <w:shd w:val="clear" w:color="auto" w:fill="FFFFFF"/>
-            <w:tcMar>
-              <w:top w:w="0" w:type="dxa"/>
-              <w:bottom w:w="0" w:type="dxa"/>
-              <w:left w:w="0" w:type="dxa"/>
-              <w:right w:w="0" w:type="dxa"/>
-            </w:tcMar>
-            <w:vAlign w:val="center"/>
-          </w:tcPr>
-          <w:p>
-            <w:pPr>
-              <w:jc w:val="left"/>
-              <w:pBdr>
-                <w:bottom w:val="none" w:sz="0" w:space="0" w:color="000000"/>
-                <w:top w:val="none" w:sz="0" w:space="0" w:color="000000"/>
-                <w:left w:val="none" w:sz="0" w:space="0" w:color="000000"/>
-                <w:right w:val="none" w:sz="0" w:space="0" w:color="000000"/>
-              </w:pBdr>
-              <w:spacing w:after="100" w:before="100" w:line="240"/>
-              <w:ind w:left="100" w:right="100" w:firstLine="0" w:firstLineChars="0"/>
-              <w:rPr>
-                <w:rFonts w:ascii="Arial" w:hAnsi="Arial" w:eastAsia="Arial" w:cs="Arial"/>
-                <w:i w:val="false"/>
-                <w:b w:val="false"/>
-                <w:u w:val="none"/>
-                <w:sz w:val="22"/>
-                <w:szCs w:val="22"/>
-                <w:color w:val="000000"/>
-              </w:rPr>
-            </w:pPr>
-            <w:r>
-              <w:rPr>
-                <w:rFonts w:ascii="Arial" w:hAnsi="Arial" w:eastAsia="Arial" w:cs="Arial"/>
-                <w:i w:val="false"/>
-                <w:b w:val="false"/>
-                <w:u w:val="none"/>
+        <w:tc>
+          <w:tcPr>
+            <w:tcBorders>
+              <w:bottom w:val="none" w:sz="0" w:space="0" w:color="000000"/>
+              <w:top w:val="none" w:sz="0" w:space="0" w:color="000000"/>
+              <w:left w:val="none" w:sz="0" w:space="0" w:color="000000"/>
+              <w:right w:val="none" w:sz="0" w:space="0" w:color="000000"/>
+            </w:tcBorders>
+            <w:shd w:val="clear" w:color="auto" w:fill="FFFFFF"/>
+            <w:tcMar>
+              <w:top w:w="0" w:type="dxa"/>
+              <w:bottom w:w="0" w:type="dxa"/>
+              <w:left w:w="0" w:type="dxa"/>
+              <w:right w:w="0" w:type="dxa"/>
+            </w:tcMar>
+            <w:vAlign w:val="center"/>
+          </w:tcPr>
+          <w:p>
+            <w:pPr>
+              <w:pStyle w:val="Normal"/>
+              <w:jc w:val="left"/>
+              <w:pBdr>
+                <w:bottom w:val="none" w:sz="0" w:space="0" w:color="000000"/>
+                <w:top w:val="none" w:sz="0" w:space="0" w:color="000000"/>
+                <w:left w:val="none" w:sz="0" w:space="0" w:color="000000"/>
+                <w:right w:val="none" w:sz="0" w:space="0" w:color="000000"/>
+              </w:pBdr>
+              <w:spacing w:after="100" w:before="100" w:line="240"/>
+              <w:ind w:left="100" w:right="100" w:firstLine="0" w:firstLineChars="0"/>
+              <w:rPr>
+                <w:rFonts w:ascii="Arial" w:hAnsi="Arial" w:eastAsia="Arial" w:cs="Arial"/>
+                <w:i w:val="false"/>
+                <w:b w:val="false"/>
+                <w:u w:val="none"/>
+                <w:strike w:val="false"/>
+                <w:sz w:val="22"/>
+                <w:szCs w:val="22"/>
+                <w:color w:val="000000"/>
+              </w:rPr>
+            </w:pPr>
+            <w:r>
+              <w:rPr>
+                <w:rFonts w:ascii="Arial" w:hAnsi="Arial" w:eastAsia="Arial" w:cs="Arial"/>
+                <w:i w:val="false"/>
+                <w:b w:val="false"/>
+                <w:u w:val="none"/>
+                <w:strike w:val="false"/>
                 <w:sz w:val="22"/>
                 <w:szCs w:val="22"/>
                 <w:color w:val="000000"/>
@@ -311,31 +323,34 @@
           </w:tcPr>
           <w:p>
             <w:pPr>
-              <w:jc w:val="left"/>
-              <w:pBdr>
-                <w:bottom w:val="none" w:sz="0" w:space="0" w:color="000000"/>
-                <w:top w:val="none" w:sz="0" w:space="0" w:color="000000"/>
-                <w:left w:val="none" w:sz="0" w:space="0" w:color="000000"/>
-                <w:right w:val="none" w:sz="0" w:space="0" w:color="000000"/>
-              </w:pBdr>
-              <w:spacing w:after="100" w:before="100" w:line="240"/>
-              <w:ind w:left="100" w:right="100" w:firstLine="0" w:firstLineChars="0"/>
-              <w:rPr>
-                <w:rFonts w:ascii="Arial" w:hAnsi="Arial" w:eastAsia="Arial" w:cs="Arial"/>
-                <w:i w:val="false"/>
-                <w:b w:val="false"/>
-                <w:u w:val="none"/>
-                <w:sz w:val="22"/>
-                <w:szCs w:val="22"/>
-                <w:color w:val="000000"/>
-              </w:rPr>
-            </w:pPr>
-            <w:r>
-              <w:rPr>
-                <w:rFonts w:ascii="Arial" w:hAnsi="Arial" w:eastAsia="Arial" w:cs="Arial"/>
-                <w:i w:val="false"/>
-                <w:b w:val="false"/>
-                <w:u w:val="none"/>
+              <w:pStyle w:val="Normal"/>
+              <w:jc w:val="left"/>
+              <w:pBdr>
+                <w:bottom w:val="none" w:sz="0" w:space="0" w:color="000000"/>
+                <w:top w:val="none" w:sz="0" w:space="0" w:color="000000"/>
+                <w:left w:val="none" w:sz="0" w:space="0" w:color="000000"/>
+                <w:right w:val="none" w:sz="0" w:space="0" w:color="000000"/>
+              </w:pBdr>
+              <w:spacing w:after="100" w:before="100" w:line="240"/>
+              <w:ind w:left="100" w:right="100" w:firstLine="0" w:firstLineChars="0"/>
+              <w:rPr>
+                <w:rFonts w:ascii="Arial" w:hAnsi="Arial" w:eastAsia="Arial" w:cs="Arial"/>
+                <w:i w:val="false"/>
+                <w:b w:val="false"/>
+                <w:u w:val="none"/>
+                <w:strike w:val="false"/>
+                <w:sz w:val="22"/>
+                <w:szCs w:val="22"/>
+                <w:color w:val="000000"/>
+              </w:rPr>
+            </w:pPr>
+            <w:r>
+              <w:rPr>
+                <w:rFonts w:ascii="Arial" w:hAnsi="Arial" w:eastAsia="Arial" w:cs="Arial"/>
+                <w:i w:val="false"/>
+                <w:b w:val="false"/>
+                <w:u w:val="none"/>
+                <w:strike w:val="false"/>
                 <w:sz w:val="22"/>
                 <w:szCs w:val="22"/>
                 <w:color w:val="000000"/>
@@ -363,31 +378,34 @@
           </w:tcPr>
           <w:p>
             <w:pPr>
-              <w:jc w:val="left"/>
-              <w:pBdr>
-                <w:bottom w:val="none" w:sz="0" w:space="0" w:color="000000"/>
-                <w:top w:val="none" w:sz="0" w:space="0" w:color="000000"/>
-                <w:left w:val="none" w:sz="0" w:space="0" w:color="000000"/>
-                <w:right w:val="none" w:sz="0" w:space="0" w:color="000000"/>
-              </w:pBdr>
-              <w:spacing w:after="100" w:before="100" w:line="240"/>
-              <w:ind w:left="100" w:right="100" w:firstLine="0" w:firstLineChars="0"/>
-              <w:rPr>
-                <w:rFonts w:ascii="Arial" w:hAnsi="Arial" w:eastAsia="Arial" w:cs="Arial"/>
-                <w:i w:val="false"/>
-                <w:b w:val="false"/>
-                <w:u w:val="none"/>
-                <w:sz w:val="22"/>
-                <w:szCs w:val="22"/>
-                <w:color w:val="000000"/>
-              </w:rPr>
-            </w:pPr>
-            <w:r>
-              <w:rPr>
-                <w:rFonts w:ascii="Arial" w:hAnsi="Arial" w:eastAsia="Arial" w:cs="Arial"/>
-                <w:i w:val="false"/>
-                <w:b w:val="false"/>
-                <w:u w:val="none"/>
+              <w:pStyle w:val="Normal"/>
+              <w:jc w:val="left"/>
+              <w:pBdr>
+                <w:bottom w:val="none" w:sz="0" w:space="0" w:color="000000"/>
+                <w:top w:val="none" w:sz="0" w:space="0" w:color="000000"/>
+                <w:left w:val="none" w:sz="0" w:space="0" w:color="000000"/>
+                <w:right w:val="none" w:sz="0" w:space="0" w:color="000000"/>
+              </w:pBdr>
+              <w:spacing w:after="100" w:before="100" w:line="240"/>
+              <w:ind w:left="100" w:right="100" w:firstLine="0" w:firstLineChars="0"/>
+              <w:rPr>
+                <w:rFonts w:ascii="Arial" w:hAnsi="Arial" w:eastAsia="Arial" w:cs="Arial"/>
+                <w:i w:val="false"/>
+                <w:b w:val="false"/>
+                <w:u w:val="none"/>
+                <w:strike w:val="false"/>
+                <w:sz w:val="22"/>
+                <w:szCs w:val="22"/>
+                <w:color w:val="000000"/>
+              </w:rPr>
+            </w:pPr>
+            <w:r>
+              <w:rPr>
+                <w:rFonts w:ascii="Arial" w:hAnsi="Arial" w:eastAsia="Arial" w:cs="Arial"/>
+                <w:i w:val="false"/>
+                <w:b w:val="false"/>
+                <w:u w:val="none"/>
+                <w:strike w:val="false"/>
                 <w:sz w:val="22"/>
                 <w:szCs w:val="22"/>
                 <w:color w:val="000000"/>
@@ -401,51 +419,53 @@
         <w:trPr>
           <w:trHeight w:val="600" w:hRule="auto"/>
         </w:trPr>
-        body 3
-        <w:tc>
-          <w:tcPr>
-            <w:tcBorders>
-              <w:bottom w:val="none" w:sz="0" w:space="0" w:color="000000"/>
-              <w:top w:val="none" w:sz="0" w:space="0" w:color="000000"/>
-              <w:left w:val="none" w:sz="0" w:space="0" w:color="000000"/>
-              <w:right w:val="none" w:sz="0" w:space="0" w:color="000000"/>
-            </w:tcBorders>
-            <w:shd w:val="clear" w:color="auto" w:fill="FFFFFF"/>
-            <w:tcMar>
-              <w:top w:w="0" w:type="dxa"/>
-              <w:bottom w:w="0" w:type="dxa"/>
-              <w:left w:w="0" w:type="dxa"/>
-              <w:right w:w="0" w:type="dxa"/>
-            </w:tcMar>
-            <w:vAlign w:val="center"/>
-          </w:tcPr>
-          <w:p>
-            <w:pPr>
-              <w:jc w:val="left"/>
-              <w:pBdr>
-                <w:bottom w:val="none" w:sz="0" w:space="0" w:color="000000"/>
-                <w:top w:val="none" w:sz="0" w:space="0" w:color="000000"/>
-                <w:left w:val="none" w:sz="0" w:space="0" w:color="000000"/>
-                <w:right w:val="none" w:sz="0" w:space="0" w:color="000000"/>
-              </w:pBdr>
-              <w:spacing w:after="100" w:before="100" w:line="240"/>
-              <w:ind w:left="100" w:right="100" w:firstLine="0" w:firstLineChars="0"/>
-              <w:rPr>
-                <w:rFonts w:ascii="Arial" w:hAnsi="Arial" w:eastAsia="Arial" w:cs="Arial"/>
-                <w:i w:val="false"/>
-                <w:b w:val="false"/>
-                <w:u w:val="none"/>
-                <w:sz w:val="22"/>
-                <w:szCs w:val="22"/>
-                <w:color w:val="000000"/>
-              </w:rPr>
-            </w:pPr>
-            <w:r>
-              <w:rPr>
-                <w:rFonts w:ascii="Arial" w:hAnsi="Arial" w:eastAsia="Arial" w:cs="Arial"/>
-                <w:i w:val="false"/>
-                <w:b w:val="false"/>
-                <w:u w:val="none"/>
+        <w:tc>
+          <w:tcPr>
+            <w:tcBorders>
+              <w:bottom w:val="none" w:sz="0" w:space="0" w:color="000000"/>
+              <w:top w:val="none" w:sz="0" w:space="0" w:color="000000"/>
+              <w:left w:val="none" w:sz="0" w:space="0" w:color="000000"/>
+              <w:right w:val="none" w:sz="0" w:space="0" w:color="000000"/>
+            </w:tcBorders>
+            <w:shd w:val="clear" w:color="auto" w:fill="FFFFFF"/>
+            <w:tcMar>
+              <w:top w:w="0" w:type="dxa"/>
+              <w:bottom w:w="0" w:type="dxa"/>
+              <w:left w:w="0" w:type="dxa"/>
+              <w:right w:w="0" w:type="dxa"/>
+            </w:tcMar>
+            <w:vAlign w:val="center"/>
+          </w:tcPr>
+          <w:p>
+            <w:pPr>
+              <w:pStyle w:val="Normal"/>
+              <w:jc w:val="left"/>
+              <w:pBdr>
+                <w:bottom w:val="none" w:sz="0" w:space="0" w:color="000000"/>
+                <w:top w:val="none" w:sz="0" w:space="0" w:color="000000"/>
+                <w:left w:val="none" w:sz="0" w:space="0" w:color="000000"/>
+                <w:right w:val="none" w:sz="0" w:space="0" w:color="000000"/>
+              </w:pBdr>
+              <w:spacing w:after="100" w:before="100" w:line="240"/>
+              <w:ind w:left="100" w:right="100" w:firstLine="0" w:firstLineChars="0"/>
+              <w:rPr>
+                <w:rFonts w:ascii="Arial" w:hAnsi="Arial" w:eastAsia="Arial" w:cs="Arial"/>
+                <w:i w:val="false"/>
+                <w:b w:val="false"/>
+                <w:u w:val="none"/>
+                <w:strike w:val="false"/>
+                <w:sz w:val="22"/>
+                <w:szCs w:val="22"/>
+                <w:color w:val="000000"/>
+              </w:rPr>
+            </w:pPr>
+            <w:r>
+              <w:rPr>
+                <w:rFonts w:ascii="Arial" w:hAnsi="Arial" w:eastAsia="Arial" w:cs="Arial"/>
+                <w:i w:val="false"/>
+                <w:b w:val="false"/>
+                <w:u w:val="none"/>
+                <w:strike w:val="false"/>
                 <w:sz w:val="22"/>
                 <w:szCs w:val="22"/>
                 <w:color w:val="000000"/>
@@ -473,31 +493,34 @@
           </w:tcPr>
           <w:p>
             <w:pPr>
-              <w:jc w:val="left"/>
-              <w:pBdr>
-                <w:bottom w:val="none" w:sz="0" w:space="0" w:color="000000"/>
-                <w:top w:val="none" w:sz="0" w:space="0" w:color="000000"/>
-                <w:left w:val="none" w:sz="0" w:space="0" w:color="000000"/>
-                <w:right w:val="none" w:sz="0" w:space="0" w:color="000000"/>
-              </w:pBdr>
-              <w:spacing w:after="100" w:before="100" w:line="240"/>
-              <w:ind w:left="100" w:right="100" w:firstLine="0" w:firstLineChars="0"/>
-              <w:rPr>
-                <w:rFonts w:ascii="Arial" w:hAnsi="Arial" w:eastAsia="Arial" w:cs="Arial"/>
-                <w:i w:val="false"/>
-                <w:b w:val="false"/>
-                <w:u w:val="none"/>
-                <w:sz w:val="22"/>
-                <w:szCs w:val="22"/>
-                <w:color w:val="000000"/>
-              </w:rPr>
-            </w:pPr>
-            <w:r>
-              <w:rPr>
-                <w:rFonts w:ascii="Arial" w:hAnsi="Arial" w:eastAsia="Arial" w:cs="Arial"/>
-                <w:i w:val="false"/>
-                <w:b w:val="false"/>
-                <w:u w:val="none"/>
+              <w:pStyle w:val="Normal"/>
+              <w:jc w:val="left"/>
+              <w:pBdr>
+                <w:bottom w:val="none" w:sz="0" w:space="0" w:color="000000"/>
+                <w:top w:val="none" w:sz="0" w:space="0" w:color="000000"/>
+                <w:left w:val="none" w:sz="0" w:space="0" w:color="000000"/>
+                <w:right w:val="none" w:sz="0" w:space="0" w:color="000000"/>
+              </w:pBdr>
+              <w:spacing w:after="100" w:before="100" w:line="240"/>
+              <w:ind w:left="100" w:right="100" w:firstLine="0" w:firstLineChars="0"/>
+              <w:rPr>
+                <w:rFonts w:ascii="Arial" w:hAnsi="Arial" w:eastAsia="Arial" w:cs="Arial"/>
+                <w:i w:val="false"/>
+                <w:b w:val="false"/>
+                <w:u w:val="none"/>
+                <w:strike w:val="false"/>
+                <w:sz w:val="22"/>
+                <w:szCs w:val="22"/>
+                <w:color w:val="000000"/>
+              </w:rPr>
+            </w:pPr>
+            <w:r>
+              <w:rPr>
+                <w:rFonts w:ascii="Arial" w:hAnsi="Arial" w:eastAsia="Arial" w:cs="Arial"/>
+                <w:i w:val="false"/>
+                <w:b w:val="false"/>
+                <w:u w:val="none"/>
+                <w:strike w:val="false"/>
                 <w:sz w:val="22"/>
                 <w:szCs w:val="22"/>
                 <w:color w:val="000000"/>
@@ -525,31 +548,34 @@
           </w:tcPr>
           <w:p>
             <w:pPr>
-              <w:jc w:val="left"/>
-              <w:pBdr>
-                <w:bottom w:val="none" w:sz="0" w:space="0" w:color="000000"/>
-                <w:top w:val="none" w:sz="0" w:space="0" w:color="000000"/>
-                <w:left w:val="none" w:sz="0" w:space="0" w:color="000000"/>
-                <w:right w:val="none" w:sz="0" w:space="0" w:color="000000"/>
-              </w:pBdr>
-              <w:spacing w:after="100" w:before="100" w:line="240"/>
-              <w:ind w:left="100" w:right="100" w:firstLine="0" w:firstLineChars="0"/>
-              <w:rPr>
-                <w:rFonts w:ascii="Arial" w:hAnsi="Arial" w:eastAsia="Arial" w:cs="Arial"/>
-                <w:i w:val="false"/>
-                <w:b w:val="false"/>
-                <w:u w:val="none"/>
-                <w:sz w:val="22"/>
-                <w:szCs w:val="22"/>
-                <w:color w:val="000000"/>
-              </w:rPr>
-            </w:pPr>
-            <w:r>
-              <w:rPr>
-                <w:rFonts w:ascii="Arial" w:hAnsi="Arial" w:eastAsia="Arial" w:cs="Arial"/>
-                <w:i w:val="false"/>
-                <w:b w:val="false"/>
-                <w:u w:val="none"/>
+              <w:pStyle w:val="Normal"/>
+              <w:jc w:val="left"/>
+              <w:pBdr>
+                <w:bottom w:val="none" w:sz="0" w:space="0" w:color="000000"/>
+                <w:top w:val="none" w:sz="0" w:space="0" w:color="000000"/>
+                <w:left w:val="none" w:sz="0" w:space="0" w:color="000000"/>
+                <w:right w:val="none" w:sz="0" w:space="0" w:color="000000"/>
+              </w:pBdr>
+              <w:spacing w:after="100" w:before="100" w:line="240"/>
+              <w:ind w:left="100" w:right="100" w:firstLine="0" w:firstLineChars="0"/>
+              <w:rPr>
+                <w:rFonts w:ascii="Arial" w:hAnsi="Arial" w:eastAsia="Arial" w:cs="Arial"/>
+                <w:i w:val="false"/>
+                <w:b w:val="false"/>
+                <w:u w:val="none"/>
+                <w:strike w:val="false"/>
+                <w:sz w:val="22"/>
+                <w:szCs w:val="22"/>
+                <w:color w:val="000000"/>
+              </w:rPr>
+            </w:pPr>
+            <w:r>
+              <w:rPr>
+                <w:rFonts w:ascii="Arial" w:hAnsi="Arial" w:eastAsia="Arial" w:cs="Arial"/>
+                <w:i w:val="false"/>
+                <w:b w:val="false"/>
+                <w:u w:val="none"/>
+                <w:strike w:val="false"/>
                 <w:sz w:val="22"/>
                 <w:szCs w:val="22"/>
                 <w:color w:val="000000"/>
@@ -563,51 +589,53 @@
         <w:trPr>
           <w:trHeight w:val="615" w:hRule="auto"/>
         </w:trPr>
-        body 4
-        <w:tc>
-          <w:tcPr>
-            <w:tcBorders>
-              <w:bottom w:val="none" w:sz="0" w:space="0" w:color="000000"/>
-              <w:top w:val="none" w:sz="0" w:space="0" w:color="000000"/>
-              <w:left w:val="none" w:sz="0" w:space="0" w:color="000000"/>
-              <w:right w:val="none" w:sz="0" w:space="0" w:color="000000"/>
-            </w:tcBorders>
-            <w:shd w:val="clear" w:color="auto" w:fill="FFFFFF"/>
-            <w:tcMar>
-              <w:top w:w="0" w:type="dxa"/>
-              <w:bottom w:w="0" w:type="dxa"/>
-              <w:left w:w="0" w:type="dxa"/>
-              <w:right w:w="0" w:type="dxa"/>
-            </w:tcMar>
-            <w:vAlign w:val="center"/>
-          </w:tcPr>
-          <w:p>
-            <w:pPr>
-              <w:jc w:val="left"/>
-              <w:pBdr>
-                <w:bottom w:val="none" w:sz="0" w:space="0" w:color="000000"/>
-                <w:top w:val="none" w:sz="0" w:space="0" w:color="000000"/>
-                <w:left w:val="none" w:sz="0" w:space="0" w:color="000000"/>
-                <w:right w:val="none" w:sz="0" w:space="0" w:color="000000"/>
-              </w:pBdr>
-              <w:spacing w:after="100" w:before="100" w:line="240"/>
-              <w:ind w:left="100" w:right="100" w:firstLine="0" w:firstLineChars="0"/>
-              <w:rPr>
-                <w:rFonts w:ascii="Arial" w:hAnsi="Arial" w:eastAsia="Arial" w:cs="Arial"/>
-                <w:i w:val="false"/>
-                <w:b w:val="false"/>
-                <w:u w:val="none"/>
-                <w:sz w:val="22"/>
-                <w:szCs w:val="22"/>
-                <w:color w:val="000000"/>
-              </w:rPr>
-            </w:pPr>
-            <w:r>
-              <w:rPr>
-                <w:rFonts w:ascii="Arial" w:hAnsi="Arial" w:eastAsia="Arial" w:cs="Arial"/>
-                <w:i w:val="false"/>
-                <w:b w:val="false"/>
-                <w:u w:val="none"/>
+        <w:tc>
+          <w:tcPr>
+            <w:tcBorders>
+              <w:bottom w:val="none" w:sz="0" w:space="0" w:color="000000"/>
+              <w:top w:val="none" w:sz="0" w:space="0" w:color="000000"/>
+              <w:left w:val="none" w:sz="0" w:space="0" w:color="000000"/>
+              <w:right w:val="none" w:sz="0" w:space="0" w:color="000000"/>
+            </w:tcBorders>
+            <w:shd w:val="clear" w:color="auto" w:fill="FFFFFF"/>
+            <w:tcMar>
+              <w:top w:w="0" w:type="dxa"/>
+              <w:bottom w:w="0" w:type="dxa"/>
+              <w:left w:w="0" w:type="dxa"/>
+              <w:right w:w="0" w:type="dxa"/>
+            </w:tcMar>
+            <w:vAlign w:val="center"/>
+          </w:tcPr>
+          <w:p>
+            <w:pPr>
+              <w:pStyle w:val="Normal"/>
+              <w:jc w:val="left"/>
+              <w:pBdr>
+                <w:bottom w:val="none" w:sz="0" w:space="0" w:color="000000"/>
+                <w:top w:val="none" w:sz="0" w:space="0" w:color="000000"/>
+                <w:left w:val="none" w:sz="0" w:space="0" w:color="000000"/>
+                <w:right w:val="none" w:sz="0" w:space="0" w:color="000000"/>
+              </w:pBdr>
+              <w:spacing w:after="100" w:before="100" w:line="240"/>
+              <w:ind w:left="100" w:right="100" w:firstLine="0" w:firstLineChars="0"/>
+              <w:rPr>
+                <w:rFonts w:ascii="Arial" w:hAnsi="Arial" w:eastAsia="Arial" w:cs="Arial"/>
+                <w:i w:val="false"/>
+                <w:b w:val="false"/>
+                <w:u w:val="none"/>
+                <w:strike w:val="false"/>
+                <w:sz w:val="22"/>
+                <w:szCs w:val="22"/>
+                <w:color w:val="000000"/>
+              </w:rPr>
+            </w:pPr>
+            <w:r>
+              <w:rPr>
+                <w:rFonts w:ascii="Arial" w:hAnsi="Arial" w:eastAsia="Arial" w:cs="Arial"/>
+                <w:i w:val="false"/>
+                <w:b w:val="false"/>
+                <w:u w:val="none"/>
+                <w:strike w:val="false"/>
                 <w:sz w:val="22"/>
                 <w:szCs w:val="22"/>
                 <w:color w:val="000000"/>
@@ -635,31 +663,34 @@
           </w:tcPr>
           <w:p>
             <w:pPr>
-              <w:jc w:val="left"/>
-              <w:pBdr>
-                <w:bottom w:val="none" w:sz="0" w:space="0" w:color="000000"/>
-                <w:top w:val="none" w:sz="0" w:space="0" w:color="000000"/>
-                <w:left w:val="none" w:sz="0" w:space="0" w:color="000000"/>
-                <w:right w:val="none" w:sz="0" w:space="0" w:color="000000"/>
-              </w:pBdr>
-              <w:spacing w:after="100" w:before="100" w:line="240"/>
-              <w:ind w:left="100" w:right="100" w:firstLine="0" w:firstLineChars="0"/>
-              <w:rPr>
-                <w:rFonts w:ascii="Arial" w:hAnsi="Arial" w:eastAsia="Arial" w:cs="Arial"/>
-                <w:i w:val="false"/>
-                <w:b w:val="false"/>
-                <w:u w:val="none"/>
-                <w:sz w:val="22"/>
-                <w:szCs w:val="22"/>
-                <w:color w:val="000000"/>
-              </w:rPr>
-            </w:pPr>
-            <w:r>
-              <w:rPr>
-                <w:rFonts w:ascii="Arial" w:hAnsi="Arial" w:eastAsia="Arial" w:cs="Arial"/>
-                <w:i w:val="false"/>
-                <w:b w:val="false"/>
-                <w:u w:val="none"/>
+              <w:pStyle w:val="Normal"/>
+              <w:jc w:val="left"/>
+              <w:pBdr>
+                <w:bottom w:val="none" w:sz="0" w:space="0" w:color="000000"/>
+                <w:top w:val="none" w:sz="0" w:space="0" w:color="000000"/>
+                <w:left w:val="none" w:sz="0" w:space="0" w:color="000000"/>
+                <w:right w:val="none" w:sz="0" w:space="0" w:color="000000"/>
+              </w:pBdr>
+              <w:spacing w:after="100" w:before="100" w:line="240"/>
+              <w:ind w:left="100" w:right="100" w:firstLine="0" w:firstLineChars="0"/>
+              <w:rPr>
+                <w:rFonts w:ascii="Arial" w:hAnsi="Arial" w:eastAsia="Arial" w:cs="Arial"/>
+                <w:i w:val="false"/>
+                <w:b w:val="false"/>
+                <w:u w:val="none"/>
+                <w:strike w:val="false"/>
+                <w:sz w:val="22"/>
+                <w:szCs w:val="22"/>
+                <w:color w:val="000000"/>
+              </w:rPr>
+            </w:pPr>
+            <w:r>
+              <w:rPr>
+                <w:rFonts w:ascii="Arial" w:hAnsi="Arial" w:eastAsia="Arial" w:cs="Arial"/>
+                <w:i w:val="false"/>
+                <w:b w:val="false"/>
+                <w:u w:val="none"/>
+                <w:strike w:val="false"/>
                 <w:sz w:val="22"/>
                 <w:szCs w:val="22"/>
                 <w:color w:val="000000"/>
@@ -687,31 +718,34 @@
           </w:tcPr>
           <w:p>
             <w:pPr>
-              <w:jc w:val="left"/>
-              <w:pBdr>
-                <w:bottom w:val="none" w:sz="0" w:space="0" w:color="000000"/>
-                <w:top w:val="none" w:sz="0" w:space="0" w:color="000000"/>
-                <w:left w:val="none" w:sz="0" w:space="0" w:color="000000"/>
-                <w:right w:val="none" w:sz="0" w:space="0" w:color="000000"/>
-              </w:pBdr>
-              <w:spacing w:after="100" w:before="100" w:line="240"/>
-              <w:ind w:left="100" w:right="100" w:firstLine="0" w:firstLineChars="0"/>
-              <w:rPr>
-                <w:rFonts w:ascii="Arial" w:hAnsi="Arial" w:eastAsia="Arial" w:cs="Arial"/>
-                <w:i w:val="false"/>
-                <w:b w:val="false"/>
-                <w:u w:val="none"/>
-                <w:sz w:val="22"/>
-                <w:szCs w:val="22"/>
-                <w:color w:val="000000"/>
-              </w:rPr>
-            </w:pPr>
-            <w:r>
-              <w:rPr>
-                <w:rFonts w:ascii="Arial" w:hAnsi="Arial" w:eastAsia="Arial" w:cs="Arial"/>
-                <w:i w:val="false"/>
-                <w:b w:val="false"/>
-                <w:u w:val="none"/>
+              <w:pStyle w:val="Normal"/>
+              <w:jc w:val="left"/>
+              <w:pBdr>
+                <w:bottom w:val="none" w:sz="0" w:space="0" w:color="000000"/>
+                <w:top w:val="none" w:sz="0" w:space="0" w:color="000000"/>
+                <w:left w:val="none" w:sz="0" w:space="0" w:color="000000"/>
+                <w:right w:val="none" w:sz="0" w:space="0" w:color="000000"/>
+              </w:pBdr>
+              <w:spacing w:after="100" w:before="100" w:line="240"/>
+              <w:ind w:left="100" w:right="100" w:firstLine="0" w:firstLineChars="0"/>
+              <w:rPr>
+                <w:rFonts w:ascii="Arial" w:hAnsi="Arial" w:eastAsia="Arial" w:cs="Arial"/>
+                <w:i w:val="false"/>
+                <w:b w:val="false"/>
+                <w:u w:val="none"/>
+                <w:strike w:val="false"/>
+                <w:sz w:val="22"/>
+                <w:szCs w:val="22"/>
+                <w:color w:val="000000"/>
+              </w:rPr>
+            </w:pPr>
+            <w:r>
+              <w:rPr>
+                <w:rFonts w:ascii="Arial" w:hAnsi="Arial" w:eastAsia="Arial" w:cs="Arial"/>
+                <w:i w:val="false"/>
+                <w:b w:val="false"/>
+                <w:u w:val="none"/>
+                <w:strike w:val="false"/>
                 <w:sz w:val="22"/>
                 <w:szCs w:val="22"/>
                 <w:color w:val="000000"/>
@@ -725,51 +759,53 @@
         <w:trPr>
           <w:trHeight w:val="574" w:hRule="auto"/>
         </w:trPr>
-        body 5
-        <w:tc>
-          <w:tcPr>
-            <w:tcBorders>
-              <w:bottom w:val="none" w:sz="0" w:space="0" w:color="000000"/>
-              <w:top w:val="none" w:sz="0" w:space="0" w:color="000000"/>
-              <w:left w:val="none" w:sz="0" w:space="0" w:color="000000"/>
-              <w:right w:val="none" w:sz="0" w:space="0" w:color="000000"/>
-            </w:tcBorders>
-            <w:shd w:val="clear" w:color="auto" w:fill="FFFFFF"/>
-            <w:tcMar>
-              <w:top w:w="0" w:type="dxa"/>
-              <w:bottom w:w="0" w:type="dxa"/>
-              <w:left w:w="0" w:type="dxa"/>
-              <w:right w:w="0" w:type="dxa"/>
-            </w:tcMar>
-            <w:vAlign w:val="center"/>
-          </w:tcPr>
-          <w:p>
-            <w:pPr>
-              <w:jc w:val="left"/>
-              <w:pBdr>
-                <w:bottom w:val="none" w:sz="0" w:space="0" w:color="000000"/>
-                <w:top w:val="none" w:sz="0" w:space="0" w:color="000000"/>
-                <w:left w:val="none" w:sz="0" w:space="0" w:color="000000"/>
-                <w:right w:val="none" w:sz="0" w:space="0" w:color="000000"/>
-              </w:pBdr>
-              <w:spacing w:after="100" w:before="100" w:line="240"/>
-              <w:ind w:left="100" w:right="100" w:firstLine="0" w:firstLineChars="0"/>
-              <w:rPr>
-                <w:rFonts w:ascii="Arial" w:hAnsi="Arial" w:eastAsia="Arial" w:cs="Arial"/>
-                <w:i w:val="false"/>
-                <w:b w:val="false"/>
-                <w:u w:val="none"/>
-                <w:sz w:val="22"/>
-                <w:szCs w:val="22"/>
-                <w:color w:val="000000"/>
-              </w:rPr>
-            </w:pPr>
-            <w:r>
-              <w:rPr>
-                <w:rFonts w:ascii="Arial" w:hAnsi="Arial" w:eastAsia="Arial" w:cs="Arial"/>
-                <w:i w:val="false"/>
-                <w:b w:val="false"/>
-                <w:u w:val="none"/>
+        <w:tc>
+          <w:tcPr>
+            <w:tcBorders>
+              <w:bottom w:val="none" w:sz="0" w:space="0" w:color="000000"/>
+              <w:top w:val="none" w:sz="0" w:space="0" w:color="000000"/>
+              <w:left w:val="none" w:sz="0" w:space="0" w:color="000000"/>
+              <w:right w:val="none" w:sz="0" w:space="0" w:color="000000"/>
+            </w:tcBorders>
+            <w:shd w:val="clear" w:color="auto" w:fill="FFFFFF"/>
+            <w:tcMar>
+              <w:top w:w="0" w:type="dxa"/>
+              <w:bottom w:w="0" w:type="dxa"/>
+              <w:left w:w="0" w:type="dxa"/>
+              <w:right w:w="0" w:type="dxa"/>
+            </w:tcMar>
+            <w:vAlign w:val="center"/>
+          </w:tcPr>
+          <w:p>
+            <w:pPr>
+              <w:pStyle w:val="Normal"/>
+              <w:jc w:val="left"/>
+              <w:pBdr>
+                <w:bottom w:val="none" w:sz="0" w:space="0" w:color="000000"/>
+                <w:top w:val="none" w:sz="0" w:space="0" w:color="000000"/>
+                <w:left w:val="none" w:sz="0" w:space="0" w:color="000000"/>
+                <w:right w:val="none" w:sz="0" w:space="0" w:color="000000"/>
+              </w:pBdr>
+              <w:spacing w:after="100" w:before="100" w:line="240"/>
+              <w:ind w:left="100" w:right="100" w:firstLine="0" w:firstLineChars="0"/>
+              <w:rPr>
+                <w:rFonts w:ascii="Arial" w:hAnsi="Arial" w:eastAsia="Arial" w:cs="Arial"/>
+                <w:i w:val="false"/>
+                <w:b w:val="false"/>
+                <w:u w:val="none"/>
+                <w:strike w:val="false"/>
+                <w:sz w:val="22"/>
+                <w:szCs w:val="22"/>
+                <w:color w:val="000000"/>
+              </w:rPr>
+            </w:pPr>
+            <w:r>
+              <w:rPr>
+                <w:rFonts w:ascii="Arial" w:hAnsi="Arial" w:eastAsia="Arial" w:cs="Arial"/>
+                <w:i w:val="false"/>
+                <w:b w:val="false"/>
+                <w:u w:val="none"/>
+                <w:strike w:val="false"/>
                 <w:sz w:val="22"/>
                 <w:szCs w:val="22"/>
                 <w:color w:val="000000"/>
@@ -797,31 +833,34 @@
           </w:tcPr>
           <w:p>
             <w:pPr>
-              <w:jc w:val="left"/>
-              <w:pBdr>
-                <w:bottom w:val="none" w:sz="0" w:space="0" w:color="000000"/>
-                <w:top w:val="none" w:sz="0" w:space="0" w:color="000000"/>
-                <w:left w:val="none" w:sz="0" w:space="0" w:color="000000"/>
-                <w:right w:val="none" w:sz="0" w:space="0" w:color="000000"/>
-              </w:pBdr>
-              <w:spacing w:after="100" w:before="100" w:line="240"/>
-              <w:ind w:left="100" w:right="100" w:firstLine="0" w:firstLineChars="0"/>
-              <w:rPr>
-                <w:rFonts w:ascii="Arial" w:hAnsi="Arial" w:eastAsia="Arial" w:cs="Arial"/>
-                <w:i w:val="false"/>
-                <w:b w:val="false"/>
-                <w:u w:val="none"/>
-                <w:sz w:val="22"/>
-                <w:szCs w:val="22"/>
-                <w:color w:val="000000"/>
-              </w:rPr>
-            </w:pPr>
-            <w:r>
-              <w:rPr>
-                <w:rFonts w:ascii="Arial" w:hAnsi="Arial" w:eastAsia="Arial" w:cs="Arial"/>
-                <w:i w:val="false"/>
-                <w:b w:val="false"/>
-                <w:u w:val="none"/>
+              <w:pStyle w:val="Normal"/>
+              <w:jc w:val="left"/>
+              <w:pBdr>
+                <w:bottom w:val="none" w:sz="0" w:space="0" w:color="000000"/>
+                <w:top w:val="none" w:sz="0" w:space="0" w:color="000000"/>
+                <w:left w:val="none" w:sz="0" w:space="0" w:color="000000"/>
+                <w:right w:val="none" w:sz="0" w:space="0" w:color="000000"/>
+              </w:pBdr>
+              <w:spacing w:after="100" w:before="100" w:line="240"/>
+              <w:ind w:left="100" w:right="100" w:firstLine="0" w:firstLineChars="0"/>
+              <w:rPr>
+                <w:rFonts w:ascii="Arial" w:hAnsi="Arial" w:eastAsia="Arial" w:cs="Arial"/>
+                <w:i w:val="false"/>
+                <w:b w:val="false"/>
+                <w:u w:val="none"/>
+                <w:strike w:val="false"/>
+                <w:sz w:val="22"/>
+                <w:szCs w:val="22"/>
+                <w:color w:val="000000"/>
+              </w:rPr>
+            </w:pPr>
+            <w:r>
+              <w:rPr>
+                <w:rFonts w:ascii="Arial" w:hAnsi="Arial" w:eastAsia="Arial" w:cs="Arial"/>
+                <w:i w:val="false"/>
+                <w:b w:val="false"/>
+                <w:u w:val="none"/>
+                <w:strike w:val="false"/>
                 <w:sz w:val="22"/>
                 <w:szCs w:val="22"/>
                 <w:color w:val="000000"/>
@@ -849,31 +888,34 @@
           </w:tcPr>
           <w:p>
             <w:pPr>
-              <w:jc w:val="left"/>
-              <w:pBdr>
-                <w:bottom w:val="none" w:sz="0" w:space="0" w:color="000000"/>
-                <w:top w:val="none" w:sz="0" w:space="0" w:color="000000"/>
-                <w:left w:val="none" w:sz="0" w:space="0" w:color="000000"/>
-                <w:right w:val="none" w:sz="0" w:space="0" w:color="000000"/>
-              </w:pBdr>
-              <w:spacing w:after="100" w:before="100" w:line="240"/>
-              <w:ind w:left="100" w:right="100" w:firstLine="0" w:firstLineChars="0"/>
-              <w:rPr>
-                <w:rFonts w:ascii="Arial" w:hAnsi="Arial" w:eastAsia="Arial" w:cs="Arial"/>
-                <w:i w:val="false"/>
-                <w:b w:val="false"/>
-                <w:u w:val="none"/>
-                <w:sz w:val="22"/>
-                <w:szCs w:val="22"/>
-                <w:color w:val="000000"/>
-              </w:rPr>
-            </w:pPr>
-            <w:r>
-              <w:rPr>
-                <w:rFonts w:ascii="Arial" w:hAnsi="Arial" w:eastAsia="Arial" w:cs="Arial"/>
-                <w:i w:val="false"/>
-                <w:b w:val="false"/>
-                <w:u w:val="none"/>
+              <w:pStyle w:val="Normal"/>
+              <w:jc w:val="left"/>
+              <w:pBdr>
+                <w:bottom w:val="none" w:sz="0" w:space="0" w:color="000000"/>
+                <w:top w:val="none" w:sz="0" w:space="0" w:color="000000"/>
+                <w:left w:val="none" w:sz="0" w:space="0" w:color="000000"/>
+                <w:right w:val="none" w:sz="0" w:space="0" w:color="000000"/>
+              </w:pBdr>
+              <w:spacing w:after="100" w:before="100" w:line="240"/>
+              <w:ind w:left="100" w:right="100" w:firstLine="0" w:firstLineChars="0"/>
+              <w:rPr>
+                <w:rFonts w:ascii="Arial" w:hAnsi="Arial" w:eastAsia="Arial" w:cs="Arial"/>
+                <w:i w:val="false"/>
+                <w:b w:val="false"/>
+                <w:u w:val="none"/>
+                <w:strike w:val="false"/>
+                <w:sz w:val="22"/>
+                <w:szCs w:val="22"/>
+                <w:color w:val="000000"/>
+              </w:rPr>
+            </w:pPr>
+            <w:r>
+              <w:rPr>
+                <w:rFonts w:ascii="Arial" w:hAnsi="Arial" w:eastAsia="Arial" w:cs="Arial"/>
+                <w:i w:val="false"/>
+                <w:b w:val="false"/>
+                <w:u w:val="none"/>
+                <w:strike w:val="false"/>
                 <w:sz w:val="22"/>
                 <w:szCs w:val="22"/>
                 <w:color w:val="000000"/>
@@ -887,51 +929,53 @@
         <w:trPr>
           <w:trHeight w:val="614" w:hRule="auto"/>
         </w:trPr>
-        body 6
-        <w:tc>
-          <w:tcPr>
-            <w:tcBorders>
-              <w:bottom w:val="none" w:sz="0" w:space="0" w:color="000000"/>
-              <w:top w:val="none" w:sz="0" w:space="0" w:color="000000"/>
-              <w:left w:val="none" w:sz="0" w:space="0" w:color="000000"/>
-              <w:right w:val="none" w:sz="0" w:space="0" w:color="000000"/>
-            </w:tcBorders>
-            <w:shd w:val="clear" w:color="auto" w:fill="FFFFFF"/>
-            <w:tcMar>
-              <w:top w:w="0" w:type="dxa"/>
-              <w:bottom w:w="0" w:type="dxa"/>
-              <w:left w:w="0" w:type="dxa"/>
-              <w:right w:w="0" w:type="dxa"/>
-            </w:tcMar>
-            <w:vAlign w:val="center"/>
-          </w:tcPr>
-          <w:p>
-            <w:pPr>
-              <w:jc w:val="left"/>
-              <w:pBdr>
-                <w:bottom w:val="none" w:sz="0" w:space="0" w:color="000000"/>
-                <w:top w:val="none" w:sz="0" w:space="0" w:color="000000"/>
-                <w:left w:val="none" w:sz="0" w:space="0" w:color="000000"/>
-                <w:right w:val="none" w:sz="0" w:space="0" w:color="000000"/>
-              </w:pBdr>
-              <w:spacing w:after="100" w:before="100" w:line="240"/>
-              <w:ind w:left="100" w:right="100" w:firstLine="0" w:firstLineChars="0"/>
-              <w:rPr>
-                <w:rFonts w:ascii="Arial" w:hAnsi="Arial" w:eastAsia="Arial" w:cs="Arial"/>
-                <w:i w:val="false"/>
-                <w:b w:val="false"/>
-                <w:u w:val="none"/>
-                <w:sz w:val="22"/>
-                <w:szCs w:val="22"/>
-                <w:color w:val="000000"/>
-              </w:rPr>
-            </w:pPr>
-            <w:r>
-              <w:rPr>
-                <w:rFonts w:ascii="Arial" w:hAnsi="Arial" w:eastAsia="Arial" w:cs="Arial"/>
-                <w:i w:val="false"/>
-                <w:b w:val="false"/>
-                <w:u w:val="none"/>
+        <w:tc>
+          <w:tcPr>
+            <w:tcBorders>
+              <w:bottom w:val="none" w:sz="0" w:space="0" w:color="000000"/>
+              <w:top w:val="none" w:sz="0" w:space="0" w:color="000000"/>
+              <w:left w:val="none" w:sz="0" w:space="0" w:color="000000"/>
+              <w:right w:val="none" w:sz="0" w:space="0" w:color="000000"/>
+            </w:tcBorders>
+            <w:shd w:val="clear" w:color="auto" w:fill="FFFFFF"/>
+            <w:tcMar>
+              <w:top w:w="0" w:type="dxa"/>
+              <w:bottom w:w="0" w:type="dxa"/>
+              <w:left w:w="0" w:type="dxa"/>
+              <w:right w:w="0" w:type="dxa"/>
+            </w:tcMar>
+            <w:vAlign w:val="center"/>
+          </w:tcPr>
+          <w:p>
+            <w:pPr>
+              <w:pStyle w:val="Normal"/>
+              <w:jc w:val="left"/>
+              <w:pBdr>
+                <w:bottom w:val="none" w:sz="0" w:space="0" w:color="000000"/>
+                <w:top w:val="none" w:sz="0" w:space="0" w:color="000000"/>
+                <w:left w:val="none" w:sz="0" w:space="0" w:color="000000"/>
+                <w:right w:val="none" w:sz="0" w:space="0" w:color="000000"/>
+              </w:pBdr>
+              <w:spacing w:after="100" w:before="100" w:line="240"/>
+              <w:ind w:left="100" w:right="100" w:firstLine="0" w:firstLineChars="0"/>
+              <w:rPr>
+                <w:rFonts w:ascii="Arial" w:hAnsi="Arial" w:eastAsia="Arial" w:cs="Arial"/>
+                <w:i w:val="false"/>
+                <w:b w:val="false"/>
+                <w:u w:val="none"/>
+                <w:strike w:val="false"/>
+                <w:sz w:val="22"/>
+                <w:szCs w:val="22"/>
+                <w:color w:val="000000"/>
+              </w:rPr>
+            </w:pPr>
+            <w:r>
+              <w:rPr>
+                <w:rFonts w:ascii="Arial" w:hAnsi="Arial" w:eastAsia="Arial" w:cs="Arial"/>
+                <w:i w:val="false"/>
+                <w:b w:val="false"/>
+                <w:u w:val="none"/>
+                <w:strike w:val="false"/>
                 <w:sz w:val="22"/>
                 <w:szCs w:val="22"/>
                 <w:color w:val="000000"/>
@@ -959,31 +1003,34 @@
           </w:tcPr>
           <w:p>
             <w:pPr>
-              <w:jc w:val="left"/>
-              <w:pBdr>
-                <w:bottom w:val="none" w:sz="0" w:space="0" w:color="000000"/>
-                <w:top w:val="none" w:sz="0" w:space="0" w:color="000000"/>
-                <w:left w:val="none" w:sz="0" w:space="0" w:color="000000"/>
-                <w:right w:val="none" w:sz="0" w:space="0" w:color="000000"/>
-              </w:pBdr>
-              <w:spacing w:after="100" w:before="100" w:line="240"/>
-              <w:ind w:left="100" w:right="100" w:firstLine="0" w:firstLineChars="0"/>
-              <w:rPr>
-                <w:rFonts w:ascii="Arial" w:hAnsi="Arial" w:eastAsia="Arial" w:cs="Arial"/>
-                <w:i w:val="false"/>
-                <w:b w:val="false"/>
-                <w:u w:val="none"/>
-                <w:sz w:val="22"/>
-                <w:szCs w:val="22"/>
-                <w:color w:val="000000"/>
-              </w:rPr>
-            </w:pPr>
-            <w:r>
-              <w:rPr>
-                <w:rFonts w:ascii="Arial" w:hAnsi="Arial" w:eastAsia="Arial" w:cs="Arial"/>
-                <w:i w:val="false"/>
-                <w:b w:val="false"/>
-                <w:u w:val="none"/>
+              <w:pStyle w:val="Normal"/>
+              <w:jc w:val="left"/>
+              <w:pBdr>
+                <w:bottom w:val="none" w:sz="0" w:space="0" w:color="000000"/>
+                <w:top w:val="none" w:sz="0" w:space="0" w:color="000000"/>
+                <w:left w:val="none" w:sz="0" w:space="0" w:color="000000"/>
+                <w:right w:val="none" w:sz="0" w:space="0" w:color="000000"/>
+              </w:pBdr>
+              <w:spacing w:after="100" w:before="100" w:line="240"/>
+              <w:ind w:left="100" w:right="100" w:firstLine="0" w:firstLineChars="0"/>
+              <w:rPr>
+                <w:rFonts w:ascii="Arial" w:hAnsi="Arial" w:eastAsia="Arial" w:cs="Arial"/>
+                <w:i w:val="false"/>
+                <w:b w:val="false"/>
+                <w:u w:val="none"/>
+                <w:strike w:val="false"/>
+                <w:sz w:val="22"/>
+                <w:szCs w:val="22"/>
+                <w:color w:val="000000"/>
+              </w:rPr>
+            </w:pPr>
+            <w:r>
+              <w:rPr>
+                <w:rFonts w:ascii="Arial" w:hAnsi="Arial" w:eastAsia="Arial" w:cs="Arial"/>
+                <w:i w:val="false"/>
+                <w:b w:val="false"/>
+                <w:u w:val="none"/>
+                <w:strike w:val="false"/>
                 <w:sz w:val="22"/>
                 <w:szCs w:val="22"/>
                 <w:color w:val="000000"/>
@@ -1011,31 +1058,34 @@
           </w:tcPr>
           <w:p>
             <w:pPr>
-              <w:jc w:val="left"/>
-              <w:pBdr>
-                <w:bottom w:val="none" w:sz="0" w:space="0" w:color="000000"/>
-                <w:top w:val="none" w:sz="0" w:space="0" w:color="000000"/>
-                <w:left w:val="none" w:sz="0" w:space="0" w:color="000000"/>
-                <w:right w:val="none" w:sz="0" w:space="0" w:color="000000"/>
-              </w:pBdr>
-              <w:spacing w:after="100" w:before="100" w:line="240"/>
-              <w:ind w:left="100" w:right="100" w:firstLine="0" w:firstLineChars="0"/>
-              <w:rPr>
-                <w:rFonts w:ascii="Arial" w:hAnsi="Arial" w:eastAsia="Arial" w:cs="Arial"/>
-                <w:i w:val="false"/>
-                <w:b w:val="false"/>
-                <w:u w:val="none"/>
-                <w:sz w:val="22"/>
-                <w:szCs w:val="22"/>
-                <w:color w:val="000000"/>
-              </w:rPr>
-            </w:pPr>
-            <w:r>
-              <w:rPr>
-                <w:rFonts w:ascii="Arial" w:hAnsi="Arial" w:eastAsia="Arial" w:cs="Arial"/>
-                <w:i w:val="false"/>
-                <w:b w:val="false"/>
-                <w:u w:val="none"/>
+              <w:pStyle w:val="Normal"/>
+              <w:jc w:val="left"/>
+              <w:pBdr>
+                <w:bottom w:val="none" w:sz="0" w:space="0" w:color="000000"/>
+                <w:top w:val="none" w:sz="0" w:space="0" w:color="000000"/>
+                <w:left w:val="none" w:sz="0" w:space="0" w:color="000000"/>
+                <w:right w:val="none" w:sz="0" w:space="0" w:color="000000"/>
+              </w:pBdr>
+              <w:spacing w:after="100" w:before="100" w:line="240"/>
+              <w:ind w:left="100" w:right="100" w:firstLine="0" w:firstLineChars="0"/>
+              <w:rPr>
+                <w:rFonts w:ascii="Arial" w:hAnsi="Arial" w:eastAsia="Arial" w:cs="Arial"/>
+                <w:i w:val="false"/>
+                <w:b w:val="false"/>
+                <w:u w:val="none"/>
+                <w:strike w:val="false"/>
+                <w:sz w:val="22"/>
+                <w:szCs w:val="22"/>
+                <w:color w:val="000000"/>
+              </w:rPr>
+            </w:pPr>
+            <w:r>
+              <w:rPr>
+                <w:rFonts w:ascii="Arial" w:hAnsi="Arial" w:eastAsia="Arial" w:cs="Arial"/>
+                <w:i w:val="false"/>
+                <w:b w:val="false"/>
+                <w:u w:val="none"/>
+                <w:strike w:val="false"/>
                 <w:sz w:val="22"/>
                 <w:szCs w:val="22"/>
                 <w:color w:val="000000"/>
@@ -1049,7 +1099,6 @@
         <w:trPr>
           <w:trHeight w:val="615" w:hRule="auto"/>
         </w:trPr>
-        body 7
         <w:tc>
           <w:tcPr>
             <w:gridSpan w:val="3"/>
@@ -1070,6 +1119,7 @@
           </w:tcPr>
           <w:p>
             <w:pPr>
+              <w:pStyle w:val="Normal"/>
               <w:jc w:val="left"/>
               <w:pBdr>
                 <w:bottom w:val="none" w:sz="0" w:space="0" w:color="000000"/>
@@ -1084,6 +1134,7 @@
                 <w:i w:val="false"/>
                 <w:b w:val="true"/>
                 <w:u w:val="none"/>
+                <w:strike w:val="false"/>
                 <w:sz w:val="22"/>
                 <w:szCs w:val="22"/>
                 <w:color w:val="000000"/>
@@ -1095,6 +1146,7 @@
                 <w:i w:val="false"/>
                 <w:b w:val="true"/>
                 <w:u w:val="none"/>
+                <w:strike w:val="false"/>
                 <w:sz w:val="22"/>
                 <w:szCs w:val="22"/>
                 <w:color w:val="000000"/>
@@ -1108,51 +1160,53 @@
         <w:trPr>
           <w:trHeight w:val="572" w:hRule="auto"/>
         </w:trPr>
-        body 8
-        <w:tc>
-          <w:tcPr>
-            <w:tcBorders>
-              <w:bottom w:val="none" w:sz="0" w:space="0" w:color="000000"/>
-              <w:top w:val="none" w:sz="0" w:space="0" w:color="000000"/>
-              <w:left w:val="none" w:sz="0" w:space="0" w:color="000000"/>
-              <w:right w:val="none" w:sz="0" w:space="0" w:color="000000"/>
-            </w:tcBorders>
-            <w:shd w:val="clear" w:color="auto" w:fill="FFFFFF"/>
-            <w:tcMar>
-              <w:top w:w="0" w:type="dxa"/>
-              <w:bottom w:w="0" w:type="dxa"/>
-              <w:left w:w="0" w:type="dxa"/>
-              <w:right w:w="0" w:type="dxa"/>
-            </w:tcMar>
-            <w:vAlign w:val="center"/>
-          </w:tcPr>
-          <w:p>
-            <w:pPr>
-              <w:jc w:val="left"/>
-              <w:pBdr>
-                <w:bottom w:val="none" w:sz="0" w:space="0" w:color="000000"/>
-                <w:top w:val="none" w:sz="0" w:space="0" w:color="000000"/>
-                <w:left w:val="none" w:sz="0" w:space="0" w:color="000000"/>
-                <w:right w:val="none" w:sz="0" w:space="0" w:color="000000"/>
-              </w:pBdr>
-              <w:spacing w:after="100" w:before="100" w:line="240"/>
-              <w:ind w:left="100" w:right="100" w:firstLine="0" w:firstLineChars="0"/>
-              <w:rPr>
-                <w:rFonts w:ascii="Arial" w:hAnsi="Arial" w:eastAsia="Arial" w:cs="Arial"/>
-                <w:i w:val="false"/>
-                <w:b w:val="false"/>
-                <w:u w:val="none"/>
-                <w:sz w:val="22"/>
-                <w:szCs w:val="22"/>
-                <w:color w:val="000000"/>
-              </w:rPr>
-            </w:pPr>
-            <w:r>
-              <w:rPr>
-                <w:rFonts w:ascii="Arial" w:hAnsi="Arial" w:eastAsia="Arial" w:cs="Arial"/>
-                <w:i w:val="false"/>
-                <w:b w:val="false"/>
-                <w:u w:val="none"/>
+        <w:tc>
+          <w:tcPr>
+            <w:tcBorders>
+              <w:bottom w:val="none" w:sz="0" w:space="0" w:color="000000"/>
+              <w:top w:val="none" w:sz="0" w:space="0" w:color="000000"/>
+              <w:left w:val="none" w:sz="0" w:space="0" w:color="000000"/>
+              <w:right w:val="none" w:sz="0" w:space="0" w:color="000000"/>
+            </w:tcBorders>
+            <w:shd w:val="clear" w:color="auto" w:fill="FFFFFF"/>
+            <w:tcMar>
+              <w:top w:w="0" w:type="dxa"/>
+              <w:bottom w:w="0" w:type="dxa"/>
+              <w:left w:w="0" w:type="dxa"/>
+              <w:right w:w="0" w:type="dxa"/>
+            </w:tcMar>
+            <w:vAlign w:val="center"/>
+          </w:tcPr>
+          <w:p>
+            <w:pPr>
+              <w:pStyle w:val="Normal"/>
+              <w:jc w:val="left"/>
+              <w:pBdr>
+                <w:bottom w:val="none" w:sz="0" w:space="0" w:color="000000"/>
+                <w:top w:val="none" w:sz="0" w:space="0" w:color="000000"/>
+                <w:left w:val="none" w:sz="0" w:space="0" w:color="000000"/>
+                <w:right w:val="none" w:sz="0" w:space="0" w:color="000000"/>
+              </w:pBdr>
+              <w:spacing w:after="100" w:before="100" w:line="240"/>
+              <w:ind w:left="100" w:right="100" w:firstLine="0" w:firstLineChars="0"/>
+              <w:rPr>
+                <w:rFonts w:ascii="Arial" w:hAnsi="Arial" w:eastAsia="Arial" w:cs="Arial"/>
+                <w:i w:val="false"/>
+                <w:b w:val="false"/>
+                <w:u w:val="none"/>
+                <w:strike w:val="false"/>
+                <w:sz w:val="22"/>
+                <w:szCs w:val="22"/>
+                <w:color w:val="000000"/>
+              </w:rPr>
+            </w:pPr>
+            <w:r>
+              <w:rPr>
+                <w:rFonts w:ascii="Arial" w:hAnsi="Arial" w:eastAsia="Arial" w:cs="Arial"/>
+                <w:i w:val="false"/>
+                <w:b w:val="false"/>
+                <w:u w:val="none"/>
+                <w:strike w:val="false"/>
                 <w:sz w:val="22"/>
                 <w:szCs w:val="22"/>
                 <w:color w:val="000000"/>
@@ -1180,31 +1234,34 @@
           </w:tcPr>
           <w:p>
             <w:pPr>
-              <w:jc w:val="left"/>
-              <w:pBdr>
-                <w:bottom w:val="none" w:sz="0" w:space="0" w:color="000000"/>
-                <w:top w:val="none" w:sz="0" w:space="0" w:color="000000"/>
-                <w:left w:val="none" w:sz="0" w:space="0" w:color="000000"/>
-                <w:right w:val="none" w:sz="0" w:space="0" w:color="000000"/>
-              </w:pBdr>
-              <w:spacing w:after="100" w:before="100" w:line="240"/>
-              <w:ind w:left="100" w:right="100" w:firstLine="0" w:firstLineChars="0"/>
-              <w:rPr>
-                <w:rFonts w:ascii="Arial" w:hAnsi="Arial" w:eastAsia="Arial" w:cs="Arial"/>
-                <w:i w:val="false"/>
-                <w:b w:val="false"/>
-                <w:u w:val="none"/>
-                <w:sz w:val="22"/>
-                <w:szCs w:val="22"/>
-                <w:color w:val="000000"/>
-              </w:rPr>
-            </w:pPr>
-            <w:r>
-              <w:rPr>
-                <w:rFonts w:ascii="Arial" w:hAnsi="Arial" w:eastAsia="Arial" w:cs="Arial"/>
-                <w:i w:val="false"/>
-                <w:b w:val="false"/>
-                <w:u w:val="none"/>
+              <w:pStyle w:val="Normal"/>
+              <w:jc w:val="left"/>
+              <w:pBdr>
+                <w:bottom w:val="none" w:sz="0" w:space="0" w:color="000000"/>
+                <w:top w:val="none" w:sz="0" w:space="0" w:color="000000"/>
+                <w:left w:val="none" w:sz="0" w:space="0" w:color="000000"/>
+                <w:right w:val="none" w:sz="0" w:space="0" w:color="000000"/>
+              </w:pBdr>
+              <w:spacing w:after="100" w:before="100" w:line="240"/>
+              <w:ind w:left="100" w:right="100" w:firstLine="0" w:firstLineChars="0"/>
+              <w:rPr>
+                <w:rFonts w:ascii="Arial" w:hAnsi="Arial" w:eastAsia="Arial" w:cs="Arial"/>
+                <w:i w:val="false"/>
+                <w:b w:val="false"/>
+                <w:u w:val="none"/>
+                <w:strike w:val="false"/>
+                <w:sz w:val="22"/>
+                <w:szCs w:val="22"/>
+                <w:color w:val="000000"/>
+              </w:rPr>
+            </w:pPr>
+            <w:r>
+              <w:rPr>
+                <w:rFonts w:ascii="Arial" w:hAnsi="Arial" w:eastAsia="Arial" w:cs="Arial"/>
+                <w:i w:val="false"/>
+                <w:b w:val="false"/>
+                <w:u w:val="none"/>
+                <w:strike w:val="false"/>
                 <w:sz w:val="22"/>
                 <w:szCs w:val="22"/>
                 <w:color w:val="000000"/>
@@ -1232,31 +1289,34 @@
           </w:tcPr>
           <w:p>
             <w:pPr>
-              <w:jc w:val="left"/>
-              <w:pBdr>
-                <w:bottom w:val="none" w:sz="0" w:space="0" w:color="000000"/>
-                <w:top w:val="none" w:sz="0" w:space="0" w:color="000000"/>
-                <w:left w:val="none" w:sz="0" w:space="0" w:color="000000"/>
-                <w:right w:val="none" w:sz="0" w:space="0" w:color="000000"/>
-              </w:pBdr>
-              <w:spacing w:after="100" w:before="100" w:line="240"/>
-              <w:ind w:left="100" w:right="100" w:firstLine="0" w:firstLineChars="0"/>
-              <w:rPr>
-                <w:rFonts w:ascii="Arial" w:hAnsi="Arial" w:eastAsia="Arial" w:cs="Arial"/>
-                <w:i w:val="false"/>
-                <w:b w:val="false"/>
-                <w:u w:val="none"/>
-                <w:sz w:val="22"/>
-                <w:szCs w:val="22"/>
-                <w:color w:val="000000"/>
-              </w:rPr>
-            </w:pPr>
-            <w:r>
-              <w:rPr>
-                <w:rFonts w:ascii="Arial" w:hAnsi="Arial" w:eastAsia="Arial" w:cs="Arial"/>
-                <w:i w:val="false"/>
-                <w:b w:val="false"/>
-                <w:u w:val="none"/>
+              <w:pStyle w:val="Normal"/>
+              <w:jc w:val="left"/>
+              <w:pBdr>
+                <w:bottom w:val="none" w:sz="0" w:space="0" w:color="000000"/>
+                <w:top w:val="none" w:sz="0" w:space="0" w:color="000000"/>
+                <w:left w:val="none" w:sz="0" w:space="0" w:color="000000"/>
+                <w:right w:val="none" w:sz="0" w:space="0" w:color="000000"/>
+              </w:pBdr>
+              <w:spacing w:after="100" w:before="100" w:line="240"/>
+              <w:ind w:left="100" w:right="100" w:firstLine="0" w:firstLineChars="0"/>
+              <w:rPr>
+                <w:rFonts w:ascii="Arial" w:hAnsi="Arial" w:eastAsia="Arial" w:cs="Arial"/>
+                <w:i w:val="false"/>
+                <w:b w:val="false"/>
+                <w:u w:val="none"/>
+                <w:strike w:val="false"/>
+                <w:sz w:val="22"/>
+                <w:szCs w:val="22"/>
+                <w:color w:val="000000"/>
+              </w:rPr>
+            </w:pPr>
+            <w:r>
+              <w:rPr>
+                <w:rFonts w:ascii="Arial" w:hAnsi="Arial" w:eastAsia="Arial" w:cs="Arial"/>
+                <w:i w:val="false"/>
+                <w:b w:val="false"/>
+                <w:u w:val="none"/>
+                <w:strike w:val="false"/>
                 <w:sz w:val="22"/>
                 <w:szCs w:val="22"/>
                 <w:color w:val="000000"/>
@@ -1270,51 +1330,53 @@
         <w:trPr>
           <w:trHeight w:val="614" w:hRule="auto"/>
         </w:trPr>
-        body 9
-        <w:tc>
-          <w:tcPr>
-            <w:tcBorders>
-              <w:bottom w:val="none" w:sz="0" w:space="0" w:color="000000"/>
-              <w:top w:val="none" w:sz="0" w:space="0" w:color="000000"/>
-              <w:left w:val="none" w:sz="0" w:space="0" w:color="000000"/>
-              <w:right w:val="none" w:sz="0" w:space="0" w:color="000000"/>
-            </w:tcBorders>
-            <w:shd w:val="clear" w:color="auto" w:fill="FFFFFF"/>
-            <w:tcMar>
-              <w:top w:w="0" w:type="dxa"/>
-              <w:bottom w:w="0" w:type="dxa"/>
-              <w:left w:w="0" w:type="dxa"/>
-              <w:right w:w="0" w:type="dxa"/>
-            </w:tcMar>
-            <w:vAlign w:val="center"/>
-          </w:tcPr>
-          <w:p>
-            <w:pPr>
-              <w:jc w:val="left"/>
-              <w:pBdr>
-                <w:bottom w:val="none" w:sz="0" w:space="0" w:color="000000"/>
-                <w:top w:val="none" w:sz="0" w:space="0" w:color="000000"/>
-                <w:left w:val="none" w:sz="0" w:space="0" w:color="000000"/>
-                <w:right w:val="none" w:sz="0" w:space="0" w:color="000000"/>
-              </w:pBdr>
-              <w:spacing w:after="100" w:before="100" w:line="240"/>
-              <w:ind w:left="100" w:right="100" w:firstLine="0" w:firstLineChars="0"/>
-              <w:rPr>
-                <w:rFonts w:ascii="Arial" w:hAnsi="Arial" w:eastAsia="Arial" w:cs="Arial"/>
-                <w:i w:val="false"/>
-                <w:b w:val="false"/>
-                <w:u w:val="none"/>
-                <w:sz w:val="22"/>
-                <w:szCs w:val="22"/>
-                <w:color w:val="000000"/>
-              </w:rPr>
-            </w:pPr>
-            <w:r>
-              <w:rPr>
-                <w:rFonts w:ascii="Arial" w:hAnsi="Arial" w:eastAsia="Arial" w:cs="Arial"/>
-                <w:i w:val="false"/>
-                <w:b w:val="false"/>
-                <w:u w:val="none"/>
+        <w:tc>
+          <w:tcPr>
+            <w:tcBorders>
+              <w:bottom w:val="none" w:sz="0" w:space="0" w:color="000000"/>
+              <w:top w:val="none" w:sz="0" w:space="0" w:color="000000"/>
+              <w:left w:val="none" w:sz="0" w:space="0" w:color="000000"/>
+              <w:right w:val="none" w:sz="0" w:space="0" w:color="000000"/>
+            </w:tcBorders>
+            <w:shd w:val="clear" w:color="auto" w:fill="FFFFFF"/>
+            <w:tcMar>
+              <w:top w:w="0" w:type="dxa"/>
+              <w:bottom w:w="0" w:type="dxa"/>
+              <w:left w:w="0" w:type="dxa"/>
+              <w:right w:w="0" w:type="dxa"/>
+            </w:tcMar>
+            <w:vAlign w:val="center"/>
+          </w:tcPr>
+          <w:p>
+            <w:pPr>
+              <w:pStyle w:val="Normal"/>
+              <w:jc w:val="left"/>
+              <w:pBdr>
+                <w:bottom w:val="none" w:sz="0" w:space="0" w:color="000000"/>
+                <w:top w:val="none" w:sz="0" w:space="0" w:color="000000"/>
+                <w:left w:val="none" w:sz="0" w:space="0" w:color="000000"/>
+                <w:right w:val="none" w:sz="0" w:space="0" w:color="000000"/>
+              </w:pBdr>
+              <w:spacing w:after="100" w:before="100" w:line="240"/>
+              <w:ind w:left="100" w:right="100" w:firstLine="0" w:firstLineChars="0"/>
+              <w:rPr>
+                <w:rFonts w:ascii="Arial" w:hAnsi="Arial" w:eastAsia="Arial" w:cs="Arial"/>
+                <w:i w:val="false"/>
+                <w:b w:val="false"/>
+                <w:u w:val="none"/>
+                <w:strike w:val="false"/>
+                <w:sz w:val="22"/>
+                <w:szCs w:val="22"/>
+                <w:color w:val="000000"/>
+              </w:rPr>
+            </w:pPr>
+            <w:r>
+              <w:rPr>
+                <w:rFonts w:ascii="Arial" w:hAnsi="Arial" w:eastAsia="Arial" w:cs="Arial"/>
+                <w:i w:val="false"/>
+                <w:b w:val="false"/>
+                <w:u w:val="none"/>
+                <w:strike w:val="false"/>
                 <w:sz w:val="22"/>
                 <w:szCs w:val="22"/>
                 <w:color w:val="000000"/>
@@ -1342,31 +1404,34 @@
           </w:tcPr>
           <w:p>
             <w:pPr>
-              <w:jc w:val="left"/>
-              <w:pBdr>
-                <w:bottom w:val="none" w:sz="0" w:space="0" w:color="000000"/>
-                <w:top w:val="none" w:sz="0" w:space="0" w:color="000000"/>
-                <w:left w:val="none" w:sz="0" w:space="0" w:color="000000"/>
-                <w:right w:val="none" w:sz="0" w:space="0" w:color="000000"/>
-              </w:pBdr>
-              <w:spacing w:after="100" w:before="100" w:line="240"/>
-              <w:ind w:left="100" w:right="100" w:firstLine="0" w:firstLineChars="0"/>
-              <w:rPr>
-                <w:rFonts w:ascii="Arial" w:hAnsi="Arial" w:eastAsia="Arial" w:cs="Arial"/>
-                <w:i w:val="false"/>
-                <w:b w:val="false"/>
-                <w:u w:val="none"/>
-                <w:sz w:val="22"/>
-                <w:szCs w:val="22"/>
-                <w:color w:val="000000"/>
-              </w:rPr>
-            </w:pPr>
-            <w:r>
-              <w:rPr>
-                <w:rFonts w:ascii="Arial" w:hAnsi="Arial" w:eastAsia="Arial" w:cs="Arial"/>
-                <w:i w:val="false"/>
-                <w:b w:val="false"/>
-                <w:u w:val="none"/>
+              <w:pStyle w:val="Normal"/>
+              <w:jc w:val="left"/>
+              <w:pBdr>
+                <w:bottom w:val="none" w:sz="0" w:space="0" w:color="000000"/>
+                <w:top w:val="none" w:sz="0" w:space="0" w:color="000000"/>
+                <w:left w:val="none" w:sz="0" w:space="0" w:color="000000"/>
+                <w:right w:val="none" w:sz="0" w:space="0" w:color="000000"/>
+              </w:pBdr>
+              <w:spacing w:after="100" w:before="100" w:line="240"/>
+              <w:ind w:left="100" w:right="100" w:firstLine="0" w:firstLineChars="0"/>
+              <w:rPr>
+                <w:rFonts w:ascii="Arial" w:hAnsi="Arial" w:eastAsia="Arial" w:cs="Arial"/>
+                <w:i w:val="false"/>
+                <w:b w:val="false"/>
+                <w:u w:val="none"/>
+                <w:strike w:val="false"/>
+                <w:sz w:val="22"/>
+                <w:szCs w:val="22"/>
+                <w:color w:val="000000"/>
+              </w:rPr>
+            </w:pPr>
+            <w:r>
+              <w:rPr>
+                <w:rFonts w:ascii="Arial" w:hAnsi="Arial" w:eastAsia="Arial" w:cs="Arial"/>
+                <w:i w:val="false"/>
+                <w:b w:val="false"/>
+                <w:u w:val="none"/>
+                <w:strike w:val="false"/>
                 <w:sz w:val="22"/>
                 <w:szCs w:val="22"/>
                 <w:color w:val="000000"/>
@@ -1394,31 +1459,34 @@
           </w:tcPr>
           <w:p>
             <w:pPr>
-              <w:jc w:val="left"/>
-              <w:pBdr>
-                <w:bottom w:val="none" w:sz="0" w:space="0" w:color="000000"/>
-                <w:top w:val="none" w:sz="0" w:space="0" w:color="000000"/>
-                <w:left w:val="none" w:sz="0" w:space="0" w:color="000000"/>
-                <w:right w:val="none" w:sz="0" w:space="0" w:color="000000"/>
-              </w:pBdr>
-              <w:spacing w:after="100" w:before="100" w:line="240"/>
-              <w:ind w:left="100" w:right="100" w:firstLine="0" w:firstLineChars="0"/>
-              <w:rPr>
-                <w:rFonts w:ascii="Arial" w:hAnsi="Arial" w:eastAsia="Arial" w:cs="Arial"/>
-                <w:i w:val="false"/>
-                <w:b w:val="false"/>
-                <w:u w:val="none"/>
-                <w:sz w:val="22"/>
-                <w:szCs w:val="22"/>
-                <w:color w:val="000000"/>
-              </w:rPr>
-            </w:pPr>
-            <w:r>
-              <w:rPr>
-                <w:rFonts w:ascii="Arial" w:hAnsi="Arial" w:eastAsia="Arial" w:cs="Arial"/>
-                <w:i w:val="false"/>
-                <w:b w:val="false"/>
-                <w:u w:val="none"/>
+              <w:pStyle w:val="Normal"/>
+              <w:jc w:val="left"/>
+              <w:pBdr>
+                <w:bottom w:val="none" w:sz="0" w:space="0" w:color="000000"/>
+                <w:top w:val="none" w:sz="0" w:space="0" w:color="000000"/>
+                <w:left w:val="none" w:sz="0" w:space="0" w:color="000000"/>
+                <w:right w:val="none" w:sz="0" w:space="0" w:color="000000"/>
+              </w:pBdr>
+              <w:spacing w:after="100" w:before="100" w:line="240"/>
+              <w:ind w:left="100" w:right="100" w:firstLine="0" w:firstLineChars="0"/>
+              <w:rPr>
+                <w:rFonts w:ascii="Arial" w:hAnsi="Arial" w:eastAsia="Arial" w:cs="Arial"/>
+                <w:i w:val="false"/>
+                <w:b w:val="false"/>
+                <w:u w:val="none"/>
+                <w:strike w:val="false"/>
+                <w:sz w:val="22"/>
+                <w:szCs w:val="22"/>
+                <w:color w:val="000000"/>
+              </w:rPr>
+            </w:pPr>
+            <w:r>
+              <w:rPr>
+                <w:rFonts w:ascii="Arial" w:hAnsi="Arial" w:eastAsia="Arial" w:cs="Arial"/>
+                <w:i w:val="false"/>
+                <w:b w:val="false"/>
+                <w:u w:val="none"/>
+                <w:strike w:val="false"/>
                 <w:sz w:val="22"/>
                 <w:szCs w:val="22"/>
                 <w:color w:val="000000"/>
@@ -1432,51 +1500,53 @@
         <w:trPr>
           <w:trHeight w:val="574" w:hRule="auto"/>
         </w:trPr>
-        body10
-        <w:tc>
-          <w:tcPr>
-            <w:tcBorders>
-              <w:bottom w:val="none" w:sz="0" w:space="0" w:color="000000"/>
-              <w:top w:val="none" w:sz="0" w:space="0" w:color="000000"/>
-              <w:left w:val="none" w:sz="0" w:space="0" w:color="000000"/>
-              <w:right w:val="none" w:sz="0" w:space="0" w:color="000000"/>
-            </w:tcBorders>
-            <w:shd w:val="clear" w:color="auto" w:fill="FFFFFF"/>
-            <w:tcMar>
-              <w:top w:w="0" w:type="dxa"/>
-              <w:bottom w:w="0" w:type="dxa"/>
-              <w:left w:w="0" w:type="dxa"/>
-              <w:right w:w="0" w:type="dxa"/>
-            </w:tcMar>
-            <w:vAlign w:val="center"/>
-          </w:tcPr>
-          <w:p>
-            <w:pPr>
-              <w:jc w:val="left"/>
-              <w:pBdr>
-                <w:bottom w:val="none" w:sz="0" w:space="0" w:color="000000"/>
-                <w:top w:val="none" w:sz="0" w:space="0" w:color="000000"/>
-                <w:left w:val="none" w:sz="0" w:space="0" w:color="000000"/>
-                <w:right w:val="none" w:sz="0" w:space="0" w:color="000000"/>
-              </w:pBdr>
-              <w:spacing w:after="100" w:before="100" w:line="240"/>
-              <w:ind w:left="100" w:right="100" w:firstLine="0" w:firstLineChars="0"/>
-              <w:rPr>
-                <w:rFonts w:ascii="Arial" w:hAnsi="Arial" w:eastAsia="Arial" w:cs="Arial"/>
-                <w:i w:val="false"/>
-                <w:b w:val="false"/>
-                <w:u w:val="none"/>
-                <w:sz w:val="22"/>
-                <w:szCs w:val="22"/>
-                <w:color w:val="000000"/>
-              </w:rPr>
-            </w:pPr>
-            <w:r>
-              <w:rPr>
-                <w:rFonts w:ascii="Arial" w:hAnsi="Arial" w:eastAsia="Arial" w:cs="Arial"/>
-                <w:i w:val="false"/>
-                <w:b w:val="false"/>
-                <w:u w:val="none"/>
+        <w:tc>
+          <w:tcPr>
+            <w:tcBorders>
+              <w:bottom w:val="none" w:sz="0" w:space="0" w:color="000000"/>
+              <w:top w:val="none" w:sz="0" w:space="0" w:color="000000"/>
+              <w:left w:val="none" w:sz="0" w:space="0" w:color="000000"/>
+              <w:right w:val="none" w:sz="0" w:space="0" w:color="000000"/>
+            </w:tcBorders>
+            <w:shd w:val="clear" w:color="auto" w:fill="FFFFFF"/>
+            <w:tcMar>
+              <w:top w:w="0" w:type="dxa"/>
+              <w:bottom w:w="0" w:type="dxa"/>
+              <w:left w:w="0" w:type="dxa"/>
+              <w:right w:w="0" w:type="dxa"/>
+            </w:tcMar>
+            <w:vAlign w:val="center"/>
+          </w:tcPr>
+          <w:p>
+            <w:pPr>
+              <w:pStyle w:val="Normal"/>
+              <w:jc w:val="left"/>
+              <w:pBdr>
+                <w:bottom w:val="none" w:sz="0" w:space="0" w:color="000000"/>
+                <w:top w:val="none" w:sz="0" w:space="0" w:color="000000"/>
+                <w:left w:val="none" w:sz="0" w:space="0" w:color="000000"/>
+                <w:right w:val="none" w:sz="0" w:space="0" w:color="000000"/>
+              </w:pBdr>
+              <w:spacing w:after="100" w:before="100" w:line="240"/>
+              <w:ind w:left="100" w:right="100" w:firstLine="0" w:firstLineChars="0"/>
+              <w:rPr>
+                <w:rFonts w:ascii="Arial" w:hAnsi="Arial" w:eastAsia="Arial" w:cs="Arial"/>
+                <w:i w:val="false"/>
+                <w:b w:val="false"/>
+                <w:u w:val="none"/>
+                <w:strike w:val="false"/>
+                <w:sz w:val="22"/>
+                <w:szCs w:val="22"/>
+                <w:color w:val="000000"/>
+              </w:rPr>
+            </w:pPr>
+            <w:r>
+              <w:rPr>
+                <w:rFonts w:ascii="Arial" w:hAnsi="Arial" w:eastAsia="Arial" w:cs="Arial"/>
+                <w:i w:val="false"/>
+                <w:b w:val="false"/>
+                <w:u w:val="none"/>
+                <w:strike w:val="false"/>
                 <w:sz w:val="22"/>
                 <w:szCs w:val="22"/>
                 <w:color w:val="000000"/>
@@ -1504,31 +1574,34 @@
           </w:tcPr>
           <w:p>
             <w:pPr>
-              <w:jc w:val="left"/>
-              <w:pBdr>
-                <w:bottom w:val="none" w:sz="0" w:space="0" w:color="000000"/>
-                <w:top w:val="none" w:sz="0" w:space="0" w:color="000000"/>
-                <w:left w:val="none" w:sz="0" w:space="0" w:color="000000"/>
-                <w:right w:val="none" w:sz="0" w:space="0" w:color="000000"/>
-              </w:pBdr>
-              <w:spacing w:after="100" w:before="100" w:line="240"/>
-              <w:ind w:left="100" w:right="100" w:firstLine="0" w:firstLineChars="0"/>
-              <w:rPr>
-                <w:rFonts w:ascii="Arial" w:hAnsi="Arial" w:eastAsia="Arial" w:cs="Arial"/>
-                <w:i w:val="false"/>
-                <w:b w:val="false"/>
-                <w:u w:val="none"/>
-                <w:sz w:val="22"/>
-                <w:szCs w:val="22"/>
-                <w:color w:val="000000"/>
-              </w:rPr>
-            </w:pPr>
-            <w:r>
-              <w:rPr>
-                <w:rFonts w:ascii="Arial" w:hAnsi="Arial" w:eastAsia="Arial" w:cs="Arial"/>
-                <w:i w:val="false"/>
-                <w:b w:val="false"/>
-                <w:u w:val="none"/>
+              <w:pStyle w:val="Normal"/>
+              <w:jc w:val="left"/>
+              <w:pBdr>
+                <w:bottom w:val="none" w:sz="0" w:space="0" w:color="000000"/>
+                <w:top w:val="none" w:sz="0" w:space="0" w:color="000000"/>
+                <w:left w:val="none" w:sz="0" w:space="0" w:color="000000"/>
+                <w:right w:val="none" w:sz="0" w:space="0" w:color="000000"/>
+              </w:pBdr>
+              <w:spacing w:after="100" w:before="100" w:line="240"/>
+              <w:ind w:left="100" w:right="100" w:firstLine="0" w:firstLineChars="0"/>
+              <w:rPr>
+                <w:rFonts w:ascii="Arial" w:hAnsi="Arial" w:eastAsia="Arial" w:cs="Arial"/>
+                <w:i w:val="false"/>
+                <w:b w:val="false"/>
+                <w:u w:val="none"/>
+                <w:strike w:val="false"/>
+                <w:sz w:val="22"/>
+                <w:szCs w:val="22"/>
+                <w:color w:val="000000"/>
+              </w:rPr>
+            </w:pPr>
+            <w:r>
+              <w:rPr>
+                <w:rFonts w:ascii="Arial" w:hAnsi="Arial" w:eastAsia="Arial" w:cs="Arial"/>
+                <w:i w:val="false"/>
+                <w:b w:val="false"/>
+                <w:u w:val="none"/>
+                <w:strike w:val="false"/>
                 <w:sz w:val="22"/>
                 <w:szCs w:val="22"/>
                 <w:color w:val="000000"/>
@@ -1556,31 +1629,34 @@
           </w:tcPr>
           <w:p>
             <w:pPr>
-              <w:jc w:val="left"/>
-              <w:pBdr>
-                <w:bottom w:val="none" w:sz="0" w:space="0" w:color="000000"/>
-                <w:top w:val="none" w:sz="0" w:space="0" w:color="000000"/>
-                <w:left w:val="none" w:sz="0" w:space="0" w:color="000000"/>
-                <w:right w:val="none" w:sz="0" w:space="0" w:color="000000"/>
-              </w:pBdr>
-              <w:spacing w:after="100" w:before="100" w:line="240"/>
-              <w:ind w:left="100" w:right="100" w:firstLine="0" w:firstLineChars="0"/>
-              <w:rPr>
-                <w:rFonts w:ascii="Arial" w:hAnsi="Arial" w:eastAsia="Arial" w:cs="Arial"/>
-                <w:i w:val="false"/>
-                <w:b w:val="false"/>
-                <w:u w:val="none"/>
-                <w:sz w:val="22"/>
-                <w:szCs w:val="22"/>
-                <w:color w:val="000000"/>
-              </w:rPr>
-            </w:pPr>
-            <w:r>
-              <w:rPr>
-                <w:rFonts w:ascii="Arial" w:hAnsi="Arial" w:eastAsia="Arial" w:cs="Arial"/>
-                <w:i w:val="false"/>
-                <w:b w:val="false"/>
-                <w:u w:val="none"/>
+              <w:pStyle w:val="Normal"/>
+              <w:jc w:val="left"/>
+              <w:pBdr>
+                <w:bottom w:val="none" w:sz="0" w:space="0" w:color="000000"/>
+                <w:top w:val="none" w:sz="0" w:space="0" w:color="000000"/>
+                <w:left w:val="none" w:sz="0" w:space="0" w:color="000000"/>
+                <w:right w:val="none" w:sz="0" w:space="0" w:color="000000"/>
+              </w:pBdr>
+              <w:spacing w:after="100" w:before="100" w:line="240"/>
+              <w:ind w:left="100" w:right="100" w:firstLine="0" w:firstLineChars="0"/>
+              <w:rPr>
+                <w:rFonts w:ascii="Arial" w:hAnsi="Arial" w:eastAsia="Arial" w:cs="Arial"/>
+                <w:i w:val="false"/>
+                <w:b w:val="false"/>
+                <w:u w:val="none"/>
+                <w:strike w:val="false"/>
+                <w:sz w:val="22"/>
+                <w:szCs w:val="22"/>
+                <w:color w:val="000000"/>
+              </w:rPr>
+            </w:pPr>
+            <w:r>
+              <w:rPr>
+                <w:rFonts w:ascii="Arial" w:hAnsi="Arial" w:eastAsia="Arial" w:cs="Arial"/>
+                <w:i w:val="false"/>
+                <w:b w:val="false"/>
+                <w:u w:val="none"/>
+                <w:strike w:val="false"/>
                 <w:sz w:val="22"/>
                 <w:szCs w:val="22"/>
                 <w:color w:val="000000"/>
@@ -1594,7 +1670,6 @@
         <w:trPr>
           <w:trHeight w:val="574" w:hRule="auto"/>
         </w:trPr>
-        body11
         <w:tc>
           <w:tcPr>
             <w:gridSpan w:val="3"/>
@@ -1615,6 +1690,7 @@
           </w:tcPr>
           <w:p>
             <w:pPr>
+              <w:pStyle w:val="Normal"/>
               <w:jc w:val="left"/>
               <w:pBdr>
                 <w:bottom w:val="none" w:sz="0" w:space="0" w:color="000000"/>
@@ -1629,6 +1705,7 @@
                 <w:i w:val="false"/>
                 <w:b w:val="true"/>
                 <w:u w:val="none"/>
+                <w:strike w:val="false"/>
                 <w:sz w:val="22"/>
                 <w:szCs w:val="22"/>
                 <w:color w:val="000000"/>
@@ -1640,6 +1717,7 @@
                 <w:i w:val="false"/>
                 <w:b w:val="true"/>
                 <w:u w:val="none"/>
+                <w:strike w:val="false"/>
                 <w:sz w:val="22"/>
                 <w:szCs w:val="22"/>
                 <w:color w:val="000000"/>
@@ -1653,51 +1731,53 @@
         <w:trPr>
           <w:trHeight w:val="614" w:hRule="auto"/>
         </w:trPr>
-        body12
-        <w:tc>
-          <w:tcPr>
-            <w:tcBorders>
-              <w:bottom w:val="none" w:sz="0" w:space="0" w:color="000000"/>
-              <w:top w:val="none" w:sz="0" w:space="0" w:color="000000"/>
-              <w:left w:val="none" w:sz="0" w:space="0" w:color="000000"/>
-              <w:right w:val="none" w:sz="0" w:space="0" w:color="000000"/>
-            </w:tcBorders>
-            <w:shd w:val="clear" w:color="auto" w:fill="FFFFFF"/>
-            <w:tcMar>
-              <w:top w:w="0" w:type="dxa"/>
-              <w:bottom w:w="0" w:type="dxa"/>
-              <w:left w:w="0" w:type="dxa"/>
-              <w:right w:w="0" w:type="dxa"/>
-            </w:tcMar>
-            <w:vAlign w:val="center"/>
-          </w:tcPr>
-          <w:p>
-            <w:pPr>
-              <w:jc w:val="left"/>
-              <w:pBdr>
-                <w:bottom w:val="none" w:sz="0" w:space="0" w:color="000000"/>
-                <w:top w:val="none" w:sz="0" w:space="0" w:color="000000"/>
-                <w:left w:val="none" w:sz="0" w:space="0" w:color="000000"/>
-                <w:right w:val="none" w:sz="0" w:space="0" w:color="000000"/>
-              </w:pBdr>
-              <w:spacing w:after="100" w:before="100" w:line="240"/>
-              <w:ind w:left="100" w:right="100" w:firstLine="0" w:firstLineChars="0"/>
-              <w:rPr>
-                <w:rFonts w:ascii="Arial" w:hAnsi="Arial" w:eastAsia="Arial" w:cs="Arial"/>
-                <w:i w:val="false"/>
-                <w:b w:val="false"/>
-                <w:u w:val="none"/>
-                <w:sz w:val="22"/>
-                <w:szCs w:val="22"/>
-                <w:color w:val="000000"/>
-              </w:rPr>
-            </w:pPr>
-            <w:r>
-              <w:rPr>
-                <w:rFonts w:ascii="Arial" w:hAnsi="Arial" w:eastAsia="Arial" w:cs="Arial"/>
-                <w:i w:val="false"/>
-                <w:b w:val="false"/>
-                <w:u w:val="none"/>
+        <w:tc>
+          <w:tcPr>
+            <w:tcBorders>
+              <w:bottom w:val="none" w:sz="0" w:space="0" w:color="000000"/>
+              <w:top w:val="none" w:sz="0" w:space="0" w:color="000000"/>
+              <w:left w:val="none" w:sz="0" w:space="0" w:color="000000"/>
+              <w:right w:val="none" w:sz="0" w:space="0" w:color="000000"/>
+            </w:tcBorders>
+            <w:shd w:val="clear" w:color="auto" w:fill="FFFFFF"/>
+            <w:tcMar>
+              <w:top w:w="0" w:type="dxa"/>
+              <w:bottom w:w="0" w:type="dxa"/>
+              <w:left w:w="0" w:type="dxa"/>
+              <w:right w:w="0" w:type="dxa"/>
+            </w:tcMar>
+            <w:vAlign w:val="center"/>
+          </w:tcPr>
+          <w:p>
+            <w:pPr>
+              <w:pStyle w:val="Normal"/>
+              <w:jc w:val="left"/>
+              <w:pBdr>
+                <w:bottom w:val="none" w:sz="0" w:space="0" w:color="000000"/>
+                <w:top w:val="none" w:sz="0" w:space="0" w:color="000000"/>
+                <w:left w:val="none" w:sz="0" w:space="0" w:color="000000"/>
+                <w:right w:val="none" w:sz="0" w:space="0" w:color="000000"/>
+              </w:pBdr>
+              <w:spacing w:after="100" w:before="100" w:line="240"/>
+              <w:ind w:left="100" w:right="100" w:firstLine="0" w:firstLineChars="0"/>
+              <w:rPr>
+                <w:rFonts w:ascii="Arial" w:hAnsi="Arial" w:eastAsia="Arial" w:cs="Arial"/>
+                <w:i w:val="false"/>
+                <w:b w:val="false"/>
+                <w:u w:val="none"/>
+                <w:strike w:val="false"/>
+                <w:sz w:val="22"/>
+                <w:szCs w:val="22"/>
+                <w:color w:val="000000"/>
+              </w:rPr>
+            </w:pPr>
+            <w:r>
+              <w:rPr>
+                <w:rFonts w:ascii="Arial" w:hAnsi="Arial" w:eastAsia="Arial" w:cs="Arial"/>
+                <w:i w:val="false"/>
+                <w:b w:val="false"/>
+                <w:u w:val="none"/>
+                <w:strike w:val="false"/>
                 <w:sz w:val="22"/>
                 <w:szCs w:val="22"/>
                 <w:color w:val="000000"/>
@@ -1725,31 +1805,34 @@
           </w:tcPr>
           <w:p>
             <w:pPr>
-              <w:jc w:val="left"/>
-              <w:pBdr>
-                <w:bottom w:val="none" w:sz="0" w:space="0" w:color="000000"/>
-                <w:top w:val="none" w:sz="0" w:space="0" w:color="000000"/>
-                <w:left w:val="none" w:sz="0" w:space="0" w:color="000000"/>
-                <w:right w:val="none" w:sz="0" w:space="0" w:color="000000"/>
-              </w:pBdr>
-              <w:spacing w:after="100" w:before="100" w:line="240"/>
-              <w:ind w:left="100" w:right="100" w:firstLine="0" w:firstLineChars="0"/>
-              <w:rPr>
-                <w:rFonts w:ascii="Arial" w:hAnsi="Arial" w:eastAsia="Arial" w:cs="Arial"/>
-                <w:i w:val="false"/>
-                <w:b w:val="false"/>
-                <w:u w:val="none"/>
-                <w:sz w:val="22"/>
-                <w:szCs w:val="22"/>
-                <w:color w:val="000000"/>
-              </w:rPr>
-            </w:pPr>
-            <w:r>
-              <w:rPr>
-                <w:rFonts w:ascii="Arial" w:hAnsi="Arial" w:eastAsia="Arial" w:cs="Arial"/>
-                <w:i w:val="false"/>
-                <w:b w:val="false"/>
-                <w:u w:val="none"/>
+              <w:pStyle w:val="Normal"/>
+              <w:jc w:val="left"/>
+              <w:pBdr>
+                <w:bottom w:val="none" w:sz="0" w:space="0" w:color="000000"/>
+                <w:top w:val="none" w:sz="0" w:space="0" w:color="000000"/>
+                <w:left w:val="none" w:sz="0" w:space="0" w:color="000000"/>
+                <w:right w:val="none" w:sz="0" w:space="0" w:color="000000"/>
+              </w:pBdr>
+              <w:spacing w:after="100" w:before="100" w:line="240"/>
+              <w:ind w:left="100" w:right="100" w:firstLine="0" w:firstLineChars="0"/>
+              <w:rPr>
+                <w:rFonts w:ascii="Arial" w:hAnsi="Arial" w:eastAsia="Arial" w:cs="Arial"/>
+                <w:i w:val="false"/>
+                <w:b w:val="false"/>
+                <w:u w:val="none"/>
+                <w:strike w:val="false"/>
+                <w:sz w:val="22"/>
+                <w:szCs w:val="22"/>
+                <w:color w:val="000000"/>
+              </w:rPr>
+            </w:pPr>
+            <w:r>
+              <w:rPr>
+                <w:rFonts w:ascii="Arial" w:hAnsi="Arial" w:eastAsia="Arial" w:cs="Arial"/>
+                <w:i w:val="false"/>
+                <w:b w:val="false"/>
+                <w:u w:val="none"/>
+                <w:strike w:val="false"/>
                 <w:sz w:val="22"/>
                 <w:szCs w:val="22"/>
                 <w:color w:val="000000"/>
@@ -1777,31 +1860,34 @@
           </w:tcPr>
           <w:p>
             <w:pPr>
-              <w:jc w:val="left"/>
-              <w:pBdr>
-                <w:bottom w:val="none" w:sz="0" w:space="0" w:color="000000"/>
-                <w:top w:val="none" w:sz="0" w:space="0" w:color="000000"/>
-                <w:left w:val="none" w:sz="0" w:space="0" w:color="000000"/>
-                <w:right w:val="none" w:sz="0" w:space="0" w:color="000000"/>
-              </w:pBdr>
-              <w:spacing w:after="100" w:before="100" w:line="240"/>
-              <w:ind w:left="100" w:right="100" w:firstLine="0" w:firstLineChars="0"/>
-              <w:rPr>
-                <w:rFonts w:ascii="Arial" w:hAnsi="Arial" w:eastAsia="Arial" w:cs="Arial"/>
-                <w:i w:val="false"/>
-                <w:b w:val="false"/>
-                <w:u w:val="none"/>
-                <w:sz w:val="22"/>
-                <w:szCs w:val="22"/>
-                <w:color w:val="000000"/>
-              </w:rPr>
-            </w:pPr>
-            <w:r>
-              <w:rPr>
-                <w:rFonts w:ascii="Arial" w:hAnsi="Arial" w:eastAsia="Arial" w:cs="Arial"/>
-                <w:i w:val="false"/>
-                <w:b w:val="false"/>
-                <w:u w:val="none"/>
+              <w:pStyle w:val="Normal"/>
+              <w:jc w:val="left"/>
+              <w:pBdr>
+                <w:bottom w:val="none" w:sz="0" w:space="0" w:color="000000"/>
+                <w:top w:val="none" w:sz="0" w:space="0" w:color="000000"/>
+                <w:left w:val="none" w:sz="0" w:space="0" w:color="000000"/>
+                <w:right w:val="none" w:sz="0" w:space="0" w:color="000000"/>
+              </w:pBdr>
+              <w:spacing w:after="100" w:before="100" w:line="240"/>
+              <w:ind w:left="100" w:right="100" w:firstLine="0" w:firstLineChars="0"/>
+              <w:rPr>
+                <w:rFonts w:ascii="Arial" w:hAnsi="Arial" w:eastAsia="Arial" w:cs="Arial"/>
+                <w:i w:val="false"/>
+                <w:b w:val="false"/>
+                <w:u w:val="none"/>
+                <w:strike w:val="false"/>
+                <w:sz w:val="22"/>
+                <w:szCs w:val="22"/>
+                <w:color w:val="000000"/>
+              </w:rPr>
+            </w:pPr>
+            <w:r>
+              <w:rPr>
+                <w:rFonts w:ascii="Arial" w:hAnsi="Arial" w:eastAsia="Arial" w:cs="Arial"/>
+                <w:i w:val="false"/>
+                <w:b w:val="false"/>
+                <w:u w:val="none"/>
+                <w:strike w:val="false"/>
                 <w:sz w:val="22"/>
                 <w:szCs w:val="22"/>
                 <w:color w:val="000000"/>
@@ -1815,51 +1901,53 @@
         <w:trPr>
           <w:trHeight w:val="617" w:hRule="auto"/>
         </w:trPr>
-        body13
-        <w:tc>
-          <w:tcPr>
-            <w:tcBorders>
-              <w:bottom w:val="none" w:sz="0" w:space="0" w:color="000000"/>
-              <w:top w:val="none" w:sz="0" w:space="0" w:color="000000"/>
-              <w:left w:val="none" w:sz="0" w:space="0" w:color="000000"/>
-              <w:right w:val="none" w:sz="0" w:space="0" w:color="000000"/>
-            </w:tcBorders>
-            <w:shd w:val="clear" w:color="auto" w:fill="FFFFFF"/>
-            <w:tcMar>
-              <w:top w:w="0" w:type="dxa"/>
-              <w:bottom w:w="0" w:type="dxa"/>
-              <w:left w:w="0" w:type="dxa"/>
-              <w:right w:w="0" w:type="dxa"/>
-            </w:tcMar>
-            <w:vAlign w:val="center"/>
-          </w:tcPr>
-          <w:p>
-            <w:pPr>
-              <w:jc w:val="left"/>
-              <w:pBdr>
-                <w:bottom w:val="none" w:sz="0" w:space="0" w:color="000000"/>
-                <w:top w:val="none" w:sz="0" w:space="0" w:color="000000"/>
-                <w:left w:val="none" w:sz="0" w:space="0" w:color="000000"/>
-                <w:right w:val="none" w:sz="0" w:space="0" w:color="000000"/>
-              </w:pBdr>
-              <w:spacing w:after="100" w:before="100" w:line="240"/>
-              <w:ind w:left="100" w:right="100" w:firstLine="0" w:firstLineChars="0"/>
-              <w:rPr>
-                <w:rFonts w:ascii="Arial" w:hAnsi="Arial" w:eastAsia="Arial" w:cs="Arial"/>
-                <w:i w:val="false"/>
-                <w:b w:val="false"/>
-                <w:u w:val="none"/>
-                <w:sz w:val="22"/>
-                <w:szCs w:val="22"/>
-                <w:color w:val="000000"/>
-              </w:rPr>
-            </w:pPr>
-            <w:r>
-              <w:rPr>
-                <w:rFonts w:ascii="Arial" w:hAnsi="Arial" w:eastAsia="Arial" w:cs="Arial"/>
-                <w:i w:val="false"/>
-                <w:b w:val="false"/>
-                <w:u w:val="none"/>
+        <w:tc>
+          <w:tcPr>
+            <w:tcBorders>
+              <w:bottom w:val="none" w:sz="0" w:space="0" w:color="000000"/>
+              <w:top w:val="none" w:sz="0" w:space="0" w:color="000000"/>
+              <w:left w:val="none" w:sz="0" w:space="0" w:color="000000"/>
+              <w:right w:val="none" w:sz="0" w:space="0" w:color="000000"/>
+            </w:tcBorders>
+            <w:shd w:val="clear" w:color="auto" w:fill="FFFFFF"/>
+            <w:tcMar>
+              <w:top w:w="0" w:type="dxa"/>
+              <w:bottom w:w="0" w:type="dxa"/>
+              <w:left w:w="0" w:type="dxa"/>
+              <w:right w:w="0" w:type="dxa"/>
+            </w:tcMar>
+            <w:vAlign w:val="center"/>
+          </w:tcPr>
+          <w:p>
+            <w:pPr>
+              <w:pStyle w:val="Normal"/>
+              <w:jc w:val="left"/>
+              <w:pBdr>
+                <w:bottom w:val="none" w:sz="0" w:space="0" w:color="000000"/>
+                <w:top w:val="none" w:sz="0" w:space="0" w:color="000000"/>
+                <w:left w:val="none" w:sz="0" w:space="0" w:color="000000"/>
+                <w:right w:val="none" w:sz="0" w:space="0" w:color="000000"/>
+              </w:pBdr>
+              <w:spacing w:after="100" w:before="100" w:line="240"/>
+              <w:ind w:left="100" w:right="100" w:firstLine="0" w:firstLineChars="0"/>
+              <w:rPr>
+                <w:rFonts w:ascii="Arial" w:hAnsi="Arial" w:eastAsia="Arial" w:cs="Arial"/>
+                <w:i w:val="false"/>
+                <w:b w:val="false"/>
+                <w:u w:val="none"/>
+                <w:strike w:val="false"/>
+                <w:sz w:val="22"/>
+                <w:szCs w:val="22"/>
+                <w:color w:val="000000"/>
+              </w:rPr>
+            </w:pPr>
+            <w:r>
+              <w:rPr>
+                <w:rFonts w:ascii="Arial" w:hAnsi="Arial" w:eastAsia="Arial" w:cs="Arial"/>
+                <w:i w:val="false"/>
+                <w:b w:val="false"/>
+                <w:u w:val="none"/>
+                <w:strike w:val="false"/>
                 <w:sz w:val="22"/>
                 <w:szCs w:val="22"/>
                 <w:color w:val="000000"/>
@@ -1887,31 +1975,34 @@
           </w:tcPr>
           <w:p>
             <w:pPr>
-              <w:jc w:val="left"/>
-              <w:pBdr>
-                <w:bottom w:val="none" w:sz="0" w:space="0" w:color="000000"/>
-                <w:top w:val="none" w:sz="0" w:space="0" w:color="000000"/>
-                <w:left w:val="none" w:sz="0" w:space="0" w:color="000000"/>
-                <w:right w:val="none" w:sz="0" w:space="0" w:color="000000"/>
-              </w:pBdr>
-              <w:spacing w:after="100" w:before="100" w:line="240"/>
-              <w:ind w:left="100" w:right="100" w:firstLine="0" w:firstLineChars="0"/>
-              <w:rPr>
-                <w:rFonts w:ascii="Arial" w:hAnsi="Arial" w:eastAsia="Arial" w:cs="Arial"/>
-                <w:i w:val="false"/>
-                <w:b w:val="false"/>
-                <w:u w:val="none"/>
-                <w:sz w:val="22"/>
-                <w:szCs w:val="22"/>
-                <w:color w:val="000000"/>
-              </w:rPr>
-            </w:pPr>
-            <w:r>
-              <w:rPr>
-                <w:rFonts w:ascii="Arial" w:hAnsi="Arial" w:eastAsia="Arial" w:cs="Arial"/>
-                <w:i w:val="false"/>
-                <w:b w:val="false"/>
-                <w:u w:val="none"/>
+              <w:pStyle w:val="Normal"/>
+              <w:jc w:val="left"/>
+              <w:pBdr>
+                <w:bottom w:val="none" w:sz="0" w:space="0" w:color="000000"/>
+                <w:top w:val="none" w:sz="0" w:space="0" w:color="000000"/>
+                <w:left w:val="none" w:sz="0" w:space="0" w:color="000000"/>
+                <w:right w:val="none" w:sz="0" w:space="0" w:color="000000"/>
+              </w:pBdr>
+              <w:spacing w:after="100" w:before="100" w:line="240"/>
+              <w:ind w:left="100" w:right="100" w:firstLine="0" w:firstLineChars="0"/>
+              <w:rPr>
+                <w:rFonts w:ascii="Arial" w:hAnsi="Arial" w:eastAsia="Arial" w:cs="Arial"/>
+                <w:i w:val="false"/>
+                <w:b w:val="false"/>
+                <w:u w:val="none"/>
+                <w:strike w:val="false"/>
+                <w:sz w:val="22"/>
+                <w:szCs w:val="22"/>
+                <w:color w:val="000000"/>
+              </w:rPr>
+            </w:pPr>
+            <w:r>
+              <w:rPr>
+                <w:rFonts w:ascii="Arial" w:hAnsi="Arial" w:eastAsia="Arial" w:cs="Arial"/>
+                <w:i w:val="false"/>
+                <w:b w:val="false"/>
+                <w:u w:val="none"/>
+                <w:strike w:val="false"/>
                 <w:sz w:val="22"/>
                 <w:szCs w:val="22"/>
                 <w:color w:val="000000"/>
@@ -1939,31 +2030,34 @@
           </w:tcPr>
           <w:p>
             <w:pPr>
-              <w:jc w:val="left"/>
-              <w:pBdr>
-                <w:bottom w:val="none" w:sz="0" w:space="0" w:color="000000"/>
-                <w:top w:val="none" w:sz="0" w:space="0" w:color="000000"/>
-                <w:left w:val="none" w:sz="0" w:space="0" w:color="000000"/>
-                <w:right w:val="none" w:sz="0" w:space="0" w:color="000000"/>
-              </w:pBdr>
-              <w:spacing w:after="100" w:before="100" w:line="240"/>
-              <w:ind w:left="100" w:right="100" w:firstLine="0" w:firstLineChars="0"/>
-              <w:rPr>
-                <w:rFonts w:ascii="Arial" w:hAnsi="Arial" w:eastAsia="Arial" w:cs="Arial"/>
-                <w:i w:val="false"/>
-                <w:b w:val="false"/>
-                <w:u w:val="none"/>
-                <w:sz w:val="22"/>
-                <w:szCs w:val="22"/>
-                <w:color w:val="000000"/>
-              </w:rPr>
-            </w:pPr>
-            <w:r>
-              <w:rPr>
-                <w:rFonts w:ascii="Arial" w:hAnsi="Arial" w:eastAsia="Arial" w:cs="Arial"/>
-                <w:i w:val="false"/>
-                <w:b w:val="false"/>
-                <w:u w:val="none"/>
+              <w:pStyle w:val="Normal"/>
+              <w:jc w:val="left"/>
+              <w:pBdr>
+                <w:bottom w:val="none" w:sz="0" w:space="0" w:color="000000"/>
+                <w:top w:val="none" w:sz="0" w:space="0" w:color="000000"/>
+                <w:left w:val="none" w:sz="0" w:space="0" w:color="000000"/>
+                <w:right w:val="none" w:sz="0" w:space="0" w:color="000000"/>
+              </w:pBdr>
+              <w:spacing w:after="100" w:before="100" w:line="240"/>
+              <w:ind w:left="100" w:right="100" w:firstLine="0" w:firstLineChars="0"/>
+              <w:rPr>
+                <w:rFonts w:ascii="Arial" w:hAnsi="Arial" w:eastAsia="Arial" w:cs="Arial"/>
+                <w:i w:val="false"/>
+                <w:b w:val="false"/>
+                <w:u w:val="none"/>
+                <w:strike w:val="false"/>
+                <w:sz w:val="22"/>
+                <w:szCs w:val="22"/>
+                <w:color w:val="000000"/>
+              </w:rPr>
+            </w:pPr>
+            <w:r>
+              <w:rPr>
+                <w:rFonts w:ascii="Arial" w:hAnsi="Arial" w:eastAsia="Arial" w:cs="Arial"/>
+                <w:i w:val="false"/>
+                <w:b w:val="false"/>
+                <w:u w:val="none"/>
+                <w:strike w:val="false"/>
                 <w:sz w:val="22"/>
                 <w:szCs w:val="22"/>
                 <w:color w:val="000000"/>
@@ -1977,51 +2071,53 @@
         <w:trPr>
           <w:trHeight w:val="617" w:hRule="auto"/>
         </w:trPr>
-        body14
-        <w:tc>
-          <w:tcPr>
-            <w:tcBorders>
-              <w:bottom w:val="none" w:sz="0" w:space="0" w:color="000000"/>
-              <w:top w:val="none" w:sz="0" w:space="0" w:color="000000"/>
-              <w:left w:val="none" w:sz="0" w:space="0" w:color="000000"/>
-              <w:right w:val="none" w:sz="0" w:space="0" w:color="000000"/>
-            </w:tcBorders>
-            <w:shd w:val="clear" w:color="auto" w:fill="FFFFFF"/>
-            <w:tcMar>
-              <w:top w:w="0" w:type="dxa"/>
-              <w:bottom w:w="0" w:type="dxa"/>
-              <w:left w:w="0" w:type="dxa"/>
-              <w:right w:w="0" w:type="dxa"/>
-            </w:tcMar>
-            <w:vAlign w:val="center"/>
-          </w:tcPr>
-          <w:p>
-            <w:pPr>
-              <w:jc w:val="left"/>
-              <w:pBdr>
-                <w:bottom w:val="none" w:sz="0" w:space="0" w:color="000000"/>
-                <w:top w:val="none" w:sz="0" w:space="0" w:color="000000"/>
-                <w:left w:val="none" w:sz="0" w:space="0" w:color="000000"/>
-                <w:right w:val="none" w:sz="0" w:space="0" w:color="000000"/>
-              </w:pBdr>
-              <w:spacing w:after="100" w:before="100" w:line="240"/>
-              <w:ind w:left="100" w:right="100" w:firstLine="0" w:firstLineChars="0"/>
-              <w:rPr>
-                <w:rFonts w:ascii="Arial" w:hAnsi="Arial" w:eastAsia="Arial" w:cs="Arial"/>
-                <w:i w:val="false"/>
-                <w:b w:val="false"/>
-                <w:u w:val="none"/>
-                <w:sz w:val="22"/>
-                <w:szCs w:val="22"/>
-                <w:color w:val="000000"/>
-              </w:rPr>
-            </w:pPr>
-            <w:r>
-              <w:rPr>
-                <w:rFonts w:ascii="Arial" w:hAnsi="Arial" w:eastAsia="Arial" w:cs="Arial"/>
-                <w:i w:val="false"/>
-                <w:b w:val="false"/>
-                <w:u w:val="none"/>
+        <w:tc>
+          <w:tcPr>
+            <w:tcBorders>
+              <w:bottom w:val="none" w:sz="0" w:space="0" w:color="000000"/>
+              <w:top w:val="none" w:sz="0" w:space="0" w:color="000000"/>
+              <w:left w:val="none" w:sz="0" w:space="0" w:color="000000"/>
+              <w:right w:val="none" w:sz="0" w:space="0" w:color="000000"/>
+            </w:tcBorders>
+            <w:shd w:val="clear" w:color="auto" w:fill="FFFFFF"/>
+            <w:tcMar>
+              <w:top w:w="0" w:type="dxa"/>
+              <w:bottom w:w="0" w:type="dxa"/>
+              <w:left w:w="0" w:type="dxa"/>
+              <w:right w:w="0" w:type="dxa"/>
+            </w:tcMar>
+            <w:vAlign w:val="center"/>
+          </w:tcPr>
+          <w:p>
+            <w:pPr>
+              <w:pStyle w:val="Normal"/>
+              <w:jc w:val="left"/>
+              <w:pBdr>
+                <w:bottom w:val="none" w:sz="0" w:space="0" w:color="000000"/>
+                <w:top w:val="none" w:sz="0" w:space="0" w:color="000000"/>
+                <w:left w:val="none" w:sz="0" w:space="0" w:color="000000"/>
+                <w:right w:val="none" w:sz="0" w:space="0" w:color="000000"/>
+              </w:pBdr>
+              <w:spacing w:after="100" w:before="100" w:line="240"/>
+              <w:ind w:left="100" w:right="100" w:firstLine="0" w:firstLineChars="0"/>
+              <w:rPr>
+                <w:rFonts w:ascii="Arial" w:hAnsi="Arial" w:eastAsia="Arial" w:cs="Arial"/>
+                <w:i w:val="false"/>
+                <w:b w:val="false"/>
+                <w:u w:val="none"/>
+                <w:strike w:val="false"/>
+                <w:sz w:val="22"/>
+                <w:szCs w:val="22"/>
+                <w:color w:val="000000"/>
+              </w:rPr>
+            </w:pPr>
+            <w:r>
+              <w:rPr>
+                <w:rFonts w:ascii="Arial" w:hAnsi="Arial" w:eastAsia="Arial" w:cs="Arial"/>
+                <w:i w:val="false"/>
+                <w:b w:val="false"/>
+                <w:u w:val="none"/>
+                <w:strike w:val="false"/>
                 <w:sz w:val="22"/>
                 <w:szCs w:val="22"/>
                 <w:color w:val="000000"/>
@@ -2049,31 +2145,34 @@
           </w:tcPr>
           <w:p>
             <w:pPr>
-              <w:jc w:val="left"/>
-              <w:pBdr>
-                <w:bottom w:val="none" w:sz="0" w:space="0" w:color="000000"/>
-                <w:top w:val="none" w:sz="0" w:space="0" w:color="000000"/>
-                <w:left w:val="none" w:sz="0" w:space="0" w:color="000000"/>
-                <w:right w:val="none" w:sz="0" w:space="0" w:color="000000"/>
-              </w:pBdr>
-              <w:spacing w:after="100" w:before="100" w:line="240"/>
-              <w:ind w:left="100" w:right="100" w:firstLine="0" w:firstLineChars="0"/>
-              <w:rPr>
-                <w:rFonts w:ascii="Arial" w:hAnsi="Arial" w:eastAsia="Arial" w:cs="Arial"/>
-                <w:i w:val="false"/>
-                <w:b w:val="false"/>
-                <w:u w:val="none"/>
-                <w:sz w:val="22"/>
-                <w:szCs w:val="22"/>
-                <w:color w:val="000000"/>
-              </w:rPr>
-            </w:pPr>
-            <w:r>
-              <w:rPr>
-                <w:rFonts w:ascii="Arial" w:hAnsi="Arial" w:eastAsia="Arial" w:cs="Arial"/>
-                <w:i w:val="false"/>
-                <w:b w:val="false"/>
-                <w:u w:val="none"/>
+              <w:pStyle w:val="Normal"/>
+              <w:jc w:val="left"/>
+              <w:pBdr>
+                <w:bottom w:val="none" w:sz="0" w:space="0" w:color="000000"/>
+                <w:top w:val="none" w:sz="0" w:space="0" w:color="000000"/>
+                <w:left w:val="none" w:sz="0" w:space="0" w:color="000000"/>
+                <w:right w:val="none" w:sz="0" w:space="0" w:color="000000"/>
+              </w:pBdr>
+              <w:spacing w:after="100" w:before="100" w:line="240"/>
+              <w:ind w:left="100" w:right="100" w:firstLine="0" w:firstLineChars="0"/>
+              <w:rPr>
+                <w:rFonts w:ascii="Arial" w:hAnsi="Arial" w:eastAsia="Arial" w:cs="Arial"/>
+                <w:i w:val="false"/>
+                <w:b w:val="false"/>
+                <w:u w:val="none"/>
+                <w:strike w:val="false"/>
+                <w:sz w:val="22"/>
+                <w:szCs w:val="22"/>
+                <w:color w:val="000000"/>
+              </w:rPr>
+            </w:pPr>
+            <w:r>
+              <w:rPr>
+                <w:rFonts w:ascii="Arial" w:hAnsi="Arial" w:eastAsia="Arial" w:cs="Arial"/>
+                <w:i w:val="false"/>
+                <w:b w:val="false"/>
+                <w:u w:val="none"/>
+                <w:strike w:val="false"/>
                 <w:sz w:val="22"/>
                 <w:szCs w:val="22"/>
                 <w:color w:val="000000"/>
@@ -2101,31 +2200,34 @@
           </w:tcPr>
           <w:p>
             <w:pPr>
-              <w:jc w:val="left"/>
-              <w:pBdr>
-                <w:bottom w:val="none" w:sz="0" w:space="0" w:color="000000"/>
-                <w:top w:val="none" w:sz="0" w:space="0" w:color="000000"/>
-                <w:left w:val="none" w:sz="0" w:space="0" w:color="000000"/>
-                <w:right w:val="none" w:sz="0" w:space="0" w:color="000000"/>
-              </w:pBdr>
-              <w:spacing w:after="100" w:before="100" w:line="240"/>
-              <w:ind w:left="100" w:right="100" w:firstLine="0" w:firstLineChars="0"/>
-              <w:rPr>
-                <w:rFonts w:ascii="Arial" w:hAnsi="Arial" w:eastAsia="Arial" w:cs="Arial"/>
-                <w:i w:val="false"/>
-                <w:b w:val="false"/>
-                <w:u w:val="none"/>
-                <w:sz w:val="22"/>
-                <w:szCs w:val="22"/>
-                <w:color w:val="000000"/>
-              </w:rPr>
-            </w:pPr>
-            <w:r>
-              <w:rPr>
-                <w:rFonts w:ascii="Arial" w:hAnsi="Arial" w:eastAsia="Arial" w:cs="Arial"/>
-                <w:i w:val="false"/>
-                <w:b w:val="false"/>
-                <w:u w:val="none"/>
+              <w:pStyle w:val="Normal"/>
+              <w:jc w:val="left"/>
+              <w:pBdr>
+                <w:bottom w:val="none" w:sz="0" w:space="0" w:color="000000"/>
+                <w:top w:val="none" w:sz="0" w:space="0" w:color="000000"/>
+                <w:left w:val="none" w:sz="0" w:space="0" w:color="000000"/>
+                <w:right w:val="none" w:sz="0" w:space="0" w:color="000000"/>
+              </w:pBdr>
+              <w:spacing w:after="100" w:before="100" w:line="240"/>
+              <w:ind w:left="100" w:right="100" w:firstLine="0" w:firstLineChars="0"/>
+              <w:rPr>
+                <w:rFonts w:ascii="Arial" w:hAnsi="Arial" w:eastAsia="Arial" w:cs="Arial"/>
+                <w:i w:val="false"/>
+                <w:b w:val="false"/>
+                <w:u w:val="none"/>
+                <w:strike w:val="false"/>
+                <w:sz w:val="22"/>
+                <w:szCs w:val="22"/>
+                <w:color w:val="000000"/>
+              </w:rPr>
+            </w:pPr>
+            <w:r>
+              <w:rPr>
+                <w:rFonts w:ascii="Arial" w:hAnsi="Arial" w:eastAsia="Arial" w:cs="Arial"/>
+                <w:i w:val="false"/>
+                <w:b w:val="false"/>
+                <w:u w:val="none"/>
+                <w:strike w:val="false"/>
                 <w:sz w:val="22"/>
                 <w:szCs w:val="22"/>
                 <w:color w:val="000000"/>
@@ -2139,7 +2241,6 @@
         <w:trPr>
           <w:trHeight w:val="571" w:hRule="auto"/>
         </w:trPr>
-        body15
         <w:tc>
           <w:tcPr>
             <w:gridSpan w:val="3"/>
@@ -2160,6 +2261,7 @@
           </w:tcPr>
           <w:p>
             <w:pPr>
+              <w:pStyle w:val="Normal"/>
               <w:jc w:val="left"/>
               <w:pBdr>
                 <w:bottom w:val="none" w:sz="0" w:space="0" w:color="000000"/>
@@ -2174,6 +2276,7 @@
                 <w:i w:val="false"/>
                 <w:b w:val="true"/>
                 <w:u w:val="none"/>
+                <w:strike w:val="false"/>
                 <w:sz w:val="22"/>
                 <w:szCs w:val="22"/>
                 <w:color w:val="000000"/>
@@ -2185,6 +2288,7 @@
                 <w:i w:val="false"/>
                 <w:b w:val="true"/>
                 <w:u w:val="none"/>
+                <w:strike w:val="false"/>
                 <w:sz w:val="22"/>
                 <w:szCs w:val="22"/>
                 <w:color w:val="000000"/>
@@ -2198,51 +2302,53 @@
         <w:trPr>
           <w:trHeight w:val="571" w:hRule="auto"/>
         </w:trPr>
-        body16
-        <w:tc>
-          <w:tcPr>
-            <w:tcBorders>
-              <w:bottom w:val="none" w:sz="0" w:space="0" w:color="000000"/>
-              <w:top w:val="none" w:sz="0" w:space="0" w:color="000000"/>
-              <w:left w:val="none" w:sz="0" w:space="0" w:color="000000"/>
-              <w:right w:val="none" w:sz="0" w:space="0" w:color="000000"/>
-            </w:tcBorders>
-            <w:shd w:val="clear" w:color="auto" w:fill="FFFFFF"/>
-            <w:tcMar>
-              <w:top w:w="0" w:type="dxa"/>
-              <w:bottom w:w="0" w:type="dxa"/>
-              <w:left w:w="0" w:type="dxa"/>
-              <w:right w:w="0" w:type="dxa"/>
-            </w:tcMar>
-            <w:vAlign w:val="center"/>
-          </w:tcPr>
-          <w:p>
-            <w:pPr>
-              <w:jc w:val="left"/>
-              <w:pBdr>
-                <w:bottom w:val="none" w:sz="0" w:space="0" w:color="000000"/>
-                <w:top w:val="none" w:sz="0" w:space="0" w:color="000000"/>
-                <w:left w:val="none" w:sz="0" w:space="0" w:color="000000"/>
-                <w:right w:val="none" w:sz="0" w:space="0" w:color="000000"/>
-              </w:pBdr>
-              <w:spacing w:after="100" w:before="100" w:line="240"/>
-              <w:ind w:left="100" w:right="100" w:firstLine="0" w:firstLineChars="0"/>
-              <w:rPr>
-                <w:rFonts w:ascii="Arial" w:hAnsi="Arial" w:eastAsia="Arial" w:cs="Arial"/>
-                <w:i w:val="false"/>
-                <w:b w:val="false"/>
-                <w:u w:val="none"/>
-                <w:sz w:val="22"/>
-                <w:szCs w:val="22"/>
-                <w:color w:val="000000"/>
-              </w:rPr>
-            </w:pPr>
-            <w:r>
-              <w:rPr>
-                <w:rFonts w:ascii="Arial" w:hAnsi="Arial" w:eastAsia="Arial" w:cs="Arial"/>
-                <w:i w:val="false"/>
-                <w:b w:val="false"/>
-                <w:u w:val="none"/>
+        <w:tc>
+          <w:tcPr>
+            <w:tcBorders>
+              <w:bottom w:val="none" w:sz="0" w:space="0" w:color="000000"/>
+              <w:top w:val="none" w:sz="0" w:space="0" w:color="000000"/>
+              <w:left w:val="none" w:sz="0" w:space="0" w:color="000000"/>
+              <w:right w:val="none" w:sz="0" w:space="0" w:color="000000"/>
+            </w:tcBorders>
+            <w:shd w:val="clear" w:color="auto" w:fill="FFFFFF"/>
+            <w:tcMar>
+              <w:top w:w="0" w:type="dxa"/>
+              <w:bottom w:w="0" w:type="dxa"/>
+              <w:left w:w="0" w:type="dxa"/>
+              <w:right w:w="0" w:type="dxa"/>
+            </w:tcMar>
+            <w:vAlign w:val="center"/>
+          </w:tcPr>
+          <w:p>
+            <w:pPr>
+              <w:pStyle w:val="Normal"/>
+              <w:jc w:val="left"/>
+              <w:pBdr>
+                <w:bottom w:val="none" w:sz="0" w:space="0" w:color="000000"/>
+                <w:top w:val="none" w:sz="0" w:space="0" w:color="000000"/>
+                <w:left w:val="none" w:sz="0" w:space="0" w:color="000000"/>
+                <w:right w:val="none" w:sz="0" w:space="0" w:color="000000"/>
+              </w:pBdr>
+              <w:spacing w:after="100" w:before="100" w:line="240"/>
+              <w:ind w:left="100" w:right="100" w:firstLine="0" w:firstLineChars="0"/>
+              <w:rPr>
+                <w:rFonts w:ascii="Arial" w:hAnsi="Arial" w:eastAsia="Arial" w:cs="Arial"/>
+                <w:i w:val="false"/>
+                <w:b w:val="false"/>
+                <w:u w:val="none"/>
+                <w:strike w:val="false"/>
+                <w:sz w:val="22"/>
+                <w:szCs w:val="22"/>
+                <w:color w:val="000000"/>
+              </w:rPr>
+            </w:pPr>
+            <w:r>
+              <w:rPr>
+                <w:rFonts w:ascii="Arial" w:hAnsi="Arial" w:eastAsia="Arial" w:cs="Arial"/>
+                <w:i w:val="false"/>
+                <w:b w:val="false"/>
+                <w:u w:val="none"/>
+                <w:strike w:val="false"/>
                 <w:sz w:val="22"/>
                 <w:szCs w:val="22"/>
                 <w:color w:val="000000"/>
@@ -2270,31 +2376,34 @@
           </w:tcPr>
           <w:p>
             <w:pPr>
-              <w:jc w:val="left"/>
-              <w:pBdr>
-                <w:bottom w:val="none" w:sz="0" w:space="0" w:color="000000"/>
-                <w:top w:val="none" w:sz="0" w:space="0" w:color="000000"/>
-                <w:left w:val="none" w:sz="0" w:space="0" w:color="000000"/>
-                <w:right w:val="none" w:sz="0" w:space="0" w:color="000000"/>
-              </w:pBdr>
-              <w:spacing w:after="100" w:before="100" w:line="240"/>
-              <w:ind w:left="100" w:right="100" w:firstLine="0" w:firstLineChars="0"/>
-              <w:rPr>
-                <w:rFonts w:ascii="Arial" w:hAnsi="Arial" w:eastAsia="Arial" w:cs="Arial"/>
-                <w:i w:val="false"/>
-                <w:b w:val="false"/>
-                <w:u w:val="none"/>
-                <w:sz w:val="22"/>
-                <w:szCs w:val="22"/>
-                <w:color w:val="000000"/>
-              </w:rPr>
-            </w:pPr>
-            <w:r>
-              <w:rPr>
-                <w:rFonts w:ascii="Arial" w:hAnsi="Arial" w:eastAsia="Arial" w:cs="Arial"/>
-                <w:i w:val="false"/>
-                <w:b w:val="false"/>
-                <w:u w:val="none"/>
+              <w:pStyle w:val="Normal"/>
+              <w:jc w:val="left"/>
+              <w:pBdr>
+                <w:bottom w:val="none" w:sz="0" w:space="0" w:color="000000"/>
+                <w:top w:val="none" w:sz="0" w:space="0" w:color="000000"/>
+                <w:left w:val="none" w:sz="0" w:space="0" w:color="000000"/>
+                <w:right w:val="none" w:sz="0" w:space="0" w:color="000000"/>
+              </w:pBdr>
+              <w:spacing w:after="100" w:before="100" w:line="240"/>
+              <w:ind w:left="100" w:right="100" w:firstLine="0" w:firstLineChars="0"/>
+              <w:rPr>
+                <w:rFonts w:ascii="Arial" w:hAnsi="Arial" w:eastAsia="Arial" w:cs="Arial"/>
+                <w:i w:val="false"/>
+                <w:b w:val="false"/>
+                <w:u w:val="none"/>
+                <w:strike w:val="false"/>
+                <w:sz w:val="22"/>
+                <w:szCs w:val="22"/>
+                <w:color w:val="000000"/>
+              </w:rPr>
+            </w:pPr>
+            <w:r>
+              <w:rPr>
+                <w:rFonts w:ascii="Arial" w:hAnsi="Arial" w:eastAsia="Arial" w:cs="Arial"/>
+                <w:i w:val="false"/>
+                <w:b w:val="false"/>
+                <w:u w:val="none"/>
+                <w:strike w:val="false"/>
                 <w:sz w:val="22"/>
                 <w:szCs w:val="22"/>
                 <w:color w:val="000000"/>
@@ -2322,31 +2431,34 @@
           </w:tcPr>
           <w:p>
             <w:pPr>
-              <w:jc w:val="left"/>
-              <w:pBdr>
-                <w:bottom w:val="none" w:sz="0" w:space="0" w:color="000000"/>
-                <w:top w:val="none" w:sz="0" w:space="0" w:color="000000"/>
-                <w:left w:val="none" w:sz="0" w:space="0" w:color="000000"/>
-                <w:right w:val="none" w:sz="0" w:space="0" w:color="000000"/>
-              </w:pBdr>
-              <w:spacing w:after="100" w:before="100" w:line="240"/>
-              <w:ind w:left="100" w:right="100" w:firstLine="0" w:firstLineChars="0"/>
-              <w:rPr>
-                <w:rFonts w:ascii="Arial" w:hAnsi="Arial" w:eastAsia="Arial" w:cs="Arial"/>
-                <w:i w:val="false"/>
-                <w:b w:val="false"/>
-                <w:u w:val="none"/>
-                <w:sz w:val="22"/>
-                <w:szCs w:val="22"/>
-                <w:color w:val="000000"/>
-              </w:rPr>
-            </w:pPr>
-            <w:r>
-              <w:rPr>
-                <w:rFonts w:ascii="Arial" w:hAnsi="Arial" w:eastAsia="Arial" w:cs="Arial"/>
-                <w:i w:val="false"/>
-                <w:b w:val="false"/>
-                <w:u w:val="none"/>
+              <w:pStyle w:val="Normal"/>
+              <w:jc w:val="left"/>
+              <w:pBdr>
+                <w:bottom w:val="none" w:sz="0" w:space="0" w:color="000000"/>
+                <w:top w:val="none" w:sz="0" w:space="0" w:color="000000"/>
+                <w:left w:val="none" w:sz="0" w:space="0" w:color="000000"/>
+                <w:right w:val="none" w:sz="0" w:space="0" w:color="000000"/>
+              </w:pBdr>
+              <w:spacing w:after="100" w:before="100" w:line="240"/>
+              <w:ind w:left="100" w:right="100" w:firstLine="0" w:firstLineChars="0"/>
+              <w:rPr>
+                <w:rFonts w:ascii="Arial" w:hAnsi="Arial" w:eastAsia="Arial" w:cs="Arial"/>
+                <w:i w:val="false"/>
+                <w:b w:val="false"/>
+                <w:u w:val="none"/>
+                <w:strike w:val="false"/>
+                <w:sz w:val="22"/>
+                <w:szCs w:val="22"/>
+                <w:color w:val="000000"/>
+              </w:rPr>
+            </w:pPr>
+            <w:r>
+              <w:rPr>
+                <w:rFonts w:ascii="Arial" w:hAnsi="Arial" w:eastAsia="Arial" w:cs="Arial"/>
+                <w:i w:val="false"/>
+                <w:b w:val="false"/>
+                <w:u w:val="none"/>
+                <w:strike w:val="false"/>
                 <w:sz w:val="22"/>
                 <w:szCs w:val="22"/>
                 <w:color w:val="000000"/>
@@ -2360,51 +2472,53 @@
         <w:trPr>
           <w:trHeight w:val="572" w:hRule="auto"/>
         </w:trPr>
-        body17
-        <w:tc>
-          <w:tcPr>
-            <w:tcBorders>
-              <w:bottom w:val="none" w:sz="0" w:space="0" w:color="000000"/>
-              <w:top w:val="none" w:sz="0" w:space="0" w:color="000000"/>
-              <w:left w:val="none" w:sz="0" w:space="0" w:color="000000"/>
-              <w:right w:val="none" w:sz="0" w:space="0" w:color="000000"/>
-            </w:tcBorders>
-            <w:shd w:val="clear" w:color="auto" w:fill="FFFFFF"/>
-            <w:tcMar>
-              <w:top w:w="0" w:type="dxa"/>
-              <w:bottom w:w="0" w:type="dxa"/>
-              <w:left w:w="0" w:type="dxa"/>
-              <w:right w:w="0" w:type="dxa"/>
-            </w:tcMar>
-            <w:vAlign w:val="center"/>
-          </w:tcPr>
-          <w:p>
-            <w:pPr>
-              <w:jc w:val="left"/>
-              <w:pBdr>
-                <w:bottom w:val="none" w:sz="0" w:space="0" w:color="000000"/>
-                <w:top w:val="none" w:sz="0" w:space="0" w:color="000000"/>
-                <w:left w:val="none" w:sz="0" w:space="0" w:color="000000"/>
-                <w:right w:val="none" w:sz="0" w:space="0" w:color="000000"/>
-              </w:pBdr>
-              <w:spacing w:after="100" w:before="100" w:line="240"/>
-              <w:ind w:left="100" w:right="100" w:firstLine="0" w:firstLineChars="0"/>
-              <w:rPr>
-                <w:rFonts w:ascii="Arial" w:hAnsi="Arial" w:eastAsia="Arial" w:cs="Arial"/>
-                <w:i w:val="false"/>
-                <w:b w:val="false"/>
-                <w:u w:val="none"/>
-                <w:sz w:val="22"/>
-                <w:szCs w:val="22"/>
-                <w:color w:val="000000"/>
-              </w:rPr>
-            </w:pPr>
-            <w:r>
-              <w:rPr>
-                <w:rFonts w:ascii="Arial" w:hAnsi="Arial" w:eastAsia="Arial" w:cs="Arial"/>
-                <w:i w:val="false"/>
-                <w:b w:val="false"/>
-                <w:u w:val="none"/>
+        <w:tc>
+          <w:tcPr>
+            <w:tcBorders>
+              <w:bottom w:val="none" w:sz="0" w:space="0" w:color="000000"/>
+              <w:top w:val="none" w:sz="0" w:space="0" w:color="000000"/>
+              <w:left w:val="none" w:sz="0" w:space="0" w:color="000000"/>
+              <w:right w:val="none" w:sz="0" w:space="0" w:color="000000"/>
+            </w:tcBorders>
+            <w:shd w:val="clear" w:color="auto" w:fill="FFFFFF"/>
+            <w:tcMar>
+              <w:top w:w="0" w:type="dxa"/>
+              <w:bottom w:w="0" w:type="dxa"/>
+              <w:left w:w="0" w:type="dxa"/>
+              <w:right w:w="0" w:type="dxa"/>
+            </w:tcMar>
+            <w:vAlign w:val="center"/>
+          </w:tcPr>
+          <w:p>
+            <w:pPr>
+              <w:pStyle w:val="Normal"/>
+              <w:jc w:val="left"/>
+              <w:pBdr>
+                <w:bottom w:val="none" w:sz="0" w:space="0" w:color="000000"/>
+                <w:top w:val="none" w:sz="0" w:space="0" w:color="000000"/>
+                <w:left w:val="none" w:sz="0" w:space="0" w:color="000000"/>
+                <w:right w:val="none" w:sz="0" w:space="0" w:color="000000"/>
+              </w:pBdr>
+              <w:spacing w:after="100" w:before="100" w:line="240"/>
+              <w:ind w:left="100" w:right="100" w:firstLine="0" w:firstLineChars="0"/>
+              <w:rPr>
+                <w:rFonts w:ascii="Arial" w:hAnsi="Arial" w:eastAsia="Arial" w:cs="Arial"/>
+                <w:i w:val="false"/>
+                <w:b w:val="false"/>
+                <w:u w:val="none"/>
+                <w:strike w:val="false"/>
+                <w:sz w:val="22"/>
+                <w:szCs w:val="22"/>
+                <w:color w:val="000000"/>
+              </w:rPr>
+            </w:pPr>
+            <w:r>
+              <w:rPr>
+                <w:rFonts w:ascii="Arial" w:hAnsi="Arial" w:eastAsia="Arial" w:cs="Arial"/>
+                <w:i w:val="false"/>
+                <w:b w:val="false"/>
+                <w:u w:val="none"/>
+                <w:strike w:val="false"/>
                 <w:sz w:val="22"/>
                 <w:szCs w:val="22"/>
                 <w:color w:val="000000"/>
@@ -2432,31 +2546,34 @@
           </w:tcPr>
           <w:p>
             <w:pPr>
-              <w:jc w:val="left"/>
-              <w:pBdr>
-                <w:bottom w:val="none" w:sz="0" w:space="0" w:color="000000"/>
-                <w:top w:val="none" w:sz="0" w:space="0" w:color="000000"/>
-                <w:left w:val="none" w:sz="0" w:space="0" w:color="000000"/>
-                <w:right w:val="none" w:sz="0" w:space="0" w:color="000000"/>
-              </w:pBdr>
-              <w:spacing w:after="100" w:before="100" w:line="240"/>
-              <w:ind w:left="100" w:right="100" w:firstLine="0" w:firstLineChars="0"/>
-              <w:rPr>
-                <w:rFonts w:ascii="Arial" w:hAnsi="Arial" w:eastAsia="Arial" w:cs="Arial"/>
-                <w:i w:val="false"/>
-                <w:b w:val="false"/>
-                <w:u w:val="none"/>
-                <w:sz w:val="22"/>
-                <w:szCs w:val="22"/>
-                <w:color w:val="000000"/>
-              </w:rPr>
-            </w:pPr>
-            <w:r>
-              <w:rPr>
-                <w:rFonts w:ascii="Arial" w:hAnsi="Arial" w:eastAsia="Arial" w:cs="Arial"/>
-                <w:i w:val="false"/>
-                <w:b w:val="false"/>
-                <w:u w:val="none"/>
+              <w:pStyle w:val="Normal"/>
+              <w:jc w:val="left"/>
+              <w:pBdr>
+                <w:bottom w:val="none" w:sz="0" w:space="0" w:color="000000"/>
+                <w:top w:val="none" w:sz="0" w:space="0" w:color="000000"/>
+                <w:left w:val="none" w:sz="0" w:space="0" w:color="000000"/>
+                <w:right w:val="none" w:sz="0" w:space="0" w:color="000000"/>
+              </w:pBdr>
+              <w:spacing w:after="100" w:before="100" w:line="240"/>
+              <w:ind w:left="100" w:right="100" w:firstLine="0" w:firstLineChars="0"/>
+              <w:rPr>
+                <w:rFonts w:ascii="Arial" w:hAnsi="Arial" w:eastAsia="Arial" w:cs="Arial"/>
+                <w:i w:val="false"/>
+                <w:b w:val="false"/>
+                <w:u w:val="none"/>
+                <w:strike w:val="false"/>
+                <w:sz w:val="22"/>
+                <w:szCs w:val="22"/>
+                <w:color w:val="000000"/>
+              </w:rPr>
+            </w:pPr>
+            <w:r>
+              <w:rPr>
+                <w:rFonts w:ascii="Arial" w:hAnsi="Arial" w:eastAsia="Arial" w:cs="Arial"/>
+                <w:i w:val="false"/>
+                <w:b w:val="false"/>
+                <w:u w:val="none"/>
+                <w:strike w:val="false"/>
                 <w:sz w:val="22"/>
                 <w:szCs w:val="22"/>
                 <w:color w:val="000000"/>
@@ -2484,31 +2601,34 @@
           </w:tcPr>
           <w:p>
             <w:pPr>
-              <w:jc w:val="left"/>
-              <w:pBdr>
-                <w:bottom w:val="none" w:sz="0" w:space="0" w:color="000000"/>
-                <w:top w:val="none" w:sz="0" w:space="0" w:color="000000"/>
-                <w:left w:val="none" w:sz="0" w:space="0" w:color="000000"/>
-                <w:right w:val="none" w:sz="0" w:space="0" w:color="000000"/>
-              </w:pBdr>
-              <w:spacing w:after="100" w:before="100" w:line="240"/>
-              <w:ind w:left="100" w:right="100" w:firstLine="0" w:firstLineChars="0"/>
-              <w:rPr>
-                <w:rFonts w:ascii="Arial" w:hAnsi="Arial" w:eastAsia="Arial" w:cs="Arial"/>
-                <w:i w:val="false"/>
-                <w:b w:val="false"/>
-                <w:u w:val="none"/>
-                <w:sz w:val="22"/>
-                <w:szCs w:val="22"/>
-                <w:color w:val="000000"/>
-              </w:rPr>
-            </w:pPr>
-            <w:r>
-              <w:rPr>
-                <w:rFonts w:ascii="Arial" w:hAnsi="Arial" w:eastAsia="Arial" w:cs="Arial"/>
-                <w:i w:val="false"/>
-                <w:b w:val="false"/>
-                <w:u w:val="none"/>
+              <w:pStyle w:val="Normal"/>
+              <w:jc w:val="left"/>
+              <w:pBdr>
+                <w:bottom w:val="none" w:sz="0" w:space="0" w:color="000000"/>
+                <w:top w:val="none" w:sz="0" w:space="0" w:color="000000"/>
+                <w:left w:val="none" w:sz="0" w:space="0" w:color="000000"/>
+                <w:right w:val="none" w:sz="0" w:space="0" w:color="000000"/>
+              </w:pBdr>
+              <w:spacing w:after="100" w:before="100" w:line="240"/>
+              <w:ind w:left="100" w:right="100" w:firstLine="0" w:firstLineChars="0"/>
+              <w:rPr>
+                <w:rFonts w:ascii="Arial" w:hAnsi="Arial" w:eastAsia="Arial" w:cs="Arial"/>
+                <w:i w:val="false"/>
+                <w:b w:val="false"/>
+                <w:u w:val="none"/>
+                <w:strike w:val="false"/>
+                <w:sz w:val="22"/>
+                <w:szCs w:val="22"/>
+                <w:color w:val="000000"/>
+              </w:rPr>
+            </w:pPr>
+            <w:r>
+              <w:rPr>
+                <w:rFonts w:ascii="Arial" w:hAnsi="Arial" w:eastAsia="Arial" w:cs="Arial"/>
+                <w:i w:val="false"/>
+                <w:b w:val="false"/>
+                <w:u w:val="none"/>
+                <w:strike w:val="false"/>
                 <w:sz w:val="22"/>
                 <w:szCs w:val="22"/>
                 <w:color w:val="000000"/>
@@ -2522,51 +2642,53 @@
         <w:trPr>
           <w:trHeight w:val="617" w:hRule="auto"/>
         </w:trPr>
-        body18
-        <w:tc>
-          <w:tcPr>
-            <w:tcBorders>
-              <w:bottom w:val="none" w:sz="0" w:space="0" w:color="000000"/>
-              <w:top w:val="none" w:sz="0" w:space="0" w:color="000000"/>
-              <w:left w:val="none" w:sz="0" w:space="0" w:color="000000"/>
-              <w:right w:val="none" w:sz="0" w:space="0" w:color="000000"/>
-            </w:tcBorders>
-            <w:shd w:val="clear" w:color="auto" w:fill="FFFFFF"/>
-            <w:tcMar>
-              <w:top w:w="0" w:type="dxa"/>
-              <w:bottom w:w="0" w:type="dxa"/>
-              <w:left w:w="0" w:type="dxa"/>
-              <w:right w:w="0" w:type="dxa"/>
-            </w:tcMar>
-            <w:vAlign w:val="center"/>
-          </w:tcPr>
-          <w:p>
-            <w:pPr>
-              <w:jc w:val="left"/>
-              <w:pBdr>
-                <w:bottom w:val="none" w:sz="0" w:space="0" w:color="000000"/>
-                <w:top w:val="none" w:sz="0" w:space="0" w:color="000000"/>
-                <w:left w:val="none" w:sz="0" w:space="0" w:color="000000"/>
-                <w:right w:val="none" w:sz="0" w:space="0" w:color="000000"/>
-              </w:pBdr>
-              <w:spacing w:after="100" w:before="100" w:line="240"/>
-              <w:ind w:left="100" w:right="100" w:firstLine="0" w:firstLineChars="0"/>
-              <w:rPr>
-                <w:rFonts w:ascii="Arial" w:hAnsi="Arial" w:eastAsia="Arial" w:cs="Arial"/>
-                <w:i w:val="false"/>
-                <w:b w:val="false"/>
-                <w:u w:val="none"/>
-                <w:sz w:val="22"/>
-                <w:szCs w:val="22"/>
-                <w:color w:val="000000"/>
-              </w:rPr>
-            </w:pPr>
-            <w:r>
-              <w:rPr>
-                <w:rFonts w:ascii="Arial" w:hAnsi="Arial" w:eastAsia="Arial" w:cs="Arial"/>
-                <w:i w:val="false"/>
-                <w:b w:val="false"/>
-                <w:u w:val="none"/>
+        <w:tc>
+          <w:tcPr>
+            <w:tcBorders>
+              <w:bottom w:val="none" w:sz="0" w:space="0" w:color="000000"/>
+              <w:top w:val="none" w:sz="0" w:space="0" w:color="000000"/>
+              <w:left w:val="none" w:sz="0" w:space="0" w:color="000000"/>
+              <w:right w:val="none" w:sz="0" w:space="0" w:color="000000"/>
+            </w:tcBorders>
+            <w:shd w:val="clear" w:color="auto" w:fill="FFFFFF"/>
+            <w:tcMar>
+              <w:top w:w="0" w:type="dxa"/>
+              <w:bottom w:w="0" w:type="dxa"/>
+              <w:left w:w="0" w:type="dxa"/>
+              <w:right w:w="0" w:type="dxa"/>
+            </w:tcMar>
+            <w:vAlign w:val="center"/>
+          </w:tcPr>
+          <w:p>
+            <w:pPr>
+              <w:pStyle w:val="Normal"/>
+              <w:jc w:val="left"/>
+              <w:pBdr>
+                <w:bottom w:val="none" w:sz="0" w:space="0" w:color="000000"/>
+                <w:top w:val="none" w:sz="0" w:space="0" w:color="000000"/>
+                <w:left w:val="none" w:sz="0" w:space="0" w:color="000000"/>
+                <w:right w:val="none" w:sz="0" w:space="0" w:color="000000"/>
+              </w:pBdr>
+              <w:spacing w:after="100" w:before="100" w:line="240"/>
+              <w:ind w:left="100" w:right="100" w:firstLine="0" w:firstLineChars="0"/>
+              <w:rPr>
+                <w:rFonts w:ascii="Arial" w:hAnsi="Arial" w:eastAsia="Arial" w:cs="Arial"/>
+                <w:i w:val="false"/>
+                <w:b w:val="false"/>
+                <w:u w:val="none"/>
+                <w:strike w:val="false"/>
+                <w:sz w:val="22"/>
+                <w:szCs w:val="22"/>
+                <w:color w:val="000000"/>
+              </w:rPr>
+            </w:pPr>
+            <w:r>
+              <w:rPr>
+                <w:rFonts w:ascii="Arial" w:hAnsi="Arial" w:eastAsia="Arial" w:cs="Arial"/>
+                <w:i w:val="false"/>
+                <w:b w:val="false"/>
+                <w:u w:val="none"/>
+                <w:strike w:val="false"/>
                 <w:sz w:val="22"/>
                 <w:szCs w:val="22"/>
                 <w:color w:val="000000"/>
@@ -2594,31 +2716,34 @@
           </w:tcPr>
           <w:p>
             <w:pPr>
-              <w:jc w:val="left"/>
-              <w:pBdr>
-                <w:bottom w:val="none" w:sz="0" w:space="0" w:color="000000"/>
-                <w:top w:val="none" w:sz="0" w:space="0" w:color="000000"/>
-                <w:left w:val="none" w:sz="0" w:space="0" w:color="000000"/>
-                <w:right w:val="none" w:sz="0" w:space="0" w:color="000000"/>
-              </w:pBdr>
-              <w:spacing w:after="100" w:before="100" w:line="240"/>
-              <w:ind w:left="100" w:right="100" w:firstLine="0" w:firstLineChars="0"/>
-              <w:rPr>
-                <w:rFonts w:ascii="Arial" w:hAnsi="Arial" w:eastAsia="Arial" w:cs="Arial"/>
-                <w:i w:val="false"/>
-                <w:b w:val="false"/>
-                <w:u w:val="none"/>
-                <w:sz w:val="22"/>
-                <w:szCs w:val="22"/>
-                <w:color w:val="000000"/>
-              </w:rPr>
-            </w:pPr>
-            <w:r>
-              <w:rPr>
-                <w:rFonts w:ascii="Arial" w:hAnsi="Arial" w:eastAsia="Arial" w:cs="Arial"/>
-                <w:i w:val="false"/>
-                <w:b w:val="false"/>
-                <w:u w:val="none"/>
+              <w:pStyle w:val="Normal"/>
+              <w:jc w:val="left"/>
+              <w:pBdr>
+                <w:bottom w:val="none" w:sz="0" w:space="0" w:color="000000"/>
+                <w:top w:val="none" w:sz="0" w:space="0" w:color="000000"/>
+                <w:left w:val="none" w:sz="0" w:space="0" w:color="000000"/>
+                <w:right w:val="none" w:sz="0" w:space="0" w:color="000000"/>
+              </w:pBdr>
+              <w:spacing w:after="100" w:before="100" w:line="240"/>
+              <w:ind w:left="100" w:right="100" w:firstLine="0" w:firstLineChars="0"/>
+              <w:rPr>
+                <w:rFonts w:ascii="Arial" w:hAnsi="Arial" w:eastAsia="Arial" w:cs="Arial"/>
+                <w:i w:val="false"/>
+                <w:b w:val="false"/>
+                <w:u w:val="none"/>
+                <w:strike w:val="false"/>
+                <w:sz w:val="22"/>
+                <w:szCs w:val="22"/>
+                <w:color w:val="000000"/>
+              </w:rPr>
+            </w:pPr>
+            <w:r>
+              <w:rPr>
+                <w:rFonts w:ascii="Arial" w:hAnsi="Arial" w:eastAsia="Arial" w:cs="Arial"/>
+                <w:i w:val="false"/>
+                <w:b w:val="false"/>
+                <w:u w:val="none"/>
+                <w:strike w:val="false"/>
                 <w:sz w:val="22"/>
                 <w:szCs w:val="22"/>
                 <w:color w:val="000000"/>
@@ -2646,31 +2771,34 @@
           </w:tcPr>
           <w:p>
             <w:pPr>
-              <w:jc w:val="left"/>
-              <w:pBdr>
-                <w:bottom w:val="none" w:sz="0" w:space="0" w:color="000000"/>
-                <w:top w:val="none" w:sz="0" w:space="0" w:color="000000"/>
-                <w:left w:val="none" w:sz="0" w:space="0" w:color="000000"/>
-                <w:right w:val="none" w:sz="0" w:space="0" w:color="000000"/>
-              </w:pBdr>
-              <w:spacing w:after="100" w:before="100" w:line="240"/>
-              <w:ind w:left="100" w:right="100" w:firstLine="0" w:firstLineChars="0"/>
-              <w:rPr>
-                <w:rFonts w:ascii="Arial" w:hAnsi="Arial" w:eastAsia="Arial" w:cs="Arial"/>
-                <w:i w:val="false"/>
-                <w:b w:val="false"/>
-                <w:u w:val="none"/>
-                <w:sz w:val="22"/>
-                <w:szCs w:val="22"/>
-                <w:color w:val="000000"/>
-              </w:rPr>
-            </w:pPr>
-            <w:r>
-              <w:rPr>
-                <w:rFonts w:ascii="Arial" w:hAnsi="Arial" w:eastAsia="Arial" w:cs="Arial"/>
-                <w:i w:val="false"/>
-                <w:b w:val="false"/>
-                <w:u w:val="none"/>
+              <w:pStyle w:val="Normal"/>
+              <w:jc w:val="left"/>
+              <w:pBdr>
+                <w:bottom w:val="none" w:sz="0" w:space="0" w:color="000000"/>
+                <w:top w:val="none" w:sz="0" w:space="0" w:color="000000"/>
+                <w:left w:val="none" w:sz="0" w:space="0" w:color="000000"/>
+                <w:right w:val="none" w:sz="0" w:space="0" w:color="000000"/>
+              </w:pBdr>
+              <w:spacing w:after="100" w:before="100" w:line="240"/>
+              <w:ind w:left="100" w:right="100" w:firstLine="0" w:firstLineChars="0"/>
+              <w:rPr>
+                <w:rFonts w:ascii="Arial" w:hAnsi="Arial" w:eastAsia="Arial" w:cs="Arial"/>
+                <w:i w:val="false"/>
+                <w:b w:val="false"/>
+                <w:u w:val="none"/>
+                <w:strike w:val="false"/>
+                <w:sz w:val="22"/>
+                <w:szCs w:val="22"/>
+                <w:color w:val="000000"/>
+              </w:rPr>
+            </w:pPr>
+            <w:r>
+              <w:rPr>
+                <w:rFonts w:ascii="Arial" w:hAnsi="Arial" w:eastAsia="Arial" w:cs="Arial"/>
+                <w:i w:val="false"/>
+                <w:b w:val="false"/>
+                <w:u w:val="none"/>
+                <w:strike w:val="false"/>
                 <w:sz w:val="22"/>
                 <w:szCs w:val="22"/>
                 <w:color w:val="000000"/>
@@ -2684,51 +2812,53 @@
         <w:trPr>
           <w:trHeight w:val="617" w:hRule="auto"/>
         </w:trPr>
-        body19
-        <w:tc>
-          <w:tcPr>
-            <w:tcBorders>
-              <w:bottom w:val="none" w:sz="0" w:space="0" w:color="000000"/>
-              <w:top w:val="none" w:sz="0" w:space="0" w:color="000000"/>
-              <w:left w:val="none" w:sz="0" w:space="0" w:color="000000"/>
-              <w:right w:val="none" w:sz="0" w:space="0" w:color="000000"/>
-            </w:tcBorders>
-            <w:shd w:val="clear" w:color="auto" w:fill="FFFFFF"/>
-            <w:tcMar>
-              <w:top w:w="0" w:type="dxa"/>
-              <w:bottom w:w="0" w:type="dxa"/>
-              <w:left w:w="0" w:type="dxa"/>
-              <w:right w:w="0" w:type="dxa"/>
-            </w:tcMar>
-            <w:vAlign w:val="center"/>
-          </w:tcPr>
-          <w:p>
-            <w:pPr>
-              <w:jc w:val="left"/>
-              <w:pBdr>
-                <w:bottom w:val="none" w:sz="0" w:space="0" w:color="000000"/>
-                <w:top w:val="none" w:sz="0" w:space="0" w:color="000000"/>
-                <w:left w:val="none" w:sz="0" w:space="0" w:color="000000"/>
-                <w:right w:val="none" w:sz="0" w:space="0" w:color="000000"/>
-              </w:pBdr>
-              <w:spacing w:after="100" w:before="100" w:line="240"/>
-              <w:ind w:left="100" w:right="100" w:firstLine="0" w:firstLineChars="0"/>
-              <w:rPr>
-                <w:rFonts w:ascii="Arial" w:hAnsi="Arial" w:eastAsia="Arial" w:cs="Arial"/>
-                <w:i w:val="false"/>
-                <w:b w:val="false"/>
-                <w:u w:val="none"/>
-                <w:sz w:val="22"/>
-                <w:szCs w:val="22"/>
-                <w:color w:val="000000"/>
-              </w:rPr>
-            </w:pPr>
-            <w:r>
-              <w:rPr>
-                <w:rFonts w:ascii="Arial" w:hAnsi="Arial" w:eastAsia="Arial" w:cs="Arial"/>
-                <w:i w:val="false"/>
-                <w:b w:val="false"/>
-                <w:u w:val="none"/>
+        <w:tc>
+          <w:tcPr>
+            <w:tcBorders>
+              <w:bottom w:val="none" w:sz="0" w:space="0" w:color="000000"/>
+              <w:top w:val="none" w:sz="0" w:space="0" w:color="000000"/>
+              <w:left w:val="none" w:sz="0" w:space="0" w:color="000000"/>
+              <w:right w:val="none" w:sz="0" w:space="0" w:color="000000"/>
+            </w:tcBorders>
+            <w:shd w:val="clear" w:color="auto" w:fill="FFFFFF"/>
+            <w:tcMar>
+              <w:top w:w="0" w:type="dxa"/>
+              <w:bottom w:w="0" w:type="dxa"/>
+              <w:left w:w="0" w:type="dxa"/>
+              <w:right w:w="0" w:type="dxa"/>
+            </w:tcMar>
+            <w:vAlign w:val="center"/>
+          </w:tcPr>
+          <w:p>
+            <w:pPr>
+              <w:pStyle w:val="Normal"/>
+              <w:jc w:val="left"/>
+              <w:pBdr>
+                <w:bottom w:val="none" w:sz="0" w:space="0" w:color="000000"/>
+                <w:top w:val="none" w:sz="0" w:space="0" w:color="000000"/>
+                <w:left w:val="none" w:sz="0" w:space="0" w:color="000000"/>
+                <w:right w:val="none" w:sz="0" w:space="0" w:color="000000"/>
+              </w:pBdr>
+              <w:spacing w:after="100" w:before="100" w:line="240"/>
+              <w:ind w:left="100" w:right="100" w:firstLine="0" w:firstLineChars="0"/>
+              <w:rPr>
+                <w:rFonts w:ascii="Arial" w:hAnsi="Arial" w:eastAsia="Arial" w:cs="Arial"/>
+                <w:i w:val="false"/>
+                <w:b w:val="false"/>
+                <w:u w:val="none"/>
+                <w:strike w:val="false"/>
+                <w:sz w:val="22"/>
+                <w:szCs w:val="22"/>
+                <w:color w:val="000000"/>
+              </w:rPr>
+            </w:pPr>
+            <w:r>
+              <w:rPr>
+                <w:rFonts w:ascii="Arial" w:hAnsi="Arial" w:eastAsia="Arial" w:cs="Arial"/>
+                <w:i w:val="false"/>
+                <w:b w:val="false"/>
+                <w:u w:val="none"/>
+                <w:strike w:val="false"/>
                 <w:sz w:val="22"/>
                 <w:szCs w:val="22"/>
                 <w:color w:val="000000"/>
@@ -2756,31 +2886,34 @@
           </w:tcPr>
           <w:p>
             <w:pPr>
-              <w:jc w:val="left"/>
-              <w:pBdr>
-                <w:bottom w:val="none" w:sz="0" w:space="0" w:color="000000"/>
-                <w:top w:val="none" w:sz="0" w:space="0" w:color="000000"/>
-                <w:left w:val="none" w:sz="0" w:space="0" w:color="000000"/>
-                <w:right w:val="none" w:sz="0" w:space="0" w:color="000000"/>
-              </w:pBdr>
-              <w:spacing w:after="100" w:before="100" w:line="240"/>
-              <w:ind w:left="100" w:right="100" w:firstLine="0" w:firstLineChars="0"/>
-              <w:rPr>
-                <w:rFonts w:ascii="Arial" w:hAnsi="Arial" w:eastAsia="Arial" w:cs="Arial"/>
-                <w:i w:val="false"/>
-                <w:b w:val="false"/>
-                <w:u w:val="none"/>
-                <w:sz w:val="22"/>
-                <w:szCs w:val="22"/>
-                <w:color w:val="000000"/>
-              </w:rPr>
-            </w:pPr>
-            <w:r>
-              <w:rPr>
-                <w:rFonts w:ascii="Arial" w:hAnsi="Arial" w:eastAsia="Arial" w:cs="Arial"/>
-                <w:i w:val="false"/>
-                <w:b w:val="false"/>
-                <w:u w:val="none"/>
+              <w:pStyle w:val="Normal"/>
+              <w:jc w:val="left"/>
+              <w:pBdr>
+                <w:bottom w:val="none" w:sz="0" w:space="0" w:color="000000"/>
+                <w:top w:val="none" w:sz="0" w:space="0" w:color="000000"/>
+                <w:left w:val="none" w:sz="0" w:space="0" w:color="000000"/>
+                <w:right w:val="none" w:sz="0" w:space="0" w:color="000000"/>
+              </w:pBdr>
+              <w:spacing w:after="100" w:before="100" w:line="240"/>
+              <w:ind w:left="100" w:right="100" w:firstLine="0" w:firstLineChars="0"/>
+              <w:rPr>
+                <w:rFonts w:ascii="Arial" w:hAnsi="Arial" w:eastAsia="Arial" w:cs="Arial"/>
+                <w:i w:val="false"/>
+                <w:b w:val="false"/>
+                <w:u w:val="none"/>
+                <w:strike w:val="false"/>
+                <w:sz w:val="22"/>
+                <w:szCs w:val="22"/>
+                <w:color w:val="000000"/>
+              </w:rPr>
+            </w:pPr>
+            <w:r>
+              <w:rPr>
+                <w:rFonts w:ascii="Arial" w:hAnsi="Arial" w:eastAsia="Arial" w:cs="Arial"/>
+                <w:i w:val="false"/>
+                <w:b w:val="false"/>
+                <w:u w:val="none"/>
+                <w:strike w:val="false"/>
                 <w:sz w:val="22"/>
                 <w:szCs w:val="22"/>
                 <w:color w:val="000000"/>
@@ -2808,31 +2941,34 @@
           </w:tcPr>
           <w:p>
             <w:pPr>
-              <w:jc w:val="left"/>
-              <w:pBdr>
-                <w:bottom w:val="none" w:sz="0" w:space="0" w:color="000000"/>
-                <w:top w:val="none" w:sz="0" w:space="0" w:color="000000"/>
-                <w:left w:val="none" w:sz="0" w:space="0" w:color="000000"/>
-                <w:right w:val="none" w:sz="0" w:space="0" w:color="000000"/>
-              </w:pBdr>
-              <w:spacing w:after="100" w:before="100" w:line="240"/>
-              <w:ind w:left="100" w:right="100" w:firstLine="0" w:firstLineChars="0"/>
-              <w:rPr>
-                <w:rFonts w:ascii="Arial" w:hAnsi="Arial" w:eastAsia="Arial" w:cs="Arial"/>
-                <w:i w:val="false"/>
-                <w:b w:val="false"/>
-                <w:u w:val="none"/>
-                <w:sz w:val="22"/>
-                <w:szCs w:val="22"/>
-                <w:color w:val="000000"/>
-              </w:rPr>
-            </w:pPr>
-            <w:r>
-              <w:rPr>
-                <w:rFonts w:ascii="Arial" w:hAnsi="Arial" w:eastAsia="Arial" w:cs="Arial"/>
-                <w:i w:val="false"/>
-                <w:b w:val="false"/>
-                <w:u w:val="none"/>
+              <w:pStyle w:val="Normal"/>
+              <w:jc w:val="left"/>
+              <w:pBdr>
+                <w:bottom w:val="none" w:sz="0" w:space="0" w:color="000000"/>
+                <w:top w:val="none" w:sz="0" w:space="0" w:color="000000"/>
+                <w:left w:val="none" w:sz="0" w:space="0" w:color="000000"/>
+                <w:right w:val="none" w:sz="0" w:space="0" w:color="000000"/>
+              </w:pBdr>
+              <w:spacing w:after="100" w:before="100" w:line="240"/>
+              <w:ind w:left="100" w:right="100" w:firstLine="0" w:firstLineChars="0"/>
+              <w:rPr>
+                <w:rFonts w:ascii="Arial" w:hAnsi="Arial" w:eastAsia="Arial" w:cs="Arial"/>
+                <w:i w:val="false"/>
+                <w:b w:val="false"/>
+                <w:u w:val="none"/>
+                <w:strike w:val="false"/>
+                <w:sz w:val="22"/>
+                <w:szCs w:val="22"/>
+                <w:color w:val="000000"/>
+              </w:rPr>
+            </w:pPr>
+            <w:r>
+              <w:rPr>
+                <w:rFonts w:ascii="Arial" w:hAnsi="Arial" w:eastAsia="Arial" w:cs="Arial"/>
+                <w:i w:val="false"/>
+                <w:b w:val="false"/>
+                <w:u w:val="none"/>
+                <w:strike w:val="false"/>
                 <w:sz w:val="22"/>
                 <w:szCs w:val="22"/>
                 <w:color w:val="000000"/>
@@ -2846,7 +2982,6 @@
         <w:trPr>
           <w:trHeight w:val="617" w:hRule="auto"/>
         </w:trPr>
-        body20
         <w:tc>
           <w:tcPr>
             <w:gridSpan w:val="3"/>
@@ -2867,6 +3002,7 @@
           </w:tcPr>
           <w:p>
             <w:pPr>
+              <w:pStyle w:val="Normal"/>
               <w:jc w:val="left"/>
               <w:pBdr>
                 <w:bottom w:val="none" w:sz="0" w:space="0" w:color="000000"/>
@@ -2881,6 +3017,7 @@
                 <w:i w:val="false"/>
                 <w:b w:val="true"/>
                 <w:u w:val="none"/>
+                <w:strike w:val="false"/>
                 <w:sz w:val="22"/>
                 <w:szCs w:val="22"/>
                 <w:color w:val="000000"/>
@@ -2892,6 +3029,7 @@
                 <w:i w:val="false"/>
                 <w:b w:val="true"/>
                 <w:u w:val="none"/>
+                <w:strike w:val="false"/>
                 <w:sz w:val="22"/>
                 <w:szCs w:val="22"/>
                 <w:color w:val="000000"/>
@@ -2905,51 +3043,53 @@
         <w:trPr>
           <w:trHeight w:val="612" w:hRule="auto"/>
         </w:trPr>
-        body21
-        <w:tc>
-          <w:tcPr>
-            <w:tcBorders>
-              <w:bottom w:val="none" w:sz="0" w:space="0" w:color="000000"/>
-              <w:top w:val="none" w:sz="0" w:space="0" w:color="000000"/>
-              <w:left w:val="none" w:sz="0" w:space="0" w:color="000000"/>
-              <w:right w:val="none" w:sz="0" w:space="0" w:color="000000"/>
-            </w:tcBorders>
-            <w:shd w:val="clear" w:color="auto" w:fill="FFFFFF"/>
-            <w:tcMar>
-              <w:top w:w="0" w:type="dxa"/>
-              <w:bottom w:w="0" w:type="dxa"/>
-              <w:left w:w="0" w:type="dxa"/>
-              <w:right w:w="0" w:type="dxa"/>
-            </w:tcMar>
-            <w:vAlign w:val="center"/>
-          </w:tcPr>
-          <w:p>
-            <w:pPr>
-              <w:jc w:val="left"/>
-              <w:pBdr>
-                <w:bottom w:val="none" w:sz="0" w:space="0" w:color="000000"/>
-                <w:top w:val="none" w:sz="0" w:space="0" w:color="000000"/>
-                <w:left w:val="none" w:sz="0" w:space="0" w:color="000000"/>
-                <w:right w:val="none" w:sz="0" w:space="0" w:color="000000"/>
-              </w:pBdr>
-              <w:spacing w:after="100" w:before="100" w:line="240"/>
-              <w:ind w:left="100" w:right="100" w:firstLine="0" w:firstLineChars="0"/>
-              <w:rPr>
-                <w:rFonts w:ascii="Arial" w:hAnsi="Arial" w:eastAsia="Arial" w:cs="Arial"/>
-                <w:i w:val="false"/>
-                <w:b w:val="false"/>
-                <w:u w:val="none"/>
-                <w:sz w:val="22"/>
-                <w:szCs w:val="22"/>
-                <w:color w:val="000000"/>
-              </w:rPr>
-            </w:pPr>
-            <w:r>
-              <w:rPr>
-                <w:rFonts w:ascii="Arial" w:hAnsi="Arial" w:eastAsia="Arial" w:cs="Arial"/>
-                <w:i w:val="false"/>
-                <w:b w:val="false"/>
-                <w:u w:val="none"/>
+        <w:tc>
+          <w:tcPr>
+            <w:tcBorders>
+              <w:bottom w:val="none" w:sz="0" w:space="0" w:color="000000"/>
+              <w:top w:val="none" w:sz="0" w:space="0" w:color="000000"/>
+              <w:left w:val="none" w:sz="0" w:space="0" w:color="000000"/>
+              <w:right w:val="none" w:sz="0" w:space="0" w:color="000000"/>
+            </w:tcBorders>
+            <w:shd w:val="clear" w:color="auto" w:fill="FFFFFF"/>
+            <w:tcMar>
+              <w:top w:w="0" w:type="dxa"/>
+              <w:bottom w:w="0" w:type="dxa"/>
+              <w:left w:w="0" w:type="dxa"/>
+              <w:right w:w="0" w:type="dxa"/>
+            </w:tcMar>
+            <w:vAlign w:val="center"/>
+          </w:tcPr>
+          <w:p>
+            <w:pPr>
+              <w:pStyle w:val="Normal"/>
+              <w:jc w:val="left"/>
+              <w:pBdr>
+                <w:bottom w:val="none" w:sz="0" w:space="0" w:color="000000"/>
+                <w:top w:val="none" w:sz="0" w:space="0" w:color="000000"/>
+                <w:left w:val="none" w:sz="0" w:space="0" w:color="000000"/>
+                <w:right w:val="none" w:sz="0" w:space="0" w:color="000000"/>
+              </w:pBdr>
+              <w:spacing w:after="100" w:before="100" w:line="240"/>
+              <w:ind w:left="100" w:right="100" w:firstLine="0" w:firstLineChars="0"/>
+              <w:rPr>
+                <w:rFonts w:ascii="Arial" w:hAnsi="Arial" w:eastAsia="Arial" w:cs="Arial"/>
+                <w:i w:val="false"/>
+                <w:b w:val="false"/>
+                <w:u w:val="none"/>
+                <w:strike w:val="false"/>
+                <w:sz w:val="22"/>
+                <w:szCs w:val="22"/>
+                <w:color w:val="000000"/>
+              </w:rPr>
+            </w:pPr>
+            <w:r>
+              <w:rPr>
+                <w:rFonts w:ascii="Arial" w:hAnsi="Arial" w:eastAsia="Arial" w:cs="Arial"/>
+                <w:i w:val="false"/>
+                <w:b w:val="false"/>
+                <w:u w:val="none"/>
+                <w:strike w:val="false"/>
                 <w:sz w:val="22"/>
                 <w:szCs w:val="22"/>
                 <w:color w:val="000000"/>
@@ -2977,31 +3117,34 @@
           </w:tcPr>
           <w:p>
             <w:pPr>
-              <w:jc w:val="left"/>
-              <w:pBdr>
-                <w:bottom w:val="none" w:sz="0" w:space="0" w:color="000000"/>
-                <w:top w:val="none" w:sz="0" w:space="0" w:color="000000"/>
-                <w:left w:val="none" w:sz="0" w:space="0" w:color="000000"/>
-                <w:right w:val="none" w:sz="0" w:space="0" w:color="000000"/>
-              </w:pBdr>
-              <w:spacing w:after="100" w:before="100" w:line="240"/>
-              <w:ind w:left="100" w:right="100" w:firstLine="0" w:firstLineChars="0"/>
-              <w:rPr>
-                <w:rFonts w:ascii="Arial" w:hAnsi="Arial" w:eastAsia="Arial" w:cs="Arial"/>
-                <w:i w:val="false"/>
-                <w:b w:val="false"/>
-                <w:u w:val="none"/>
-                <w:sz w:val="22"/>
-                <w:szCs w:val="22"/>
-                <w:color w:val="000000"/>
-              </w:rPr>
-            </w:pPr>
-            <w:r>
-              <w:rPr>
-                <w:rFonts w:ascii="Arial" w:hAnsi="Arial" w:eastAsia="Arial" w:cs="Arial"/>
-                <w:i w:val="false"/>
-                <w:b w:val="false"/>
-                <w:u w:val="none"/>
+              <w:pStyle w:val="Normal"/>
+              <w:jc w:val="left"/>
+              <w:pBdr>
+                <w:bottom w:val="none" w:sz="0" w:space="0" w:color="000000"/>
+                <w:top w:val="none" w:sz="0" w:space="0" w:color="000000"/>
+                <w:left w:val="none" w:sz="0" w:space="0" w:color="000000"/>
+                <w:right w:val="none" w:sz="0" w:space="0" w:color="000000"/>
+              </w:pBdr>
+              <w:spacing w:after="100" w:before="100" w:line="240"/>
+              <w:ind w:left="100" w:right="100" w:firstLine="0" w:firstLineChars="0"/>
+              <w:rPr>
+                <w:rFonts w:ascii="Arial" w:hAnsi="Arial" w:eastAsia="Arial" w:cs="Arial"/>
+                <w:i w:val="false"/>
+                <w:b w:val="false"/>
+                <w:u w:val="none"/>
+                <w:strike w:val="false"/>
+                <w:sz w:val="22"/>
+                <w:szCs w:val="22"/>
+                <w:color w:val="000000"/>
+              </w:rPr>
+            </w:pPr>
+            <w:r>
+              <w:rPr>
+                <w:rFonts w:ascii="Arial" w:hAnsi="Arial" w:eastAsia="Arial" w:cs="Arial"/>
+                <w:i w:val="false"/>
+                <w:b w:val="false"/>
+                <w:u w:val="none"/>
+                <w:strike w:val="false"/>
                 <w:sz w:val="22"/>
                 <w:szCs w:val="22"/>
                 <w:color w:val="000000"/>
@@ -3029,31 +3172,34 @@
           </w:tcPr>
           <w:p>
             <w:pPr>
-              <w:jc w:val="left"/>
-              <w:pBdr>
-                <w:bottom w:val="none" w:sz="0" w:space="0" w:color="000000"/>
-                <w:top w:val="none" w:sz="0" w:space="0" w:color="000000"/>
-                <w:left w:val="none" w:sz="0" w:space="0" w:color="000000"/>
-                <w:right w:val="none" w:sz="0" w:space="0" w:color="000000"/>
-              </w:pBdr>
-              <w:spacing w:after="100" w:before="100" w:line="240"/>
-              <w:ind w:left="100" w:right="100" w:firstLine="0" w:firstLineChars="0"/>
-              <w:rPr>
-                <w:rFonts w:ascii="Arial" w:hAnsi="Arial" w:eastAsia="Arial" w:cs="Arial"/>
-                <w:i w:val="false"/>
-                <w:b w:val="false"/>
-                <w:u w:val="none"/>
-                <w:sz w:val="22"/>
-                <w:szCs w:val="22"/>
-                <w:color w:val="000000"/>
-              </w:rPr>
-            </w:pPr>
-            <w:r>
-              <w:rPr>
-                <w:rFonts w:ascii="Arial" w:hAnsi="Arial" w:eastAsia="Arial" w:cs="Arial"/>
-                <w:i w:val="false"/>
-                <w:b w:val="false"/>
-                <w:u w:val="none"/>
+              <w:pStyle w:val="Normal"/>
+              <w:jc w:val="left"/>
+              <w:pBdr>
+                <w:bottom w:val="none" w:sz="0" w:space="0" w:color="000000"/>
+                <w:top w:val="none" w:sz="0" w:space="0" w:color="000000"/>
+                <w:left w:val="none" w:sz="0" w:space="0" w:color="000000"/>
+                <w:right w:val="none" w:sz="0" w:space="0" w:color="000000"/>
+              </w:pBdr>
+              <w:spacing w:after="100" w:before="100" w:line="240"/>
+              <w:ind w:left="100" w:right="100" w:firstLine="0" w:firstLineChars="0"/>
+              <w:rPr>
+                <w:rFonts w:ascii="Arial" w:hAnsi="Arial" w:eastAsia="Arial" w:cs="Arial"/>
+                <w:i w:val="false"/>
+                <w:b w:val="false"/>
+                <w:u w:val="none"/>
+                <w:strike w:val="false"/>
+                <w:sz w:val="22"/>
+                <w:szCs w:val="22"/>
+                <w:color w:val="000000"/>
+              </w:rPr>
+            </w:pPr>
+            <w:r>
+              <w:rPr>
+                <w:rFonts w:ascii="Arial" w:hAnsi="Arial" w:eastAsia="Arial" w:cs="Arial"/>
+                <w:i w:val="false"/>
+                <w:b w:val="false"/>
+                <w:u w:val="none"/>
+                <w:strike w:val="false"/>
                 <w:sz w:val="22"/>
                 <w:szCs w:val="22"/>
                 <w:color w:val="000000"/>
@@ -3067,51 +3213,53 @@
         <w:trPr>
           <w:trHeight w:val="612" w:hRule="auto"/>
         </w:trPr>
-        body22
-        <w:tc>
-          <w:tcPr>
-            <w:tcBorders>
-              <w:bottom w:val="none" w:sz="0" w:space="0" w:color="000000"/>
-              <w:top w:val="none" w:sz="0" w:space="0" w:color="000000"/>
-              <w:left w:val="none" w:sz="0" w:space="0" w:color="000000"/>
-              <w:right w:val="none" w:sz="0" w:space="0" w:color="000000"/>
-            </w:tcBorders>
-            <w:shd w:val="clear" w:color="auto" w:fill="FFFFFF"/>
-            <w:tcMar>
-              <w:top w:w="0" w:type="dxa"/>
-              <w:bottom w:w="0" w:type="dxa"/>
-              <w:left w:w="0" w:type="dxa"/>
-              <w:right w:w="0" w:type="dxa"/>
-            </w:tcMar>
-            <w:vAlign w:val="center"/>
-          </w:tcPr>
-          <w:p>
-            <w:pPr>
-              <w:jc w:val="left"/>
-              <w:pBdr>
-                <w:bottom w:val="none" w:sz="0" w:space="0" w:color="000000"/>
-                <w:top w:val="none" w:sz="0" w:space="0" w:color="000000"/>
-                <w:left w:val="none" w:sz="0" w:space="0" w:color="000000"/>
-                <w:right w:val="none" w:sz="0" w:space="0" w:color="000000"/>
-              </w:pBdr>
-              <w:spacing w:after="100" w:before="100" w:line="240"/>
-              <w:ind w:left="100" w:right="100" w:firstLine="0" w:firstLineChars="0"/>
-              <w:rPr>
-                <w:rFonts w:ascii="Arial" w:hAnsi="Arial" w:eastAsia="Arial" w:cs="Arial"/>
-                <w:i w:val="false"/>
-                <w:b w:val="false"/>
-                <w:u w:val="none"/>
-                <w:sz w:val="22"/>
-                <w:szCs w:val="22"/>
-                <w:color w:val="000000"/>
-              </w:rPr>
-            </w:pPr>
-            <w:r>
-              <w:rPr>
-                <w:rFonts w:ascii="Arial" w:hAnsi="Arial" w:eastAsia="Arial" w:cs="Arial"/>
-                <w:i w:val="false"/>
-                <w:b w:val="false"/>
-                <w:u w:val="none"/>
+        <w:tc>
+          <w:tcPr>
+            <w:tcBorders>
+              <w:bottom w:val="none" w:sz="0" w:space="0" w:color="000000"/>
+              <w:top w:val="none" w:sz="0" w:space="0" w:color="000000"/>
+              <w:left w:val="none" w:sz="0" w:space="0" w:color="000000"/>
+              <w:right w:val="none" w:sz="0" w:space="0" w:color="000000"/>
+            </w:tcBorders>
+            <w:shd w:val="clear" w:color="auto" w:fill="FFFFFF"/>
+            <w:tcMar>
+              <w:top w:w="0" w:type="dxa"/>
+              <w:bottom w:w="0" w:type="dxa"/>
+              <w:left w:w="0" w:type="dxa"/>
+              <w:right w:w="0" w:type="dxa"/>
+            </w:tcMar>
+            <w:vAlign w:val="center"/>
+          </w:tcPr>
+          <w:p>
+            <w:pPr>
+              <w:pStyle w:val="Normal"/>
+              <w:jc w:val="left"/>
+              <w:pBdr>
+                <w:bottom w:val="none" w:sz="0" w:space="0" w:color="000000"/>
+                <w:top w:val="none" w:sz="0" w:space="0" w:color="000000"/>
+                <w:left w:val="none" w:sz="0" w:space="0" w:color="000000"/>
+                <w:right w:val="none" w:sz="0" w:space="0" w:color="000000"/>
+              </w:pBdr>
+              <w:spacing w:after="100" w:before="100" w:line="240"/>
+              <w:ind w:left="100" w:right="100" w:firstLine="0" w:firstLineChars="0"/>
+              <w:rPr>
+                <w:rFonts w:ascii="Arial" w:hAnsi="Arial" w:eastAsia="Arial" w:cs="Arial"/>
+                <w:i w:val="false"/>
+                <w:b w:val="false"/>
+                <w:u w:val="none"/>
+                <w:strike w:val="false"/>
+                <w:sz w:val="22"/>
+                <w:szCs w:val="22"/>
+                <w:color w:val="000000"/>
+              </w:rPr>
+            </w:pPr>
+            <w:r>
+              <w:rPr>
+                <w:rFonts w:ascii="Arial" w:hAnsi="Arial" w:eastAsia="Arial" w:cs="Arial"/>
+                <w:i w:val="false"/>
+                <w:b w:val="false"/>
+                <w:u w:val="none"/>
+                <w:strike w:val="false"/>
                 <w:sz w:val="22"/>
                 <w:szCs w:val="22"/>
                 <w:color w:val="000000"/>
@@ -3139,31 +3287,34 @@
           </w:tcPr>
           <w:p>
             <w:pPr>
-              <w:jc w:val="left"/>
-              <w:pBdr>
-                <w:bottom w:val="none" w:sz="0" w:space="0" w:color="000000"/>
-                <w:top w:val="none" w:sz="0" w:space="0" w:color="000000"/>
-                <w:left w:val="none" w:sz="0" w:space="0" w:color="000000"/>
-                <w:right w:val="none" w:sz="0" w:space="0" w:color="000000"/>
-              </w:pBdr>
-              <w:spacing w:after="100" w:before="100" w:line="240"/>
-              <w:ind w:left="100" w:right="100" w:firstLine="0" w:firstLineChars="0"/>
-              <w:rPr>
-                <w:rFonts w:ascii="Arial" w:hAnsi="Arial" w:eastAsia="Arial" w:cs="Arial"/>
-                <w:i w:val="false"/>
-                <w:b w:val="false"/>
-                <w:u w:val="none"/>
-                <w:sz w:val="22"/>
-                <w:szCs w:val="22"/>
-                <w:color w:val="000000"/>
-              </w:rPr>
-            </w:pPr>
-            <w:r>
-              <w:rPr>
-                <w:rFonts w:ascii="Arial" w:hAnsi="Arial" w:eastAsia="Arial" w:cs="Arial"/>
-                <w:i w:val="false"/>
-                <w:b w:val="false"/>
-                <w:u w:val="none"/>
+              <w:pStyle w:val="Normal"/>
+              <w:jc w:val="left"/>
+              <w:pBdr>
+                <w:bottom w:val="none" w:sz="0" w:space="0" w:color="000000"/>
+                <w:top w:val="none" w:sz="0" w:space="0" w:color="000000"/>
+                <w:left w:val="none" w:sz="0" w:space="0" w:color="000000"/>
+                <w:right w:val="none" w:sz="0" w:space="0" w:color="000000"/>
+              </w:pBdr>
+              <w:spacing w:after="100" w:before="100" w:line="240"/>
+              <w:ind w:left="100" w:right="100" w:firstLine="0" w:firstLineChars="0"/>
+              <w:rPr>
+                <w:rFonts w:ascii="Arial" w:hAnsi="Arial" w:eastAsia="Arial" w:cs="Arial"/>
+                <w:i w:val="false"/>
+                <w:b w:val="false"/>
+                <w:u w:val="none"/>
+                <w:strike w:val="false"/>
+                <w:sz w:val="22"/>
+                <w:szCs w:val="22"/>
+                <w:color w:val="000000"/>
+              </w:rPr>
+            </w:pPr>
+            <w:r>
+              <w:rPr>
+                <w:rFonts w:ascii="Arial" w:hAnsi="Arial" w:eastAsia="Arial" w:cs="Arial"/>
+                <w:i w:val="false"/>
+                <w:b w:val="false"/>
+                <w:u w:val="none"/>
+                <w:strike w:val="false"/>
                 <w:sz w:val="22"/>
                 <w:szCs w:val="22"/>
                 <w:color w:val="000000"/>
@@ -3191,31 +3342,34 @@
           </w:tcPr>
           <w:p>
             <w:pPr>
-              <w:jc w:val="left"/>
-              <w:pBdr>
-                <w:bottom w:val="none" w:sz="0" w:space="0" w:color="000000"/>
-                <w:top w:val="none" w:sz="0" w:space="0" w:color="000000"/>
-                <w:left w:val="none" w:sz="0" w:space="0" w:color="000000"/>
-                <w:right w:val="none" w:sz="0" w:space="0" w:color="000000"/>
-              </w:pBdr>
-              <w:spacing w:after="100" w:before="100" w:line="240"/>
-              <w:ind w:left="100" w:right="100" w:firstLine="0" w:firstLineChars="0"/>
-              <w:rPr>
-                <w:rFonts w:ascii="Arial" w:hAnsi="Arial" w:eastAsia="Arial" w:cs="Arial"/>
-                <w:i w:val="false"/>
-                <w:b w:val="false"/>
-                <w:u w:val="none"/>
-                <w:sz w:val="22"/>
-                <w:szCs w:val="22"/>
-                <w:color w:val="000000"/>
-              </w:rPr>
-            </w:pPr>
-            <w:r>
-              <w:rPr>
-                <w:rFonts w:ascii="Arial" w:hAnsi="Arial" w:eastAsia="Arial" w:cs="Arial"/>
-                <w:i w:val="false"/>
-                <w:b w:val="false"/>
-                <w:u w:val="none"/>
+              <w:pStyle w:val="Normal"/>
+              <w:jc w:val="left"/>
+              <w:pBdr>
+                <w:bottom w:val="none" w:sz="0" w:space="0" w:color="000000"/>
+                <w:top w:val="none" w:sz="0" w:space="0" w:color="000000"/>
+                <w:left w:val="none" w:sz="0" w:space="0" w:color="000000"/>
+                <w:right w:val="none" w:sz="0" w:space="0" w:color="000000"/>
+              </w:pBdr>
+              <w:spacing w:after="100" w:before="100" w:line="240"/>
+              <w:ind w:left="100" w:right="100" w:firstLine="0" w:firstLineChars="0"/>
+              <w:rPr>
+                <w:rFonts w:ascii="Arial" w:hAnsi="Arial" w:eastAsia="Arial" w:cs="Arial"/>
+                <w:i w:val="false"/>
+                <w:b w:val="false"/>
+                <w:u w:val="none"/>
+                <w:strike w:val="false"/>
+                <w:sz w:val="22"/>
+                <w:szCs w:val="22"/>
+                <w:color w:val="000000"/>
+              </w:rPr>
+            </w:pPr>
+            <w:r>
+              <w:rPr>
+                <w:rFonts w:ascii="Arial" w:hAnsi="Arial" w:eastAsia="Arial" w:cs="Arial"/>
+                <w:i w:val="false"/>
+                <w:b w:val="false"/>
+                <w:u w:val="none"/>
+                <w:strike w:val="false"/>
                 <w:sz w:val="22"/>
                 <w:szCs w:val="22"/>
                 <w:color w:val="000000"/>
@@ -3229,51 +3383,53 @@
         <w:trPr>
           <w:trHeight w:val="612" w:hRule="auto"/>
         </w:trPr>
-        body23
-        <w:tc>
-          <w:tcPr>
-            <w:tcBorders>
-              <w:bottom w:val="none" w:sz="0" w:space="0" w:color="000000"/>
-              <w:top w:val="none" w:sz="0" w:space="0" w:color="000000"/>
-              <w:left w:val="none" w:sz="0" w:space="0" w:color="000000"/>
-              <w:right w:val="none" w:sz="0" w:space="0" w:color="000000"/>
-            </w:tcBorders>
-            <w:shd w:val="clear" w:color="auto" w:fill="FFFFFF"/>
-            <w:tcMar>
-              <w:top w:w="0" w:type="dxa"/>
-              <w:bottom w:w="0" w:type="dxa"/>
-              <w:left w:w="0" w:type="dxa"/>
-              <w:right w:w="0" w:type="dxa"/>
-            </w:tcMar>
-            <w:vAlign w:val="center"/>
-          </w:tcPr>
-          <w:p>
-            <w:pPr>
-              <w:jc w:val="left"/>
-              <w:pBdr>
-                <w:bottom w:val="none" w:sz="0" w:space="0" w:color="000000"/>
-                <w:top w:val="none" w:sz="0" w:space="0" w:color="000000"/>
-                <w:left w:val="none" w:sz="0" w:space="0" w:color="000000"/>
-                <w:right w:val="none" w:sz="0" w:space="0" w:color="000000"/>
-              </w:pBdr>
-              <w:spacing w:after="100" w:before="100" w:line="240"/>
-              <w:ind w:left="100" w:right="100" w:firstLine="0" w:firstLineChars="0"/>
-              <w:rPr>
-                <w:rFonts w:ascii="Arial" w:hAnsi="Arial" w:eastAsia="Arial" w:cs="Arial"/>
-                <w:i w:val="false"/>
-                <w:b w:val="false"/>
-                <w:u w:val="none"/>
-                <w:sz w:val="22"/>
-                <w:szCs w:val="22"/>
-                <w:color w:val="000000"/>
-              </w:rPr>
-            </w:pPr>
-            <w:r>
-              <w:rPr>
-                <w:rFonts w:ascii="Arial" w:hAnsi="Arial" w:eastAsia="Arial" w:cs="Arial"/>
-                <w:i w:val="false"/>
-                <w:b w:val="false"/>
-                <w:u w:val="none"/>
+        <w:tc>
+          <w:tcPr>
+            <w:tcBorders>
+              <w:bottom w:val="none" w:sz="0" w:space="0" w:color="000000"/>
+              <w:top w:val="none" w:sz="0" w:space="0" w:color="000000"/>
+              <w:left w:val="none" w:sz="0" w:space="0" w:color="000000"/>
+              <w:right w:val="none" w:sz="0" w:space="0" w:color="000000"/>
+            </w:tcBorders>
+            <w:shd w:val="clear" w:color="auto" w:fill="FFFFFF"/>
+            <w:tcMar>
+              <w:top w:w="0" w:type="dxa"/>
+              <w:bottom w:w="0" w:type="dxa"/>
+              <w:left w:w="0" w:type="dxa"/>
+              <w:right w:w="0" w:type="dxa"/>
+            </w:tcMar>
+            <w:vAlign w:val="center"/>
+          </w:tcPr>
+          <w:p>
+            <w:pPr>
+              <w:pStyle w:val="Normal"/>
+              <w:jc w:val="left"/>
+              <w:pBdr>
+                <w:bottom w:val="none" w:sz="0" w:space="0" w:color="000000"/>
+                <w:top w:val="none" w:sz="0" w:space="0" w:color="000000"/>
+                <w:left w:val="none" w:sz="0" w:space="0" w:color="000000"/>
+                <w:right w:val="none" w:sz="0" w:space="0" w:color="000000"/>
+              </w:pBdr>
+              <w:spacing w:after="100" w:before="100" w:line="240"/>
+              <w:ind w:left="100" w:right="100" w:firstLine="0" w:firstLineChars="0"/>
+              <w:rPr>
+                <w:rFonts w:ascii="Arial" w:hAnsi="Arial" w:eastAsia="Arial" w:cs="Arial"/>
+                <w:i w:val="false"/>
+                <w:b w:val="false"/>
+                <w:u w:val="none"/>
+                <w:strike w:val="false"/>
+                <w:sz w:val="22"/>
+                <w:szCs w:val="22"/>
+                <w:color w:val="000000"/>
+              </w:rPr>
+            </w:pPr>
+            <w:r>
+              <w:rPr>
+                <w:rFonts w:ascii="Arial" w:hAnsi="Arial" w:eastAsia="Arial" w:cs="Arial"/>
+                <w:i w:val="false"/>
+                <w:b w:val="false"/>
+                <w:u w:val="none"/>
+                <w:strike w:val="false"/>
                 <w:sz w:val="22"/>
                 <w:szCs w:val="22"/>
                 <w:color w:val="000000"/>
@@ -3301,31 +3457,34 @@
           </w:tcPr>
           <w:p>
             <w:pPr>
-              <w:jc w:val="left"/>
-              <w:pBdr>
-                <w:bottom w:val="none" w:sz="0" w:space="0" w:color="000000"/>
-                <w:top w:val="none" w:sz="0" w:space="0" w:color="000000"/>
-                <w:left w:val="none" w:sz="0" w:space="0" w:color="000000"/>
-                <w:right w:val="none" w:sz="0" w:space="0" w:color="000000"/>
-              </w:pBdr>
-              <w:spacing w:after="100" w:before="100" w:line="240"/>
-              <w:ind w:left="100" w:right="100" w:firstLine="0" w:firstLineChars="0"/>
-              <w:rPr>
-                <w:rFonts w:ascii="Arial" w:hAnsi="Arial" w:eastAsia="Arial" w:cs="Arial"/>
-                <w:i w:val="false"/>
-                <w:b w:val="false"/>
-                <w:u w:val="none"/>
-                <w:sz w:val="22"/>
-                <w:szCs w:val="22"/>
-                <w:color w:val="000000"/>
-              </w:rPr>
-            </w:pPr>
-            <w:r>
-              <w:rPr>
-                <w:rFonts w:ascii="Arial" w:hAnsi="Arial" w:eastAsia="Arial" w:cs="Arial"/>
-                <w:i w:val="false"/>
-                <w:b w:val="false"/>
-                <w:u w:val="none"/>
+              <w:pStyle w:val="Normal"/>
+              <w:jc w:val="left"/>
+              <w:pBdr>
+                <w:bottom w:val="none" w:sz="0" w:space="0" w:color="000000"/>
+                <w:top w:val="none" w:sz="0" w:space="0" w:color="000000"/>
+                <w:left w:val="none" w:sz="0" w:space="0" w:color="000000"/>
+                <w:right w:val="none" w:sz="0" w:space="0" w:color="000000"/>
+              </w:pBdr>
+              <w:spacing w:after="100" w:before="100" w:line="240"/>
+              <w:ind w:left="100" w:right="100" w:firstLine="0" w:firstLineChars="0"/>
+              <w:rPr>
+                <w:rFonts w:ascii="Arial" w:hAnsi="Arial" w:eastAsia="Arial" w:cs="Arial"/>
+                <w:i w:val="false"/>
+                <w:b w:val="false"/>
+                <w:u w:val="none"/>
+                <w:strike w:val="false"/>
+                <w:sz w:val="22"/>
+                <w:szCs w:val="22"/>
+                <w:color w:val="000000"/>
+              </w:rPr>
+            </w:pPr>
+            <w:r>
+              <w:rPr>
+                <w:rFonts w:ascii="Arial" w:hAnsi="Arial" w:eastAsia="Arial" w:cs="Arial"/>
+                <w:i w:val="false"/>
+                <w:b w:val="false"/>
+                <w:u w:val="none"/>
+                <w:strike w:val="false"/>
                 <w:sz w:val="22"/>
                 <w:szCs w:val="22"/>
                 <w:color w:val="000000"/>
@@ -3353,31 +3512,34 @@
           </w:tcPr>
           <w:p>
             <w:pPr>
-              <w:jc w:val="left"/>
-              <w:pBdr>
-                <w:bottom w:val="none" w:sz="0" w:space="0" w:color="000000"/>
-                <w:top w:val="none" w:sz="0" w:space="0" w:color="000000"/>
-                <w:left w:val="none" w:sz="0" w:space="0" w:color="000000"/>
-                <w:right w:val="none" w:sz="0" w:space="0" w:color="000000"/>
-              </w:pBdr>
-              <w:spacing w:after="100" w:before="100" w:line="240"/>
-              <w:ind w:left="100" w:right="100" w:firstLine="0" w:firstLineChars="0"/>
-              <w:rPr>
-                <w:rFonts w:ascii="Arial" w:hAnsi="Arial" w:eastAsia="Arial" w:cs="Arial"/>
-                <w:i w:val="false"/>
-                <w:b w:val="false"/>
-                <w:u w:val="none"/>
-                <w:sz w:val="22"/>
-                <w:szCs w:val="22"/>
-                <w:color w:val="000000"/>
-              </w:rPr>
-            </w:pPr>
-            <w:r>
-              <w:rPr>
-                <w:rFonts w:ascii="Arial" w:hAnsi="Arial" w:eastAsia="Arial" w:cs="Arial"/>
-                <w:i w:val="false"/>
-                <w:b w:val="false"/>
-                <w:u w:val="none"/>
+              <w:pStyle w:val="Normal"/>
+              <w:jc w:val="left"/>
+              <w:pBdr>
+                <w:bottom w:val="none" w:sz="0" w:space="0" w:color="000000"/>
+                <w:top w:val="none" w:sz="0" w:space="0" w:color="000000"/>
+                <w:left w:val="none" w:sz="0" w:space="0" w:color="000000"/>
+                <w:right w:val="none" w:sz="0" w:space="0" w:color="000000"/>
+              </w:pBdr>
+              <w:spacing w:after="100" w:before="100" w:line="240"/>
+              <w:ind w:left="100" w:right="100" w:firstLine="0" w:firstLineChars="0"/>
+              <w:rPr>
+                <w:rFonts w:ascii="Arial" w:hAnsi="Arial" w:eastAsia="Arial" w:cs="Arial"/>
+                <w:i w:val="false"/>
+                <w:b w:val="false"/>
+                <w:u w:val="none"/>
+                <w:strike w:val="false"/>
+                <w:sz w:val="22"/>
+                <w:szCs w:val="22"/>
+                <w:color w:val="000000"/>
+              </w:rPr>
+            </w:pPr>
+            <w:r>
+              <w:rPr>
+                <w:rFonts w:ascii="Arial" w:hAnsi="Arial" w:eastAsia="Arial" w:cs="Arial"/>
+                <w:i w:val="false"/>
+                <w:b w:val="false"/>
+                <w:u w:val="none"/>
+                <w:strike w:val="false"/>
                 <w:sz w:val="22"/>
                 <w:szCs w:val="22"/>
                 <w:color w:val="000000"/>
@@ -3391,7 +3553,6 @@
         <w:trPr>
           <w:trHeight w:val="574" w:hRule="auto"/>
         </w:trPr>
-        body24
         <w:tc>
           <w:tcPr>
             <w:tcBorders>
@@ -3411,31 +3572,34 @@
           </w:tcPr>
           <w:p>
             <w:pPr>
-              <w:jc w:val="left"/>
-              <w:pBdr>
-                <w:bottom w:val="none" w:sz="0" w:space="0" w:color="000000"/>
-                <w:top w:val="none" w:sz="0" w:space="0" w:color="000000"/>
-                <w:left w:val="none" w:sz="0" w:space="0" w:color="000000"/>
-                <w:right w:val="none" w:sz="0" w:space="0" w:color="000000"/>
-              </w:pBdr>
-              <w:spacing w:after="100" w:before="100" w:line="240"/>
-              <w:ind w:left="100" w:right="100" w:firstLine="0" w:firstLineChars="0"/>
-              <w:rPr>
-                <w:rFonts w:ascii="Arial" w:hAnsi="Arial" w:eastAsia="Arial" w:cs="Arial"/>
-                <w:i w:val="false"/>
-                <w:b w:val="false"/>
-                <w:u w:val="none"/>
-                <w:sz w:val="22"/>
-                <w:szCs w:val="22"/>
-                <w:color w:val="000000"/>
-              </w:rPr>
-            </w:pPr>
-            <w:r>
-              <w:rPr>
-                <w:rFonts w:ascii="Arial" w:hAnsi="Arial" w:eastAsia="Arial" w:cs="Arial"/>
-                <w:i w:val="false"/>
-                <w:b w:val="false"/>
-                <w:u w:val="none"/>
+              <w:pStyle w:val="Normal"/>
+              <w:jc w:val="left"/>
+              <w:pBdr>
+                <w:bottom w:val="none" w:sz="0" w:space="0" w:color="000000"/>
+                <w:top w:val="none" w:sz="0" w:space="0" w:color="000000"/>
+                <w:left w:val="none" w:sz="0" w:space="0" w:color="000000"/>
+                <w:right w:val="none" w:sz="0" w:space="0" w:color="000000"/>
+              </w:pBdr>
+              <w:spacing w:after="100" w:before="100" w:line="240"/>
+              <w:ind w:left="100" w:right="100" w:firstLine="0" w:firstLineChars="0"/>
+              <w:rPr>
+                <w:rFonts w:ascii="Arial" w:hAnsi="Arial" w:eastAsia="Arial" w:cs="Arial"/>
+                <w:i w:val="false"/>
+                <w:b w:val="false"/>
+                <w:u w:val="none"/>
+                <w:strike w:val="false"/>
+                <w:sz w:val="22"/>
+                <w:szCs w:val="22"/>
+                <w:color w:val="000000"/>
+              </w:rPr>
+            </w:pPr>
+            <w:r>
+              <w:rPr>
+                <w:rFonts w:ascii="Arial" w:hAnsi="Arial" w:eastAsia="Arial" w:cs="Arial"/>
+                <w:i w:val="false"/>
+                <w:b w:val="false"/>
+                <w:u w:val="none"/>
+                <w:strike w:val="false"/>
                 <w:sz w:val="22"/>
                 <w:szCs w:val="22"/>
                 <w:color w:val="000000"/>
@@ -3463,31 +3627,34 @@
           </w:tcPr>
           <w:p>
             <w:pPr>
-              <w:jc w:val="left"/>
-              <w:pBdr>
-                <w:bottom w:val="none" w:sz="0" w:space="0" w:color="000000"/>
-                <w:top w:val="none" w:sz="0" w:space="0" w:color="000000"/>
-                <w:left w:val="none" w:sz="0" w:space="0" w:color="000000"/>
-                <w:right w:val="none" w:sz="0" w:space="0" w:color="000000"/>
-              </w:pBdr>
-              <w:spacing w:after="100" w:before="100" w:line="240"/>
-              <w:ind w:left="100" w:right="100" w:firstLine="0" w:firstLineChars="0"/>
-              <w:rPr>
-                <w:rFonts w:ascii="Arial" w:hAnsi="Arial" w:eastAsia="Arial" w:cs="Arial"/>
-                <w:i w:val="false"/>
-                <w:b w:val="false"/>
-                <w:u w:val="none"/>
-                <w:sz w:val="22"/>
-                <w:szCs w:val="22"/>
-                <w:color w:val="000000"/>
-              </w:rPr>
-            </w:pPr>
-            <w:r>
-              <w:rPr>
-                <w:rFonts w:ascii="Arial" w:hAnsi="Arial" w:eastAsia="Arial" w:cs="Arial"/>
-                <w:i w:val="false"/>
-                <w:b w:val="false"/>
-                <w:u w:val="none"/>
+              <w:pStyle w:val="Normal"/>
+              <w:jc w:val="left"/>
+              <w:pBdr>
+                <w:bottom w:val="none" w:sz="0" w:space="0" w:color="000000"/>
+                <w:top w:val="none" w:sz="0" w:space="0" w:color="000000"/>
+                <w:left w:val="none" w:sz="0" w:space="0" w:color="000000"/>
+                <w:right w:val="none" w:sz="0" w:space="0" w:color="000000"/>
+              </w:pBdr>
+              <w:spacing w:after="100" w:before="100" w:line="240"/>
+              <w:ind w:left="100" w:right="100" w:firstLine="0" w:firstLineChars="0"/>
+              <w:rPr>
+                <w:rFonts w:ascii="Arial" w:hAnsi="Arial" w:eastAsia="Arial" w:cs="Arial"/>
+                <w:i w:val="false"/>
+                <w:b w:val="false"/>
+                <w:u w:val="none"/>
+                <w:strike w:val="false"/>
+                <w:sz w:val="22"/>
+                <w:szCs w:val="22"/>
+                <w:color w:val="000000"/>
+              </w:rPr>
+            </w:pPr>
+            <w:r>
+              <w:rPr>
+                <w:rFonts w:ascii="Arial" w:hAnsi="Arial" w:eastAsia="Arial" w:cs="Arial"/>
+                <w:i w:val="false"/>
+                <w:b w:val="false"/>
+                <w:u w:val="none"/>
+                <w:strike w:val="false"/>
                 <w:sz w:val="22"/>
                 <w:szCs w:val="22"/>
                 <w:color w:val="000000"/>
@@ -3515,31 +3682,34 @@
           </w:tcPr>
           <w:p>
             <w:pPr>
-              <w:jc w:val="left"/>
-              <w:pBdr>
-                <w:bottom w:val="none" w:sz="0" w:space="0" w:color="000000"/>
-                <w:top w:val="none" w:sz="0" w:space="0" w:color="000000"/>
-                <w:left w:val="none" w:sz="0" w:space="0" w:color="000000"/>
-                <w:right w:val="none" w:sz="0" w:space="0" w:color="000000"/>
-              </w:pBdr>
-              <w:spacing w:after="100" w:before="100" w:line="240"/>
-              <w:ind w:left="100" w:right="100" w:firstLine="0" w:firstLineChars="0"/>
-              <w:rPr>
-                <w:rFonts w:ascii="Arial" w:hAnsi="Arial" w:eastAsia="Arial" w:cs="Arial"/>
-                <w:i w:val="false"/>
-                <w:b w:val="false"/>
-                <w:u w:val="none"/>
-                <w:sz w:val="22"/>
-                <w:szCs w:val="22"/>
-                <w:color w:val="000000"/>
-              </w:rPr>
-            </w:pPr>
-            <w:r>
-              <w:rPr>
-                <w:rFonts w:ascii="Arial" w:hAnsi="Arial" w:eastAsia="Arial" w:cs="Arial"/>
-                <w:i w:val="false"/>
-                <w:b w:val="false"/>
-                <w:u w:val="none"/>
+              <w:pStyle w:val="Normal"/>
+              <w:jc w:val="left"/>
+              <w:pBdr>
+                <w:bottom w:val="none" w:sz="0" w:space="0" w:color="000000"/>
+                <w:top w:val="none" w:sz="0" w:space="0" w:color="000000"/>
+                <w:left w:val="none" w:sz="0" w:space="0" w:color="000000"/>
+                <w:right w:val="none" w:sz="0" w:space="0" w:color="000000"/>
+              </w:pBdr>
+              <w:spacing w:after="100" w:before="100" w:line="240"/>
+              <w:ind w:left="100" w:right="100" w:firstLine="0" w:firstLineChars="0"/>
+              <w:rPr>
+                <w:rFonts w:ascii="Arial" w:hAnsi="Arial" w:eastAsia="Arial" w:cs="Arial"/>
+                <w:i w:val="false"/>
+                <w:b w:val="false"/>
+                <w:u w:val="none"/>
+                <w:strike w:val="false"/>
+                <w:sz w:val="22"/>
+                <w:szCs w:val="22"/>
+                <w:color w:val="000000"/>
+              </w:rPr>
+            </w:pPr>
+            <w:r>
+              <w:rPr>
+                <w:rFonts w:ascii="Arial" w:hAnsi="Arial" w:eastAsia="Arial" w:cs="Arial"/>
+                <w:i w:val="false"/>
+                <w:b w:val="false"/>
+                <w:u w:val="none"/>
+                <w:strike w:val="false"/>
                 <w:sz w:val="22"/>
                 <w:szCs w:val="22"/>
                 <w:color w:val="000000"/>

</xml_diff>